<commit_message>
Build FastAPI admin backend and real-stack deployment tooling
</commit_message>
<xml_diff>
--- a/deliverables/ShipVoice_船厂安全实时语音问答助手_项目报告_比赛增强版.docx
+++ b/deliverables/ShipVoice_船厂安全实时语音问答助手_项目报告_比赛增强版.docx
@@ -666,6 +666,46 @@
                 <w:b w:val="0"/>
                 <w:sz w:val="19"/>
               </w:rPr>
+              <w:t>真实语音链路</w:t>
+            </w:r>
+          </w:p>
+        </w:tc>
+        <w:tc>
+          <w:tcPr>
+            <w:tcW w:type="dxa" w:w="4680"/>
+          </w:tcPr>
+          <w:p>
+            <w:pPr>
+              <w:spacing w:after="0"/>
+            </w:pPr>
+            <w:r/>
+            <w:r>
+              <w:rPr>
+                <w:rFonts w:ascii="Calibri" w:hAnsi="Calibri" w:eastAsia="Microsoft YaHei"/>
+                <w:b w:val="0"/>
+                <w:sz w:val="19"/>
+              </w:rPr>
+              <w:t>远端已验证 3 条真实样本，ASR=funasr_asr，TTS=chattts，平均首音 15239 ms</w:t>
+            </w:r>
+          </w:p>
+        </w:tc>
+      </w:tr>
+      <w:tr>
+        <w:tc>
+          <w:tcPr>
+            <w:tcW w:type="dxa" w:w="4680"/>
+          </w:tcPr>
+          <w:p>
+            <w:pPr>
+              <w:spacing w:after="0"/>
+            </w:pPr>
+            <w:r/>
+            <w:r>
+              <w:rPr>
+                <w:rFonts w:ascii="Calibri" w:hAnsi="Calibri" w:eastAsia="Microsoft YaHei"/>
+                <w:b w:val="0"/>
+                <w:sz w:val="19"/>
+              </w:rPr>
               <w:t>远端微调</w:t>
             </w:r>
           </w:p>
@@ -3483,6 +3523,1760 @@
         <w:pStyle w:val="Heading1"/>
       </w:pPr>
       <w:r>
+        <w:t>6.5 多轮上下文评测</w:t>
+      </w:r>
+    </w:p>
+    <w:p>
+      <w:pPr>
+        <w:spacing w:after="120" w:line="264" w:lineRule="auto"/>
+      </w:pPr>
+      <w:r>
+        <w:rPr>
+          <w:rFonts w:ascii="Calibri" w:hAnsi="Calibri" w:eastAsia="Microsoft YaHei"/>
+          <w:color w:val="18202B"/>
+          <w:sz w:val="22"/>
+        </w:rPr>
+        <w:t>为补齐作业中“多轮对话为主”的要求，项目新增了多轮上下文 benchmark。评测不再只看单轮命中，而是测试系统能否在后续追问中保持正确门控、延续前文主题，并继续命中对应安全知识条目。</w:t>
+      </w:r>
+    </w:p>
+    <w:tbl>
+      <w:tblPr>
+        <w:tblStyle w:val="TableGrid"/>
+        <w:tblW w:type="auto" w:w="0"/>
+        <w:jc w:val="center"/>
+        <w:tblLook w:firstColumn="1" w:firstRow="1" w:lastColumn="0" w:lastRow="0" w:noHBand="0" w:noVBand="1" w:val="04A0"/>
+        <w:tblLayout w:type="fixed"/>
+      </w:tblPr>
+      <w:tblGrid>
+        <w:gridCol w:w="3120"/>
+        <w:gridCol w:w="3120"/>
+        <w:gridCol w:w="3120"/>
+      </w:tblGrid>
+      <w:tr>
+        <w:tc>
+          <w:tcPr>
+            <w:tcW w:type="dxa" w:w="2016"/>
+            <w:vAlign w:val="center"/>
+            <w:tcMar>
+              <w:top w:w="80" w:type="dxa"/>
+              <w:start w:w="120" w:type="dxa"/>
+              <w:bottom w:w="80" w:type="dxa"/>
+              <w:end w:w="120" w:type="dxa"/>
+            </w:tcMar>
+            <w:shd w:fill="F2F4F7"/>
+          </w:tcPr>
+          <w:p>
+            <w:pPr>
+              <w:spacing w:after="0"/>
+            </w:pPr>
+            <w:r/>
+            <w:r>
+              <w:rPr>
+                <w:rFonts w:ascii="Calibri" w:hAnsi="Calibri" w:eastAsia="Microsoft YaHei"/>
+                <w:b/>
+                <w:color w:val="18202B"/>
+                <w:sz w:val="19"/>
+              </w:rPr>
+              <w:t>指标</w:t>
+            </w:r>
+          </w:p>
+        </w:tc>
+        <w:tc>
+          <w:tcPr>
+            <w:tcW w:type="dxa" w:w="1440"/>
+            <w:vAlign w:val="center"/>
+            <w:tcMar>
+              <w:top w:w="80" w:type="dxa"/>
+              <w:start w:w="120" w:type="dxa"/>
+              <w:bottom w:w="80" w:type="dxa"/>
+              <w:end w:w="120" w:type="dxa"/>
+            </w:tcMar>
+            <w:shd w:fill="F2F4F7"/>
+          </w:tcPr>
+          <w:p>
+            <w:pPr>
+              <w:spacing w:after="0"/>
+            </w:pPr>
+            <w:r/>
+            <w:r>
+              <w:rPr>
+                <w:rFonts w:ascii="Calibri" w:hAnsi="Calibri" w:eastAsia="Microsoft YaHei"/>
+                <w:b/>
+                <w:color w:val="18202B"/>
+                <w:sz w:val="19"/>
+              </w:rPr>
+              <w:t>结果</w:t>
+            </w:r>
+          </w:p>
+        </w:tc>
+        <w:tc>
+          <w:tcPr>
+            <w:tcW w:type="dxa" w:w="5472"/>
+            <w:vAlign w:val="center"/>
+            <w:tcMar>
+              <w:top w:w="80" w:type="dxa"/>
+              <w:start w:w="120" w:type="dxa"/>
+              <w:bottom w:w="80" w:type="dxa"/>
+              <w:end w:w="120" w:type="dxa"/>
+            </w:tcMar>
+            <w:shd w:fill="F2F4F7"/>
+          </w:tcPr>
+          <w:p>
+            <w:pPr>
+              <w:spacing w:after="0"/>
+            </w:pPr>
+            <w:r/>
+            <w:r>
+              <w:rPr>
+                <w:rFonts w:ascii="Calibri" w:hAnsi="Calibri" w:eastAsia="Microsoft YaHei"/>
+                <w:b/>
+                <w:color w:val="18202B"/>
+                <w:sz w:val="19"/>
+              </w:rPr>
+              <w:t>说明</w:t>
+            </w:r>
+          </w:p>
+        </w:tc>
+      </w:tr>
+      <w:tr>
+        <w:tc>
+          <w:tcPr>
+            <w:tcW w:type="dxa" w:w="3120"/>
+          </w:tcPr>
+          <w:p>
+            <w:pPr>
+              <w:spacing w:after="0"/>
+            </w:pPr>
+            <w:r/>
+            <w:r>
+              <w:rPr>
+                <w:rFonts w:ascii="Calibri" w:hAnsi="Calibri" w:eastAsia="Microsoft YaHei"/>
+                <w:b w:val="0"/>
+                <w:sz w:val="19"/>
+              </w:rPr>
+              <w:t>对话数</w:t>
+            </w:r>
+          </w:p>
+        </w:tc>
+        <w:tc>
+          <w:tcPr>
+            <w:tcW w:type="dxa" w:w="3120"/>
+          </w:tcPr>
+          <w:p>
+            <w:pPr>
+              <w:spacing w:after="0"/>
+            </w:pPr>
+            <w:r/>
+            <w:r>
+              <w:rPr>
+                <w:rFonts w:ascii="Calibri" w:hAnsi="Calibri" w:eastAsia="Microsoft YaHei"/>
+                <w:b w:val="0"/>
+                <w:sz w:val="19"/>
+              </w:rPr>
+              <w:t>6</w:t>
+            </w:r>
+          </w:p>
+        </w:tc>
+        <w:tc>
+          <w:tcPr>
+            <w:tcW w:type="dxa" w:w="3120"/>
+          </w:tcPr>
+          <w:p>
+            <w:pPr>
+              <w:spacing w:after="0"/>
+            </w:pPr>
+            <w:r/>
+            <w:r>
+              <w:rPr>
+                <w:rFonts w:ascii="Calibri" w:hAnsi="Calibri" w:eastAsia="Microsoft YaHei"/>
+                <w:b w:val="0"/>
+                <w:sz w:val="19"/>
+              </w:rPr>
+              <w:t>覆盖有限空间、试压、吊装、高处作业和临时用电等多轮场景</w:t>
+            </w:r>
+          </w:p>
+        </w:tc>
+      </w:tr>
+      <w:tr>
+        <w:tc>
+          <w:tcPr>
+            <w:tcW w:type="dxa" w:w="3120"/>
+          </w:tcPr>
+          <w:p>
+            <w:pPr>
+              <w:spacing w:after="0"/>
+            </w:pPr>
+            <w:r/>
+            <w:r>
+              <w:rPr>
+                <w:rFonts w:ascii="Calibri" w:hAnsi="Calibri" w:eastAsia="Microsoft YaHei"/>
+                <w:b w:val="0"/>
+                <w:sz w:val="19"/>
+              </w:rPr>
+              <w:t>总轮次</w:t>
+            </w:r>
+          </w:p>
+        </w:tc>
+        <w:tc>
+          <w:tcPr>
+            <w:tcW w:type="dxa" w:w="3120"/>
+          </w:tcPr>
+          <w:p>
+            <w:pPr>
+              <w:spacing w:after="0"/>
+            </w:pPr>
+            <w:r/>
+            <w:r>
+              <w:rPr>
+                <w:rFonts w:ascii="Calibri" w:hAnsi="Calibri" w:eastAsia="Microsoft YaHei"/>
+                <w:b w:val="0"/>
+                <w:sz w:val="19"/>
+              </w:rPr>
+              <w:t>18</w:t>
+            </w:r>
+          </w:p>
+        </w:tc>
+        <w:tc>
+          <w:tcPr>
+            <w:tcW w:type="dxa" w:w="3120"/>
+          </w:tcPr>
+          <w:p>
+            <w:pPr>
+              <w:spacing w:after="0"/>
+            </w:pPr>
+            <w:r/>
+            <w:r>
+              <w:rPr>
+                <w:rFonts w:ascii="Calibri" w:hAnsi="Calibri" w:eastAsia="Microsoft YaHei"/>
+                <w:b w:val="0"/>
+                <w:sz w:val="19"/>
+              </w:rPr>
+              <w:t>包含首问与 follow-up turns</w:t>
+            </w:r>
+          </w:p>
+        </w:tc>
+      </w:tr>
+      <w:tr>
+        <w:tc>
+          <w:tcPr>
+            <w:tcW w:type="dxa" w:w="3120"/>
+          </w:tcPr>
+          <w:p>
+            <w:pPr>
+              <w:spacing w:after="0"/>
+            </w:pPr>
+            <w:r/>
+            <w:r>
+              <w:rPr>
+                <w:rFonts w:ascii="Calibri" w:hAnsi="Calibri" w:eastAsia="Microsoft YaHei"/>
+                <w:b w:val="0"/>
+                <w:sz w:val="19"/>
+              </w:rPr>
+              <w:t>追问轮次</w:t>
+            </w:r>
+          </w:p>
+        </w:tc>
+        <w:tc>
+          <w:tcPr>
+            <w:tcW w:type="dxa" w:w="3120"/>
+          </w:tcPr>
+          <w:p>
+            <w:pPr>
+              <w:spacing w:after="0"/>
+            </w:pPr>
+            <w:r/>
+            <w:r>
+              <w:rPr>
+                <w:rFonts w:ascii="Calibri" w:hAnsi="Calibri" w:eastAsia="Microsoft YaHei"/>
+                <w:b w:val="0"/>
+                <w:sz w:val="19"/>
+              </w:rPr>
+              <w:t>12</w:t>
+            </w:r>
+          </w:p>
+        </w:tc>
+        <w:tc>
+          <w:tcPr>
+            <w:tcW w:type="dxa" w:w="3120"/>
+          </w:tcPr>
+          <w:p>
+            <w:pPr>
+              <w:spacing w:after="0"/>
+            </w:pPr>
+            <w:r/>
+            <w:r>
+              <w:rPr>
+                <w:rFonts w:ascii="Calibri" w:hAnsi="Calibri" w:eastAsia="Microsoft YaHei"/>
+                <w:b w:val="0"/>
+                <w:sz w:val="19"/>
+              </w:rPr>
+              <w:t>需要依赖前文上下文才能稳定作答</w:t>
+            </w:r>
+          </w:p>
+        </w:tc>
+      </w:tr>
+      <w:tr>
+        <w:tc>
+          <w:tcPr>
+            <w:tcW w:type="dxa" w:w="3120"/>
+          </w:tcPr>
+          <w:p>
+            <w:pPr>
+              <w:spacing w:after="0"/>
+            </w:pPr>
+            <w:r/>
+            <w:r>
+              <w:rPr>
+                <w:rFonts w:ascii="Calibri" w:hAnsi="Calibri" w:eastAsia="Microsoft YaHei"/>
+                <w:b w:val="0"/>
+                <w:sz w:val="19"/>
+              </w:rPr>
+              <w:t>门控准确率</w:t>
+            </w:r>
+          </w:p>
+        </w:tc>
+        <w:tc>
+          <w:tcPr>
+            <w:tcW w:type="dxa" w:w="3120"/>
+          </w:tcPr>
+          <w:p>
+            <w:pPr>
+              <w:spacing w:after="0"/>
+            </w:pPr>
+            <w:r/>
+            <w:r>
+              <w:rPr>
+                <w:rFonts w:ascii="Calibri" w:hAnsi="Calibri" w:eastAsia="Microsoft YaHei"/>
+                <w:b w:val="0"/>
+                <w:sz w:val="19"/>
+              </w:rPr>
+              <w:t>100.0%</w:t>
+            </w:r>
+          </w:p>
+        </w:tc>
+        <w:tc>
+          <w:tcPr>
+            <w:tcW w:type="dxa" w:w="3120"/>
+          </w:tcPr>
+          <w:p>
+            <w:pPr>
+              <w:spacing w:after="0"/>
+            </w:pPr>
+            <w:r/>
+            <w:r>
+              <w:rPr>
+                <w:rFonts w:ascii="Calibri" w:hAnsi="Calibri" w:eastAsia="Microsoft YaHei"/>
+                <w:b w:val="0"/>
+                <w:sz w:val="19"/>
+              </w:rPr>
+              <w:t>多轮条件下 domain/safety 决策是否稳定</w:t>
+            </w:r>
+          </w:p>
+        </w:tc>
+      </w:tr>
+      <w:tr>
+        <w:tc>
+          <w:tcPr>
+            <w:tcW w:type="dxa" w:w="3120"/>
+          </w:tcPr>
+          <w:p>
+            <w:pPr>
+              <w:spacing w:after="0"/>
+            </w:pPr>
+            <w:r/>
+            <w:r>
+              <w:rPr>
+                <w:rFonts w:ascii="Calibri" w:hAnsi="Calibri" w:eastAsia="Microsoft YaHei"/>
+                <w:b w:val="0"/>
+                <w:sz w:val="19"/>
+              </w:rPr>
+              <w:t>Top-1 证据命中</w:t>
+            </w:r>
+          </w:p>
+        </w:tc>
+        <w:tc>
+          <w:tcPr>
+            <w:tcW w:type="dxa" w:w="3120"/>
+          </w:tcPr>
+          <w:p>
+            <w:pPr>
+              <w:spacing w:after="0"/>
+            </w:pPr>
+            <w:r/>
+            <w:r>
+              <w:rPr>
+                <w:rFonts w:ascii="Calibri" w:hAnsi="Calibri" w:eastAsia="Microsoft YaHei"/>
+                <w:b w:val="0"/>
+                <w:sz w:val="19"/>
+              </w:rPr>
+              <w:t>100.0%</w:t>
+            </w:r>
+          </w:p>
+        </w:tc>
+        <w:tc>
+          <w:tcPr>
+            <w:tcW w:type="dxa" w:w="3120"/>
+          </w:tcPr>
+          <w:p>
+            <w:pPr>
+              <w:spacing w:after="0"/>
+            </w:pPr>
+            <w:r/>
+            <w:r>
+              <w:rPr>
+                <w:rFonts w:ascii="Calibri" w:hAnsi="Calibri" w:eastAsia="Microsoft YaHei"/>
+                <w:b w:val="0"/>
+                <w:sz w:val="19"/>
+              </w:rPr>
+              <w:t>首条证据是否仍然对应正确主题</w:t>
+            </w:r>
+          </w:p>
+        </w:tc>
+      </w:tr>
+      <w:tr>
+        <w:tc>
+          <w:tcPr>
+            <w:tcW w:type="dxa" w:w="3120"/>
+          </w:tcPr>
+          <w:p>
+            <w:pPr>
+              <w:spacing w:after="0"/>
+            </w:pPr>
+            <w:r/>
+            <w:r>
+              <w:rPr>
+                <w:rFonts w:ascii="Calibri" w:hAnsi="Calibri" w:eastAsia="Microsoft YaHei"/>
+                <w:b w:val="0"/>
+                <w:sz w:val="19"/>
+              </w:rPr>
+              <w:t>Title hit@3</w:t>
+            </w:r>
+          </w:p>
+        </w:tc>
+        <w:tc>
+          <w:tcPr>
+            <w:tcW w:type="dxa" w:w="3120"/>
+          </w:tcPr>
+          <w:p>
+            <w:pPr>
+              <w:spacing w:after="0"/>
+            </w:pPr>
+            <w:r/>
+            <w:r>
+              <w:rPr>
+                <w:rFonts w:ascii="Calibri" w:hAnsi="Calibri" w:eastAsia="Microsoft YaHei"/>
+                <w:b w:val="0"/>
+                <w:sz w:val="19"/>
+              </w:rPr>
+              <w:t>100.0%</w:t>
+            </w:r>
+          </w:p>
+        </w:tc>
+        <w:tc>
+          <w:tcPr>
+            <w:tcW w:type="dxa" w:w="3120"/>
+          </w:tcPr>
+          <w:p>
+            <w:pPr>
+              <w:spacing w:after="0"/>
+            </w:pPr>
+            <w:r/>
+            <w:r>
+              <w:rPr>
+                <w:rFonts w:ascii="Calibri" w:hAnsi="Calibri" w:eastAsia="Microsoft YaHei"/>
+                <w:b w:val="0"/>
+                <w:sz w:val="19"/>
+              </w:rPr>
+              <w:t>前三条证据是否包含目标知识条目</w:t>
+            </w:r>
+          </w:p>
+        </w:tc>
+      </w:tr>
+      <w:tr>
+        <w:tc>
+          <w:tcPr>
+            <w:tcW w:type="dxa" w:w="3120"/>
+          </w:tcPr>
+          <w:p>
+            <w:pPr>
+              <w:spacing w:after="0"/>
+            </w:pPr>
+            <w:r/>
+            <w:r>
+              <w:rPr>
+                <w:rFonts w:ascii="Calibri" w:hAnsi="Calibri" w:eastAsia="Microsoft YaHei"/>
+                <w:b w:val="0"/>
+                <w:sz w:val="19"/>
+              </w:rPr>
+              <w:t>关键词召回</w:t>
+            </w:r>
+          </w:p>
+        </w:tc>
+        <w:tc>
+          <w:tcPr>
+            <w:tcW w:type="dxa" w:w="3120"/>
+          </w:tcPr>
+          <w:p>
+            <w:pPr>
+              <w:spacing w:after="0"/>
+            </w:pPr>
+            <w:r/>
+            <w:r>
+              <w:rPr>
+                <w:rFonts w:ascii="Calibri" w:hAnsi="Calibri" w:eastAsia="Microsoft YaHei"/>
+                <w:b w:val="0"/>
+                <w:sz w:val="19"/>
+              </w:rPr>
+              <w:t>97.2%</w:t>
+            </w:r>
+          </w:p>
+        </w:tc>
+        <w:tc>
+          <w:tcPr>
+            <w:tcW w:type="dxa" w:w="3120"/>
+          </w:tcPr>
+          <w:p>
+            <w:pPr>
+              <w:spacing w:after="0"/>
+            </w:pPr>
+            <w:r/>
+            <w:r>
+              <w:rPr>
+                <w:rFonts w:ascii="Calibri" w:hAnsi="Calibri" w:eastAsia="Microsoft YaHei"/>
+                <w:b w:val="0"/>
+                <w:sz w:val="19"/>
+              </w:rPr>
+              <w:t>回答是否覆盖预期安全要点</w:t>
+            </w:r>
+          </w:p>
+        </w:tc>
+      </w:tr>
+      <w:tr>
+        <w:tc>
+          <w:tcPr>
+            <w:tcW w:type="dxa" w:w="3120"/>
+          </w:tcPr>
+          <w:p>
+            <w:pPr>
+              <w:spacing w:after="0"/>
+            </w:pPr>
+            <w:r/>
+            <w:r>
+              <w:rPr>
+                <w:rFonts w:ascii="Calibri" w:hAnsi="Calibri" w:eastAsia="Microsoft YaHei"/>
+                <w:b w:val="0"/>
+                <w:sz w:val="19"/>
+              </w:rPr>
+              <w:t>追问 grounding 准确率</w:t>
+            </w:r>
+          </w:p>
+        </w:tc>
+        <w:tc>
+          <w:tcPr>
+            <w:tcW w:type="dxa" w:w="3120"/>
+          </w:tcPr>
+          <w:p>
+            <w:pPr>
+              <w:spacing w:after="0"/>
+            </w:pPr>
+            <w:r/>
+            <w:r>
+              <w:rPr>
+                <w:rFonts w:ascii="Calibri" w:hAnsi="Calibri" w:eastAsia="Microsoft YaHei"/>
+                <w:b w:val="0"/>
+                <w:sz w:val="19"/>
+              </w:rPr>
+              <w:t>100.0%</w:t>
+            </w:r>
+          </w:p>
+        </w:tc>
+        <w:tc>
+          <w:tcPr>
+            <w:tcW w:type="dxa" w:w="3120"/>
+          </w:tcPr>
+          <w:p>
+            <w:pPr>
+              <w:spacing w:after="0"/>
+            </w:pPr>
+            <w:r/>
+            <w:r>
+              <w:rPr>
+                <w:rFonts w:ascii="Calibri" w:hAnsi="Calibri" w:eastAsia="Microsoft YaHei"/>
+                <w:b w:val="0"/>
+                <w:sz w:val="19"/>
+              </w:rPr>
+              <w:t>依赖历史上下文的轮次是否仍能命中正确证据</w:t>
+            </w:r>
+          </w:p>
+        </w:tc>
+      </w:tr>
+      <w:tr>
+        <w:tc>
+          <w:tcPr>
+            <w:tcW w:type="dxa" w:w="3120"/>
+          </w:tcPr>
+          <w:p>
+            <w:pPr>
+              <w:spacing w:after="0"/>
+            </w:pPr>
+            <w:r/>
+            <w:r>
+              <w:rPr>
+                <w:rFonts w:ascii="Calibri" w:hAnsi="Calibri" w:eastAsia="Microsoft YaHei"/>
+                <w:b w:val="0"/>
+                <w:sz w:val="19"/>
+              </w:rPr>
+              <w:t>平均总耗时(ms)</w:t>
+            </w:r>
+          </w:p>
+        </w:tc>
+        <w:tc>
+          <w:tcPr>
+            <w:tcW w:type="dxa" w:w="3120"/>
+          </w:tcPr>
+          <w:p>
+            <w:pPr>
+              <w:spacing w:after="0"/>
+            </w:pPr>
+            <w:r/>
+            <w:r>
+              <w:rPr>
+                <w:rFonts w:ascii="Calibri" w:hAnsi="Calibri" w:eastAsia="Microsoft YaHei"/>
+                <w:b w:val="0"/>
+                <w:sz w:val="19"/>
+              </w:rPr>
+              <w:t>2936</w:t>
+            </w:r>
+          </w:p>
+        </w:tc>
+        <w:tc>
+          <w:tcPr>
+            <w:tcW w:type="dxa" w:w="3120"/>
+          </w:tcPr>
+          <w:p>
+            <w:pPr>
+              <w:spacing w:after="0"/>
+            </w:pPr>
+            <w:r/>
+            <w:r>
+              <w:rPr>
+                <w:rFonts w:ascii="Calibri" w:hAnsi="Calibri" w:eastAsia="Microsoft YaHei"/>
+                <w:b w:val="0"/>
+                <w:sz w:val="19"/>
+              </w:rPr>
+              <w:t>full pipeline 下的多轮平均响应耗时</w:t>
+            </w:r>
+          </w:p>
+        </w:tc>
+      </w:tr>
+    </w:tbl>
+    <w:p>
+      <w:pPr>
+        <w:spacing w:after="40"/>
+      </w:pPr>
+    </w:p>
+    <w:tbl>
+      <w:tblPr>
+        <w:tblStyle w:val="TableGrid"/>
+        <w:tblW w:type="auto" w:w="0"/>
+        <w:jc w:val="center"/>
+        <w:tblLook w:firstColumn="1" w:firstRow="1" w:lastColumn="0" w:lastRow="0" w:noHBand="0" w:noVBand="1" w:val="04A0"/>
+        <w:tblLayout w:type="fixed"/>
+      </w:tblPr>
+      <w:tblGrid>
+        <w:gridCol w:w="9360"/>
+      </w:tblGrid>
+      <w:tr>
+        <w:tc>
+          <w:tcPr>
+            <w:tcW w:type="dxa" w:w="9360"/>
+            <w:vAlign w:val="center"/>
+            <w:tcMar>
+              <w:top w:w="80" w:type="dxa"/>
+              <w:start w:w="120" w:type="dxa"/>
+              <w:bottom w:w="80" w:type="dxa"/>
+              <w:end w:w="120" w:type="dxa"/>
+            </w:tcMar>
+            <w:shd w:fill="E8EEF5"/>
+          </w:tcPr>
+          <w:p>
+            <w:pPr>
+              <w:spacing w:after="80"/>
+            </w:pPr>
+            <w:r>
+              <w:rPr>
+                <w:rFonts w:ascii="Calibri" w:hAnsi="Calibri" w:eastAsia="Microsoft YaHei"/>
+                <w:b/>
+                <w:color w:val="1F4D78"/>
+                <w:sz w:val="21"/>
+              </w:rPr>
+              <w:t>评测意义</w:t>
+            </w:r>
+          </w:p>
+          <w:p>
+            <w:pPr>
+              <w:spacing w:after="0" w:line="269" w:lineRule="auto"/>
+            </w:pPr>
+            <w:r>
+              <w:rPr>
+                <w:rFonts w:ascii="Calibri" w:hAnsi="Calibri" w:eastAsia="Microsoft YaHei"/>
+                <w:color w:val="18202B"/>
+                <w:sz w:val="20"/>
+              </w:rPr>
+              <w:t>多轮 benchmark 让 Part 1 和 Part 2 真正接上：系统不再只是单句问答，而是能够在连续追问中保持领域一致性、安全边界和证据 grounding。</w:t>
+            </w:r>
+          </w:p>
+        </w:tc>
+      </w:tr>
+    </w:tbl>
+    <w:p>
+      <w:pPr>
+        <w:spacing w:after="40"/>
+      </w:pPr>
+    </w:p>
+    <w:p>
+      <w:pPr>
+        <w:pStyle w:val="Heading1"/>
+      </w:pPr>
+      <w:r>
+        <w:t>6.8 真实语音链路联调验证</w:t>
+      </w:r>
+    </w:p>
+    <w:p>
+      <w:pPr>
+        <w:spacing w:after="120" w:line="264" w:lineRule="auto"/>
+      </w:pPr>
+      <w:r>
+        <w:rPr>
+          <w:rFonts w:ascii="Calibri" w:hAnsi="Calibri" w:eastAsia="Microsoft YaHei"/>
+          <w:color w:val="18202B"/>
+          <w:sz w:val="22"/>
+        </w:rPr>
+        <w:t>为证明系统不是只有前端页面，本项目额外完成了一轮远端真实语音链路联调：在 RTX 4090 上启动 FunASR / SenseVoice ASR 服务与 ChatTTS 中文 TTS 服务，通过 HTTP provider 接回本地 ShipVoice pipeline，形成真实语音输入和真实语音回传。</w:t>
+      </w:r>
+    </w:p>
+    <w:p>
+      <w:pPr>
+        <w:spacing w:after="120" w:line="264" w:lineRule="auto"/>
+      </w:pPr>
+      <w:r>
+        <w:rPr>
+          <w:rFonts w:ascii="Calibri" w:hAnsi="Calibri" w:eastAsia="Microsoft YaHei"/>
+          <w:color w:val="18202B"/>
+          <w:sz w:val="22"/>
+        </w:rPr>
+        <w:t>本轮验证重点不是追求最低时延，而是留下可审计的工程证据。当前 provider status 为 hybrid：真实音频 I/O 已经在线，问答生成仍由受控 mock_llm 层承接检索证据，因此它证明了真实服务集成能力，也明确暴露了后续企业级改造的瓶颈位置。</w:t>
+      </w:r>
+    </w:p>
+    <w:tbl>
+      <w:tblPr>
+        <w:tblStyle w:val="TableGrid"/>
+        <w:tblW w:type="auto" w:w="0"/>
+        <w:jc w:val="center"/>
+        <w:tblLook w:firstColumn="1" w:firstRow="1" w:lastColumn="0" w:lastRow="0" w:noHBand="0" w:noVBand="1" w:val="04A0"/>
+        <w:tblLayout w:type="fixed"/>
+      </w:tblPr>
+      <w:tblGrid>
+        <w:gridCol w:w="3120"/>
+        <w:gridCol w:w="3120"/>
+        <w:gridCol w:w="3120"/>
+      </w:tblGrid>
+      <w:tr>
+        <w:tc>
+          <w:tcPr>
+            <w:tcW w:type="dxa" w:w="2232"/>
+            <w:vAlign w:val="center"/>
+            <w:tcMar>
+              <w:top w:w="80" w:type="dxa"/>
+              <w:start w:w="120" w:type="dxa"/>
+              <w:bottom w:w="80" w:type="dxa"/>
+              <w:end w:w="120" w:type="dxa"/>
+            </w:tcMar>
+            <w:shd w:fill="F2F4F7"/>
+          </w:tcPr>
+          <w:p>
+            <w:pPr>
+              <w:spacing w:after="0"/>
+            </w:pPr>
+            <w:r/>
+            <w:r>
+              <w:rPr>
+                <w:rFonts w:ascii="Calibri" w:hAnsi="Calibri" w:eastAsia="Microsoft YaHei"/>
+                <w:b/>
+                <w:color w:val="18202B"/>
+                <w:sz w:val="19"/>
+              </w:rPr>
+              <w:t>指标</w:t>
+            </w:r>
+          </w:p>
+        </w:tc>
+        <w:tc>
+          <w:tcPr>
+            <w:tcW w:type="dxa" w:w="1944"/>
+            <w:vAlign w:val="center"/>
+            <w:tcMar>
+              <w:top w:w="80" w:type="dxa"/>
+              <w:start w:w="120" w:type="dxa"/>
+              <w:bottom w:w="80" w:type="dxa"/>
+              <w:end w:w="120" w:type="dxa"/>
+            </w:tcMar>
+            <w:shd w:fill="F2F4F7"/>
+          </w:tcPr>
+          <w:p>
+            <w:pPr>
+              <w:spacing w:after="0"/>
+            </w:pPr>
+            <w:r/>
+            <w:r>
+              <w:rPr>
+                <w:rFonts w:ascii="Calibri" w:hAnsi="Calibri" w:eastAsia="Microsoft YaHei"/>
+                <w:b/>
+                <w:color w:val="18202B"/>
+                <w:sz w:val="19"/>
+              </w:rPr>
+              <w:t>结果</w:t>
+            </w:r>
+          </w:p>
+        </w:tc>
+        <w:tc>
+          <w:tcPr>
+            <w:tcW w:type="dxa" w:w="4752"/>
+            <w:vAlign w:val="center"/>
+            <w:tcMar>
+              <w:top w:w="80" w:type="dxa"/>
+              <w:start w:w="120" w:type="dxa"/>
+              <w:bottom w:w="80" w:type="dxa"/>
+              <w:end w:w="120" w:type="dxa"/>
+            </w:tcMar>
+            <w:shd w:fill="F2F4F7"/>
+          </w:tcPr>
+          <w:p>
+            <w:pPr>
+              <w:spacing w:after="0"/>
+            </w:pPr>
+            <w:r/>
+            <w:r>
+              <w:rPr>
+                <w:rFonts w:ascii="Calibri" w:hAnsi="Calibri" w:eastAsia="Microsoft YaHei"/>
+                <w:b/>
+                <w:color w:val="18202B"/>
+                <w:sz w:val="19"/>
+              </w:rPr>
+              <w:t>说明</w:t>
+            </w:r>
+          </w:p>
+        </w:tc>
+      </w:tr>
+      <w:tr>
+        <w:tc>
+          <w:tcPr>
+            <w:tcW w:type="dxa" w:w="3120"/>
+          </w:tcPr>
+          <w:p>
+            <w:pPr>
+              <w:spacing w:after="0"/>
+            </w:pPr>
+            <w:r/>
+            <w:r>
+              <w:rPr>
+                <w:rFonts w:ascii="Calibri" w:hAnsi="Calibri" w:eastAsia="Microsoft YaHei"/>
+                <w:b w:val="0"/>
+                <w:sz w:val="19"/>
+              </w:rPr>
+              <w:t>验证样本数</w:t>
+            </w:r>
+          </w:p>
+        </w:tc>
+        <w:tc>
+          <w:tcPr>
+            <w:tcW w:type="dxa" w:w="3120"/>
+          </w:tcPr>
+          <w:p>
+            <w:pPr>
+              <w:spacing w:after="0"/>
+            </w:pPr>
+            <w:r/>
+            <w:r>
+              <w:rPr>
+                <w:rFonts w:ascii="Calibri" w:hAnsi="Calibri" w:eastAsia="Microsoft YaHei"/>
+                <w:b w:val="0"/>
+                <w:sz w:val="19"/>
+              </w:rPr>
+              <w:t>3</w:t>
+            </w:r>
+          </w:p>
+        </w:tc>
+        <w:tc>
+          <w:tcPr>
+            <w:tcW w:type="dxa" w:w="3120"/>
+          </w:tcPr>
+          <w:p>
+            <w:pPr>
+              <w:spacing w:after="0"/>
+            </w:pPr>
+            <w:r/>
+            <w:r>
+              <w:rPr>
+                <w:rFonts w:ascii="Calibri" w:hAnsi="Calibri" w:eastAsia="Microsoft YaHei"/>
+                <w:b w:val="0"/>
+                <w:sz w:val="19"/>
+              </w:rPr>
+              <w:t>A001-A003 三条真实录音端到端跑通</w:t>
+            </w:r>
+          </w:p>
+        </w:tc>
+      </w:tr>
+      <w:tr>
+        <w:tc>
+          <w:tcPr>
+            <w:tcW w:type="dxa" w:w="3120"/>
+          </w:tcPr>
+          <w:p>
+            <w:pPr>
+              <w:spacing w:after="0"/>
+            </w:pPr>
+            <w:r/>
+            <w:r>
+              <w:rPr>
+                <w:rFonts w:ascii="Calibri" w:hAnsi="Calibri" w:eastAsia="Microsoft YaHei"/>
+                <w:b w:val="0"/>
+                <w:sz w:val="19"/>
+              </w:rPr>
+              <w:t>ASR 服务</w:t>
+            </w:r>
+          </w:p>
+        </w:tc>
+        <w:tc>
+          <w:tcPr>
+            <w:tcW w:type="dxa" w:w="3120"/>
+          </w:tcPr>
+          <w:p>
+            <w:pPr>
+              <w:spacing w:after="0"/>
+            </w:pPr>
+            <w:r/>
+            <w:r>
+              <w:rPr>
+                <w:rFonts w:ascii="Calibri" w:hAnsi="Calibri" w:eastAsia="Microsoft YaHei"/>
+                <w:b w:val="0"/>
+                <w:sz w:val="19"/>
+              </w:rPr>
+              <w:t>funasr_asr</w:t>
+            </w:r>
+          </w:p>
+        </w:tc>
+        <w:tc>
+          <w:tcPr>
+            <w:tcW w:type="dxa" w:w="3120"/>
+          </w:tcPr>
+          <w:p>
+            <w:pPr>
+              <w:spacing w:after="0"/>
+            </w:pPr>
+            <w:r/>
+            <w:r>
+              <w:rPr>
+                <w:rFonts w:ascii="Calibri" w:hAnsi="Calibri" w:eastAsia="Microsoft YaHei"/>
+                <w:b w:val="0"/>
+                <w:sz w:val="19"/>
+              </w:rPr>
+              <w:t>iic/SenseVoiceSmall</w:t>
+            </w:r>
+          </w:p>
+        </w:tc>
+      </w:tr>
+      <w:tr>
+        <w:tc>
+          <w:tcPr>
+            <w:tcW w:type="dxa" w:w="3120"/>
+          </w:tcPr>
+          <w:p>
+            <w:pPr>
+              <w:spacing w:after="0"/>
+            </w:pPr>
+            <w:r/>
+            <w:r>
+              <w:rPr>
+                <w:rFonts w:ascii="Calibri" w:hAnsi="Calibri" w:eastAsia="Microsoft YaHei"/>
+                <w:b w:val="0"/>
+                <w:sz w:val="19"/>
+              </w:rPr>
+              <w:t>TTS 服务</w:t>
+            </w:r>
+          </w:p>
+        </w:tc>
+        <w:tc>
+          <w:tcPr>
+            <w:tcW w:type="dxa" w:w="3120"/>
+          </w:tcPr>
+          <w:p>
+            <w:pPr>
+              <w:spacing w:after="0"/>
+            </w:pPr>
+            <w:r/>
+            <w:r>
+              <w:rPr>
+                <w:rFonts w:ascii="Calibri" w:hAnsi="Calibri" w:eastAsia="Microsoft YaHei"/>
+                <w:b w:val="0"/>
+                <w:sz w:val="19"/>
+              </w:rPr>
+              <w:t>chattts</w:t>
+            </w:r>
+          </w:p>
+        </w:tc>
+        <w:tc>
+          <w:tcPr>
+            <w:tcW w:type="dxa" w:w="3120"/>
+          </w:tcPr>
+          <w:p>
+            <w:pPr>
+              <w:spacing w:after="0"/>
+            </w:pPr>
+            <w:r/>
+            <w:r>
+              <w:rPr>
+                <w:rFonts w:ascii="Calibri" w:hAnsi="Calibri" w:eastAsia="Microsoft YaHei"/>
+                <w:b w:val="0"/>
+                <w:sz w:val="19"/>
+              </w:rPr>
+              <w:t>provider=http_json_tts</w:t>
+            </w:r>
+          </w:p>
+        </w:tc>
+      </w:tr>
+      <w:tr>
+        <w:tc>
+          <w:tcPr>
+            <w:tcW w:type="dxa" w:w="3120"/>
+          </w:tcPr>
+          <w:p>
+            <w:pPr>
+              <w:spacing w:after="0"/>
+            </w:pPr>
+            <w:r/>
+            <w:r>
+              <w:rPr>
+                <w:rFonts w:ascii="Calibri" w:hAnsi="Calibri" w:eastAsia="Microsoft YaHei"/>
+                <w:b w:val="0"/>
+                <w:sz w:val="19"/>
+              </w:rPr>
+              <w:t>执行形态</w:t>
+            </w:r>
+          </w:p>
+        </w:tc>
+        <w:tc>
+          <w:tcPr>
+            <w:tcW w:type="dxa" w:w="3120"/>
+          </w:tcPr>
+          <w:p>
+            <w:pPr>
+              <w:spacing w:after="0"/>
+            </w:pPr>
+            <w:r/>
+            <w:r>
+              <w:rPr>
+                <w:rFonts w:ascii="Calibri" w:hAnsi="Calibri" w:eastAsia="Microsoft YaHei"/>
+                <w:b w:val="0"/>
+                <w:sz w:val="19"/>
+              </w:rPr>
+              <w:t>hybrid</w:t>
+            </w:r>
+          </w:p>
+        </w:tc>
+        <w:tc>
+          <w:tcPr>
+            <w:tcW w:type="dxa" w:w="3120"/>
+          </w:tcPr>
+          <w:p>
+            <w:pPr>
+              <w:spacing w:after="0"/>
+            </w:pPr>
+            <w:r/>
+            <w:r>
+              <w:rPr>
+                <w:rFonts w:ascii="Calibri" w:hAnsi="Calibri" w:eastAsia="Microsoft YaHei"/>
+                <w:b w:val="0"/>
+                <w:sz w:val="19"/>
+              </w:rPr>
+              <w:t>LLM provider=mock_llm</w:t>
+            </w:r>
+          </w:p>
+        </w:tc>
+      </w:tr>
+      <w:tr>
+        <w:tc>
+          <w:tcPr>
+            <w:tcW w:type="dxa" w:w="3120"/>
+          </w:tcPr>
+          <w:p>
+            <w:pPr>
+              <w:spacing w:after="0"/>
+            </w:pPr>
+            <w:r/>
+            <w:r>
+              <w:rPr>
+                <w:rFonts w:ascii="Calibri" w:hAnsi="Calibri" w:eastAsia="Microsoft YaHei"/>
+                <w:b w:val="0"/>
+                <w:sz w:val="19"/>
+              </w:rPr>
+              <w:t>平均 ASR 耗时</w:t>
+            </w:r>
+          </w:p>
+        </w:tc>
+        <w:tc>
+          <w:tcPr>
+            <w:tcW w:type="dxa" w:w="3120"/>
+          </w:tcPr>
+          <w:p>
+            <w:pPr>
+              <w:spacing w:after="0"/>
+            </w:pPr>
+            <w:r/>
+            <w:r>
+              <w:rPr>
+                <w:rFonts w:ascii="Calibri" w:hAnsi="Calibri" w:eastAsia="Microsoft YaHei"/>
+                <w:b w:val="0"/>
+                <w:sz w:val="19"/>
+              </w:rPr>
+              <w:t>158 ms</w:t>
+            </w:r>
+          </w:p>
+        </w:tc>
+        <w:tc>
+          <w:tcPr>
+            <w:tcW w:type="dxa" w:w="3120"/>
+          </w:tcPr>
+          <w:p>
+            <w:pPr>
+              <w:spacing w:after="0"/>
+            </w:pPr>
+            <w:r/>
+            <w:r>
+              <w:rPr>
+                <w:rFonts w:ascii="Calibri" w:hAnsi="Calibri" w:eastAsia="Microsoft YaHei"/>
+                <w:b w:val="0"/>
+                <w:sz w:val="19"/>
+              </w:rPr>
+              <w:t>真实语音转写阶段</w:t>
+            </w:r>
+          </w:p>
+        </w:tc>
+      </w:tr>
+      <w:tr>
+        <w:tc>
+          <w:tcPr>
+            <w:tcW w:type="dxa" w:w="3120"/>
+          </w:tcPr>
+          <w:p>
+            <w:pPr>
+              <w:spacing w:after="0"/>
+            </w:pPr>
+            <w:r/>
+            <w:r>
+              <w:rPr>
+                <w:rFonts w:ascii="Calibri" w:hAnsi="Calibri" w:eastAsia="Microsoft YaHei"/>
+                <w:b w:val="0"/>
+                <w:sz w:val="19"/>
+              </w:rPr>
+              <w:t>平均检索耗时</w:t>
+            </w:r>
+          </w:p>
+        </w:tc>
+        <w:tc>
+          <w:tcPr>
+            <w:tcW w:type="dxa" w:w="3120"/>
+          </w:tcPr>
+          <w:p>
+            <w:pPr>
+              <w:spacing w:after="0"/>
+            </w:pPr>
+            <w:r/>
+            <w:r>
+              <w:rPr>
+                <w:rFonts w:ascii="Calibri" w:hAnsi="Calibri" w:eastAsia="Microsoft YaHei"/>
+                <w:b w:val="0"/>
+                <w:sz w:val="19"/>
+              </w:rPr>
+              <w:t>166 ms</w:t>
+            </w:r>
+          </w:p>
+        </w:tc>
+        <w:tc>
+          <w:tcPr>
+            <w:tcW w:type="dxa" w:w="3120"/>
+          </w:tcPr>
+          <w:p>
+            <w:pPr>
+              <w:spacing w:after="0"/>
+            </w:pPr>
+            <w:r/>
+            <w:r>
+              <w:rPr>
+                <w:rFonts w:ascii="Calibri" w:hAnsi="Calibri" w:eastAsia="Microsoft YaHei"/>
+                <w:b w:val="0"/>
+                <w:sz w:val="19"/>
+              </w:rPr>
+              <w:t>RAG 证据检索阶段</w:t>
+            </w:r>
+          </w:p>
+        </w:tc>
+      </w:tr>
+      <w:tr>
+        <w:tc>
+          <w:tcPr>
+            <w:tcW w:type="dxa" w:w="3120"/>
+          </w:tcPr>
+          <w:p>
+            <w:pPr>
+              <w:spacing w:after="0"/>
+            </w:pPr>
+            <w:r/>
+            <w:r>
+              <w:rPr>
+                <w:rFonts w:ascii="Calibri" w:hAnsi="Calibri" w:eastAsia="Microsoft YaHei"/>
+                <w:b w:val="0"/>
+                <w:sz w:val="19"/>
+              </w:rPr>
+              <w:t>平均 TTS 首音</w:t>
+            </w:r>
+          </w:p>
+        </w:tc>
+        <w:tc>
+          <w:tcPr>
+            <w:tcW w:type="dxa" w:w="3120"/>
+          </w:tcPr>
+          <w:p>
+            <w:pPr>
+              <w:spacing w:after="0"/>
+            </w:pPr>
+            <w:r/>
+            <w:r>
+              <w:rPr>
+                <w:rFonts w:ascii="Calibri" w:hAnsi="Calibri" w:eastAsia="Microsoft YaHei"/>
+                <w:b w:val="0"/>
+                <w:sz w:val="19"/>
+              </w:rPr>
+              <w:t>14794 ms</w:t>
+            </w:r>
+          </w:p>
+        </w:tc>
+        <w:tc>
+          <w:tcPr>
+            <w:tcW w:type="dxa" w:w="3120"/>
+          </w:tcPr>
+          <w:p>
+            <w:pPr>
+              <w:spacing w:after="0"/>
+            </w:pPr>
+            <w:r/>
+            <w:r>
+              <w:rPr>
+                <w:rFonts w:ascii="Calibri" w:hAnsi="Calibri" w:eastAsia="Microsoft YaHei"/>
+                <w:b w:val="0"/>
+                <w:sz w:val="19"/>
+              </w:rPr>
+              <w:t>当前主要性能瓶颈</w:t>
+            </w:r>
+          </w:p>
+        </w:tc>
+      </w:tr>
+      <w:tr>
+        <w:tc>
+          <w:tcPr>
+            <w:tcW w:type="dxa" w:w="3120"/>
+          </w:tcPr>
+          <w:p>
+            <w:pPr>
+              <w:spacing w:after="0"/>
+            </w:pPr>
+            <w:r/>
+            <w:r>
+              <w:rPr>
+                <w:rFonts w:ascii="Calibri" w:hAnsi="Calibri" w:eastAsia="Microsoft YaHei"/>
+                <w:b w:val="0"/>
+                <w:sz w:val="19"/>
+              </w:rPr>
+              <w:t>平均端到端首音</w:t>
+            </w:r>
+          </w:p>
+        </w:tc>
+        <w:tc>
+          <w:tcPr>
+            <w:tcW w:type="dxa" w:w="3120"/>
+          </w:tcPr>
+          <w:p>
+            <w:pPr>
+              <w:spacing w:after="0"/>
+            </w:pPr>
+            <w:r/>
+            <w:r>
+              <w:rPr>
+                <w:rFonts w:ascii="Calibri" w:hAnsi="Calibri" w:eastAsia="Microsoft YaHei"/>
+                <w:b w:val="0"/>
+                <w:sz w:val="19"/>
+              </w:rPr>
+              <w:t>15239 ms</w:t>
+            </w:r>
+          </w:p>
+        </w:tc>
+        <w:tc>
+          <w:tcPr>
+            <w:tcW w:type="dxa" w:w="3120"/>
+          </w:tcPr>
+          <w:p>
+            <w:pPr>
+              <w:spacing w:after="0"/>
+            </w:pPr>
+            <w:r/>
+            <w:r>
+              <w:rPr>
+                <w:rFonts w:ascii="Calibri" w:hAnsi="Calibri" w:eastAsia="Microsoft YaHei"/>
+                <w:b w:val="0"/>
+                <w:sz w:val="19"/>
+              </w:rPr>
+              <w:t>远端真实语音链路观察值</w:t>
+            </w:r>
+          </w:p>
+        </w:tc>
+      </w:tr>
+    </w:tbl>
+    <w:p>
+      <w:pPr>
+        <w:spacing w:after="40"/>
+      </w:pPr>
+    </w:p>
+    <w:tbl>
+      <w:tblPr>
+        <w:tblStyle w:val="TableGrid"/>
+        <w:tblW w:type="auto" w:w="0"/>
+        <w:jc w:val="center"/>
+        <w:tblLook w:firstColumn="1" w:firstRow="1" w:lastColumn="0" w:lastRow="0" w:noHBand="0" w:noVBand="1" w:val="04A0"/>
+        <w:tblLayout w:type="fixed"/>
+      </w:tblPr>
+      <w:tblGrid>
+        <w:gridCol w:w="2340"/>
+        <w:gridCol w:w="2340"/>
+        <w:gridCol w:w="2340"/>
+        <w:gridCol w:w="2340"/>
+      </w:tblGrid>
+      <w:tr>
+        <w:tc>
+          <w:tcPr>
+            <w:tcW w:type="dxa" w:w="1152"/>
+            <w:vAlign w:val="center"/>
+            <w:tcMar>
+              <w:top w:w="80" w:type="dxa"/>
+              <w:start w:w="120" w:type="dxa"/>
+              <w:bottom w:w="80" w:type="dxa"/>
+              <w:end w:w="120" w:type="dxa"/>
+            </w:tcMar>
+            <w:shd w:fill="F2F4F7"/>
+          </w:tcPr>
+          <w:p>
+            <w:pPr>
+              <w:spacing w:after="0"/>
+            </w:pPr>
+            <w:r/>
+            <w:r>
+              <w:rPr>
+                <w:rFonts w:ascii="Calibri" w:hAnsi="Calibri" w:eastAsia="Microsoft YaHei"/>
+                <w:b/>
+                <w:color w:val="18202B"/>
+                <w:sz w:val="19"/>
+              </w:rPr>
+              <w:t>样本</w:t>
+            </w:r>
+          </w:p>
+        </w:tc>
+        <w:tc>
+          <w:tcPr>
+            <w:tcW w:type="dxa" w:w="4608"/>
+            <w:vAlign w:val="center"/>
+            <w:tcMar>
+              <w:top w:w="80" w:type="dxa"/>
+              <w:start w:w="120" w:type="dxa"/>
+              <w:bottom w:w="80" w:type="dxa"/>
+              <w:end w:w="120" w:type="dxa"/>
+            </w:tcMar>
+            <w:shd w:fill="F2F4F7"/>
+          </w:tcPr>
+          <w:p>
+            <w:pPr>
+              <w:spacing w:after="0"/>
+            </w:pPr>
+            <w:r/>
+            <w:r>
+              <w:rPr>
+                <w:rFonts w:ascii="Calibri" w:hAnsi="Calibri" w:eastAsia="Microsoft YaHei"/>
+                <w:b/>
+                <w:color w:val="18202B"/>
+                <w:sz w:val="19"/>
+              </w:rPr>
+              <w:t>转写结果</w:t>
+            </w:r>
+          </w:p>
+        </w:tc>
+        <w:tc>
+          <w:tcPr>
+            <w:tcW w:type="dxa" w:w="1872"/>
+            <w:vAlign w:val="center"/>
+            <w:tcMar>
+              <w:top w:w="80" w:type="dxa"/>
+              <w:start w:w="120" w:type="dxa"/>
+              <w:bottom w:w="80" w:type="dxa"/>
+              <w:end w:w="120" w:type="dxa"/>
+            </w:tcMar>
+            <w:shd w:fill="F2F4F7"/>
+          </w:tcPr>
+          <w:p>
+            <w:pPr>
+              <w:spacing w:after="0"/>
+            </w:pPr>
+            <w:r/>
+            <w:r>
+              <w:rPr>
+                <w:rFonts w:ascii="Calibri" w:hAnsi="Calibri" w:eastAsia="Microsoft YaHei"/>
+                <w:b/>
+                <w:color w:val="18202B"/>
+                <w:sz w:val="19"/>
+              </w:rPr>
+              <w:t>ASR/检索/TTS首音(ms)</w:t>
+            </w:r>
+          </w:p>
+        </w:tc>
+        <w:tc>
+          <w:tcPr>
+            <w:tcW w:type="dxa" w:w="1728"/>
+            <w:vAlign w:val="center"/>
+            <w:tcMar>
+              <w:top w:w="80" w:type="dxa"/>
+              <w:start w:w="120" w:type="dxa"/>
+              <w:bottom w:w="80" w:type="dxa"/>
+              <w:end w:w="120" w:type="dxa"/>
+            </w:tcMar>
+            <w:shd w:fill="F2F4F7"/>
+          </w:tcPr>
+          <w:p>
+            <w:pPr>
+              <w:spacing w:after="0"/>
+            </w:pPr>
+            <w:r/>
+            <w:r>
+              <w:rPr>
+                <w:rFonts w:ascii="Calibri" w:hAnsi="Calibri" w:eastAsia="Microsoft YaHei"/>
+                <w:b/>
+                <w:color w:val="18202B"/>
+                <w:sz w:val="19"/>
+              </w:rPr>
+              <w:t>总耗时(ms)</w:t>
+            </w:r>
+          </w:p>
+        </w:tc>
+      </w:tr>
+      <w:tr>
+        <w:tc>
+          <w:tcPr>
+            <w:tcW w:type="dxa" w:w="2340"/>
+          </w:tcPr>
+          <w:p>
+            <w:pPr>
+              <w:spacing w:after="0"/>
+            </w:pPr>
+            <w:r/>
+            <w:r>
+              <w:rPr>
+                <w:rFonts w:ascii="Calibri" w:hAnsi="Calibri" w:eastAsia="Microsoft YaHei"/>
+                <w:b w:val="0"/>
+                <w:sz w:val="19"/>
+              </w:rPr>
+              <w:t>A001</w:t>
+            </w:r>
+          </w:p>
+        </w:tc>
+        <w:tc>
+          <w:tcPr>
+            <w:tcW w:type="dxa" w:w="2340"/>
+          </w:tcPr>
+          <w:p>
+            <w:pPr>
+              <w:spacing w:after="0"/>
+            </w:pPr>
+            <w:r/>
+            <w:r>
+              <w:rPr>
+                <w:rFonts w:ascii="Calibri" w:hAnsi="Calibri" w:eastAsia="Microsoft YaHei"/>
+                <w:b w:val="0"/>
+                <w:sz w:val="19"/>
+              </w:rPr>
+              <w:t>密闭舱室动火作业前要检查什么？</w:t>
+            </w:r>
+          </w:p>
+        </w:tc>
+        <w:tc>
+          <w:tcPr>
+            <w:tcW w:type="dxa" w:w="2340"/>
+          </w:tcPr>
+          <w:p>
+            <w:pPr>
+              <w:spacing w:after="0"/>
+            </w:pPr>
+            <w:r/>
+            <w:r>
+              <w:rPr>
+                <w:rFonts w:ascii="Calibri" w:hAnsi="Calibri" w:eastAsia="Microsoft YaHei"/>
+                <w:b w:val="0"/>
+                <w:sz w:val="19"/>
+              </w:rPr>
+              <w:t>129 / 165 / 16461</w:t>
+            </w:r>
+          </w:p>
+        </w:tc>
+        <w:tc>
+          <w:tcPr>
+            <w:tcW w:type="dxa" w:w="2340"/>
+          </w:tcPr>
+          <w:p>
+            <w:pPr>
+              <w:spacing w:after="0"/>
+            </w:pPr>
+            <w:r/>
+            <w:r>
+              <w:rPr>
+                <w:rFonts w:ascii="Calibri" w:hAnsi="Calibri" w:eastAsia="Microsoft YaHei"/>
+                <w:b w:val="0"/>
+                <w:sz w:val="19"/>
+              </w:rPr>
+              <w:t>16876</w:t>
+            </w:r>
+          </w:p>
+        </w:tc>
+      </w:tr>
+      <w:tr>
+        <w:tc>
+          <w:tcPr>
+            <w:tcW w:type="dxa" w:w="2340"/>
+          </w:tcPr>
+          <w:p>
+            <w:pPr>
+              <w:spacing w:after="0"/>
+            </w:pPr>
+            <w:r/>
+            <w:r>
+              <w:rPr>
+                <w:rFonts w:ascii="Calibri" w:hAnsi="Calibri" w:eastAsia="Microsoft YaHei"/>
+                <w:b w:val="0"/>
+                <w:sz w:val="19"/>
+              </w:rPr>
+              <w:t>A002</w:t>
+            </w:r>
+          </w:p>
+        </w:tc>
+        <w:tc>
+          <w:tcPr>
+            <w:tcW w:type="dxa" w:w="2340"/>
+          </w:tcPr>
+          <w:p>
+            <w:pPr>
+              <w:spacing w:after="0"/>
+            </w:pPr>
+            <w:r/>
+            <w:r>
+              <w:rPr>
+                <w:rFonts w:ascii="Calibri" w:hAnsi="Calibri" w:eastAsia="Microsoft YaHei"/>
+                <w:b w:val="0"/>
+                <w:sz w:val="19"/>
+              </w:rPr>
+              <w:t>舾装阶段管路试压有哪些安全风险？</w:t>
+            </w:r>
+          </w:p>
+        </w:tc>
+        <w:tc>
+          <w:tcPr>
+            <w:tcW w:type="dxa" w:w="2340"/>
+          </w:tcPr>
+          <w:p>
+            <w:pPr>
+              <w:spacing w:after="0"/>
+            </w:pPr>
+            <w:r/>
+            <w:r>
+              <w:rPr>
+                <w:rFonts w:ascii="Calibri" w:hAnsi="Calibri" w:eastAsia="Microsoft YaHei"/>
+                <w:b w:val="0"/>
+                <w:sz w:val="19"/>
+              </w:rPr>
+              <w:t>150 / 166 / 13324</w:t>
+            </w:r>
+          </w:p>
+        </w:tc>
+        <w:tc>
+          <w:tcPr>
+            <w:tcW w:type="dxa" w:w="2340"/>
+          </w:tcPr>
+          <w:p>
+            <w:pPr>
+              <w:spacing w:after="0"/>
+            </w:pPr>
+            <w:r/>
+            <w:r>
+              <w:rPr>
+                <w:rFonts w:ascii="Calibri" w:hAnsi="Calibri" w:eastAsia="Microsoft YaHei"/>
+                <w:b w:val="0"/>
+                <w:sz w:val="19"/>
+              </w:rPr>
+              <w:t>13761</w:t>
+            </w:r>
+          </w:p>
+        </w:tc>
+      </w:tr>
+      <w:tr>
+        <w:tc>
+          <w:tcPr>
+            <w:tcW w:type="dxa" w:w="2340"/>
+          </w:tcPr>
+          <w:p>
+            <w:pPr>
+              <w:spacing w:after="0"/>
+            </w:pPr>
+            <w:r/>
+            <w:r>
+              <w:rPr>
+                <w:rFonts w:ascii="Calibri" w:hAnsi="Calibri" w:eastAsia="Microsoft YaHei"/>
+                <w:b w:val="0"/>
+                <w:sz w:val="19"/>
+              </w:rPr>
+              <w:t>A003</w:t>
+            </w:r>
+          </w:p>
+        </w:tc>
+        <w:tc>
+          <w:tcPr>
+            <w:tcW w:type="dxa" w:w="2340"/>
+          </w:tcPr>
+          <w:p>
+            <w:pPr>
+              <w:spacing w:after="0"/>
+            </w:pPr>
+            <w:r/>
+            <w:r>
+              <w:rPr>
+                <w:rFonts w:ascii="Calibri" w:hAnsi="Calibri" w:eastAsia="Microsoft YaHei"/>
+                <w:b w:val="0"/>
+                <w:sz w:val="19"/>
+              </w:rPr>
+              <w:t>船体分段吊装前，需要确认哪些事项？</w:t>
+            </w:r>
+          </w:p>
+        </w:tc>
+        <w:tc>
+          <w:tcPr>
+            <w:tcW w:type="dxa" w:w="2340"/>
+          </w:tcPr>
+          <w:p>
+            <w:pPr>
+              <w:spacing w:after="0"/>
+            </w:pPr>
+            <w:r/>
+            <w:r>
+              <w:rPr>
+                <w:rFonts w:ascii="Calibri" w:hAnsi="Calibri" w:eastAsia="Microsoft YaHei"/>
+                <w:b w:val="0"/>
+                <w:sz w:val="19"/>
+              </w:rPr>
+              <w:t>195 / 166 / 14597</w:t>
+            </w:r>
+          </w:p>
+        </w:tc>
+        <w:tc>
+          <w:tcPr>
+            <w:tcW w:type="dxa" w:w="2340"/>
+          </w:tcPr>
+          <w:p>
+            <w:pPr>
+              <w:spacing w:after="0"/>
+            </w:pPr>
+            <w:r/>
+            <w:r>
+              <w:rPr>
+                <w:rFonts w:ascii="Calibri" w:hAnsi="Calibri" w:eastAsia="Microsoft YaHei"/>
+                <w:b w:val="0"/>
+                <w:sz w:val="19"/>
+              </w:rPr>
+              <w:t>15080</w:t>
+            </w:r>
+          </w:p>
+        </w:tc>
+      </w:tr>
+    </w:tbl>
+    <w:p>
+      <w:pPr>
+        <w:spacing w:after="40"/>
+      </w:pPr>
+    </w:p>
+    <w:tbl>
+      <w:tblPr>
+        <w:tblStyle w:val="TableGrid"/>
+        <w:tblW w:type="auto" w:w="0"/>
+        <w:jc w:val="center"/>
+        <w:tblLook w:firstColumn="1" w:firstRow="1" w:lastColumn="0" w:lastRow="0" w:noHBand="0" w:noVBand="1" w:val="04A0"/>
+        <w:tblLayout w:type="fixed"/>
+      </w:tblPr>
+      <w:tblGrid>
+        <w:gridCol w:w="9360"/>
+      </w:tblGrid>
+      <w:tr>
+        <w:tc>
+          <w:tcPr>
+            <w:tcW w:type="dxa" w:w="9360"/>
+            <w:vAlign w:val="center"/>
+            <w:tcMar>
+              <w:top w:w="80" w:type="dxa"/>
+              <w:start w:w="120" w:type="dxa"/>
+              <w:bottom w:w="80" w:type="dxa"/>
+              <w:end w:w="120" w:type="dxa"/>
+            </w:tcMar>
+            <w:shd w:fill="E8EEF5"/>
+          </w:tcPr>
+          <w:p>
+            <w:pPr>
+              <w:spacing w:after="80"/>
+            </w:pPr>
+            <w:r>
+              <w:rPr>
+                <w:rFonts w:ascii="Calibri" w:hAnsi="Calibri" w:eastAsia="Microsoft YaHei"/>
+                <w:b/>
+                <w:color w:val="1F4D78"/>
+                <w:sz w:val="21"/>
+              </w:rPr>
+              <w:t>联调结论</w:t>
+            </w:r>
+          </w:p>
+          <w:p>
+            <w:pPr>
+              <w:spacing w:after="0" w:line="269" w:lineRule="auto"/>
+            </w:pPr>
+            <w:r>
+              <w:rPr>
+                <w:rFonts w:ascii="Calibri" w:hAnsi="Calibri" w:eastAsia="Microsoft YaHei"/>
+                <w:color w:val="18202B"/>
+                <w:sz w:val="20"/>
+              </w:rPr>
+              <w:t>真实语音链路证据已归档至 results\remote_real_chain_20260612_chattts_48359。当前系统已经具备“真实语音输入 + 真实语音输出 + 可控安全问答”的工程形态；下一阶段的主要任务不是继续证明能跑，而是优化 TTS 延迟并替换 hybrid 中的 mock_llm。</w:t>
+            </w:r>
+          </w:p>
+        </w:tc>
+      </w:tr>
+    </w:tbl>
+    <w:p>
+      <w:pPr>
+        <w:spacing w:after="40"/>
+      </w:pPr>
+    </w:p>
+    <w:p>
+      <w:pPr>
+        <w:pStyle w:val="Heading1"/>
+      </w:pPr>
+      <w:r>
         <w:t>7. 本地演示与延迟评估</w:t>
       </w:r>
     </w:p>
@@ -3496,7 +5290,7 @@
           <w:color w:val="18202B"/>
           <w:sz w:val="22"/>
         </w:rPr>
-        <w:t>本地演示使用 run_demo.py 启动后端和 Web 面板，默认 mock provider 可以模拟 ASR、LLM 和 TTS 的时延，使系统在没有 GPU 或外部 API 的情况下仍能展示完整链路。</w:t>
+        <w:t>本地演示使用 run_demo.py 启动后端和 Web 面板。当前版本已经把 provider 状态、execution profile 和 timing source 显式暴露出来，用于区分 demo/simulated 链路与真实 provider 调用链路。</w:t>
       </w:r>
     </w:p>
     <w:tbl>
@@ -3508,16 +5302,18 @@
         <w:tblLayout w:type="fixed"/>
       </w:tblPr>
       <w:tblGrid>
-        <w:gridCol w:w="1872"/>
-        <w:gridCol w:w="1872"/>
-        <w:gridCol w:w="1872"/>
-        <w:gridCol w:w="1872"/>
-        <w:gridCol w:w="1872"/>
+        <w:gridCol w:w="1337"/>
+        <w:gridCol w:w="1337"/>
+        <w:gridCol w:w="1337"/>
+        <w:gridCol w:w="1337"/>
+        <w:gridCol w:w="1337"/>
+        <w:gridCol w:w="1337"/>
+        <w:gridCol w:w="1337"/>
       </w:tblGrid>
       <w:tr>
         <w:tc>
           <w:tcPr>
-            <w:tcW w:type="dxa" w:w="1584"/>
+            <w:tcW w:type="dxa" w:w="1296"/>
             <w:vAlign w:val="center"/>
             <w:tcMar>
               <w:top w:w="80" w:type="dxa"/>
@@ -3545,7 +5341,7 @@
         </w:tc>
         <w:tc>
           <w:tcPr>
-            <w:tcW w:type="dxa" w:w="1152"/>
+            <w:tcW w:type="dxa" w:w="1008"/>
             <w:vAlign w:val="center"/>
             <w:tcMar>
               <w:top w:w="80" w:type="dxa"/>
@@ -3573,7 +5369,7 @@
         </w:tc>
         <w:tc>
           <w:tcPr>
-            <w:tcW w:type="dxa" w:w="2232"/>
+            <w:tcW w:type="dxa" w:w="1440"/>
             <w:vAlign w:val="center"/>
             <w:tcMar>
               <w:top w:w="80" w:type="dxa"/>
@@ -3595,13 +5391,13 @@
                 <w:color w:val="18202B"/>
                 <w:sz w:val="19"/>
               </w:rPr>
-              <w:t>首段音频均值(ms)</w:t>
-            </w:r>
-          </w:p>
-        </w:tc>
-        <w:tc>
-          <w:tcPr>
-            <w:tcW w:type="dxa" w:w="2088"/>
+              <w:t>执行形态</w:t>
+            </w:r>
+          </w:p>
+        </w:tc>
+        <w:tc>
+          <w:tcPr>
+            <w:tcW w:type="dxa" w:w="1440"/>
             <w:vAlign w:val="center"/>
             <w:tcMar>
               <w:top w:w="80" w:type="dxa"/>
@@ -3623,13 +5419,13 @@
                 <w:color w:val="18202B"/>
                 <w:sz w:val="19"/>
               </w:rPr>
-              <w:t>总耗时均值(ms)</w:t>
-            </w:r>
-          </w:p>
-        </w:tc>
-        <w:tc>
-          <w:tcPr>
-            <w:tcW w:type="dxa" w:w="2304"/>
+              <w:t>计时来源</w:t>
+            </w:r>
+          </w:p>
+        </w:tc>
+        <w:tc>
+          <w:tcPr>
+            <w:tcW w:type="dxa" w:w="1944"/>
             <w:vAlign w:val="center"/>
             <w:tcMar>
               <w:top w:w="80" w:type="dxa"/>
@@ -3651,6 +5447,62 @@
                 <w:color w:val="18202B"/>
                 <w:sz w:val="19"/>
               </w:rPr>
+              <w:t>首段音频均值(ms)</w:t>
+            </w:r>
+          </w:p>
+        </w:tc>
+        <w:tc>
+          <w:tcPr>
+            <w:tcW w:type="dxa" w:w="1872"/>
+            <w:vAlign w:val="center"/>
+            <w:tcMar>
+              <w:top w:w="80" w:type="dxa"/>
+              <w:start w:w="120" w:type="dxa"/>
+              <w:bottom w:w="80" w:type="dxa"/>
+              <w:end w:w="120" w:type="dxa"/>
+            </w:tcMar>
+            <w:shd w:fill="F2F4F7"/>
+          </w:tcPr>
+          <w:p>
+            <w:pPr>
+              <w:spacing w:after="0"/>
+            </w:pPr>
+            <w:r/>
+            <w:r>
+              <w:rPr>
+                <w:rFonts w:ascii="Calibri" w:hAnsi="Calibri" w:eastAsia="Microsoft YaHei"/>
+                <w:b/>
+                <w:color w:val="18202B"/>
+                <w:sz w:val="19"/>
+              </w:rPr>
+              <w:t>总耗时均值(ms)</w:t>
+            </w:r>
+          </w:p>
+        </w:tc>
+        <w:tc>
+          <w:tcPr>
+            <w:tcW w:type="dxa" w:w="1944"/>
+            <w:vAlign w:val="center"/>
+            <w:tcMar>
+              <w:top w:w="80" w:type="dxa"/>
+              <w:start w:w="120" w:type="dxa"/>
+              <w:bottom w:w="80" w:type="dxa"/>
+              <w:end w:w="120" w:type="dxa"/>
+            </w:tcMar>
+            <w:shd w:fill="F2F4F7"/>
+          </w:tcPr>
+          <w:p>
+            <w:pPr>
+              <w:spacing w:after="0"/>
+            </w:pPr>
+            <w:r/>
+            <w:r>
+              <w:rPr>
+                <w:rFonts w:ascii="Calibri" w:hAnsi="Calibri" w:eastAsia="Microsoft YaHei"/>
+                <w:b/>
+                <w:color w:val="18202B"/>
+                <w:sz w:val="19"/>
+              </w:rPr>
               <w:t>平均回答长度</w:t>
             </w:r>
           </w:p>
@@ -3659,7 +5511,7 @@
       <w:tr>
         <w:tc>
           <w:tcPr>
-            <w:tcW w:type="dxa" w:w="1872"/>
+            <w:tcW w:type="dxa" w:w="1337"/>
           </w:tcPr>
           <w:p>
             <w:pPr>
@@ -3678,7 +5530,7 @@
         </w:tc>
         <w:tc>
           <w:tcPr>
-            <w:tcW w:type="dxa" w:w="1872"/>
+            <w:tcW w:type="dxa" w:w="1337"/>
           </w:tcPr>
           <w:p>
             <w:pPr>
@@ -3697,7 +5549,7 @@
         </w:tc>
         <w:tc>
           <w:tcPr>
-            <w:tcW w:type="dxa" w:w="1872"/>
+            <w:tcW w:type="dxa" w:w="1337"/>
           </w:tcPr>
           <w:p>
             <w:pPr>
@@ -3710,13 +5562,13 @@
                 <w:b w:val="0"/>
                 <w:sz w:val="19"/>
               </w:rPr>
-              <w:t>3303</w:t>
-            </w:r>
-          </w:p>
-        </w:tc>
-        <w:tc>
-          <w:tcPr>
-            <w:tcW w:type="dxa" w:w="1872"/>
+              <w:t>demo</w:t>
+            </w:r>
+          </w:p>
+        </w:tc>
+        <w:tc>
+          <w:tcPr>
+            <w:tcW w:type="dxa" w:w="1337"/>
           </w:tcPr>
           <w:p>
             <w:pPr>
@@ -3729,13 +5581,51 @@
                 <w:b w:val="0"/>
                 <w:sz w:val="19"/>
               </w:rPr>
-              <w:t>3303</w:t>
-            </w:r>
-          </w:p>
-        </w:tc>
-        <w:tc>
-          <w:tcPr>
-            <w:tcW w:type="dxa" w:w="1872"/>
+              <w:t>simulated</w:t>
+            </w:r>
+          </w:p>
+        </w:tc>
+        <w:tc>
+          <w:tcPr>
+            <w:tcW w:type="dxa" w:w="1337"/>
+          </w:tcPr>
+          <w:p>
+            <w:pPr>
+              <w:spacing w:after="0"/>
+            </w:pPr>
+            <w:r/>
+            <w:r>
+              <w:rPr>
+                <w:rFonts w:ascii="Calibri" w:hAnsi="Calibri" w:eastAsia="Microsoft YaHei"/>
+                <w:b w:val="0"/>
+                <w:sz w:val="19"/>
+              </w:rPr>
+              <w:t>653</w:t>
+            </w:r>
+          </w:p>
+        </w:tc>
+        <w:tc>
+          <w:tcPr>
+            <w:tcW w:type="dxa" w:w="1337"/>
+          </w:tcPr>
+          <w:p>
+            <w:pPr>
+              <w:spacing w:after="0"/>
+            </w:pPr>
+            <w:r/>
+            <w:r>
+              <w:rPr>
+                <w:rFonts w:ascii="Calibri" w:hAnsi="Calibri" w:eastAsia="Microsoft YaHei"/>
+                <w:b w:val="0"/>
+                <w:sz w:val="19"/>
+              </w:rPr>
+              <w:t>653</w:t>
+            </w:r>
+          </w:p>
+        </w:tc>
+        <w:tc>
+          <w:tcPr>
+            <w:tcW w:type="dxa" w:w="1337"/>
           </w:tcPr>
           <w:p>
             <w:pPr>
@@ -3756,7 +5646,7 @@
       <w:tr>
         <w:tc>
           <w:tcPr>
-            <w:tcW w:type="dxa" w:w="1872"/>
+            <w:tcW w:type="dxa" w:w="1337"/>
           </w:tcPr>
           <w:p>
             <w:pPr>
@@ -3775,7 +5665,7 @@
         </w:tc>
         <w:tc>
           <w:tcPr>
-            <w:tcW w:type="dxa" w:w="1872"/>
+            <w:tcW w:type="dxa" w:w="1337"/>
           </w:tcPr>
           <w:p>
             <w:pPr>
@@ -3794,7 +5684,7 @@
         </w:tc>
         <w:tc>
           <w:tcPr>
-            <w:tcW w:type="dxa" w:w="1872"/>
+            <w:tcW w:type="dxa" w:w="1337"/>
           </w:tcPr>
           <w:p>
             <w:pPr>
@@ -3807,13 +5697,13 @@
                 <w:b w:val="0"/>
                 <w:sz w:val="19"/>
               </w:rPr>
-              <w:t>2030</w:t>
-            </w:r>
-          </w:p>
-        </w:tc>
-        <w:tc>
-          <w:tcPr>
-            <w:tcW w:type="dxa" w:w="1872"/>
+              <w:t>demo</w:t>
+            </w:r>
+          </w:p>
+        </w:tc>
+        <w:tc>
+          <w:tcPr>
+            <w:tcW w:type="dxa" w:w="1337"/>
           </w:tcPr>
           <w:p>
             <w:pPr>
@@ -3826,13 +5716,51 @@
                 <w:b w:val="0"/>
                 <w:sz w:val="19"/>
               </w:rPr>
-              <w:t>3463</w:t>
-            </w:r>
-          </w:p>
-        </w:tc>
-        <w:tc>
-          <w:tcPr>
-            <w:tcW w:type="dxa" w:w="1872"/>
+              <w:t>simulated</w:t>
+            </w:r>
+          </w:p>
+        </w:tc>
+        <w:tc>
+          <w:tcPr>
+            <w:tcW w:type="dxa" w:w="1337"/>
+          </w:tcPr>
+          <w:p>
+            <w:pPr>
+              <w:spacing w:after="0"/>
+            </w:pPr>
+            <w:r/>
+            <w:r>
+              <w:rPr>
+                <w:rFonts w:ascii="Calibri" w:hAnsi="Calibri" w:eastAsia="Microsoft YaHei"/>
+                <w:b w:val="0"/>
+                <w:sz w:val="19"/>
+              </w:rPr>
+              <w:t>1347</w:t>
+            </w:r>
+          </w:p>
+        </w:tc>
+        <w:tc>
+          <w:tcPr>
+            <w:tcW w:type="dxa" w:w="1337"/>
+          </w:tcPr>
+          <w:p>
+            <w:pPr>
+              <w:spacing w:after="0"/>
+            </w:pPr>
+            <w:r/>
+            <w:r>
+              <w:rPr>
+                <w:rFonts w:ascii="Calibri" w:hAnsi="Calibri" w:eastAsia="Microsoft YaHei"/>
+                <w:b w:val="0"/>
+                <w:sz w:val="19"/>
+              </w:rPr>
+              <w:t>1875</w:t>
+            </w:r>
+          </w:p>
+        </w:tc>
+        <w:tc>
+          <w:tcPr>
+            <w:tcW w:type="dxa" w:w="1337"/>
           </w:tcPr>
           <w:p>
             <w:pPr>
@@ -3853,7 +5781,7 @@
       <w:tr>
         <w:tc>
           <w:tcPr>
-            <w:tcW w:type="dxa" w:w="1872"/>
+            <w:tcW w:type="dxa" w:w="1337"/>
           </w:tcPr>
           <w:p>
             <w:pPr>
@@ -3872,7 +5800,7 @@
         </w:tc>
         <w:tc>
           <w:tcPr>
-            <w:tcW w:type="dxa" w:w="1872"/>
+            <w:tcW w:type="dxa" w:w="1337"/>
           </w:tcPr>
           <w:p>
             <w:pPr>
@@ -3891,7 +5819,7 @@
         </w:tc>
         <w:tc>
           <w:tcPr>
-            <w:tcW w:type="dxa" w:w="1872"/>
+            <w:tcW w:type="dxa" w:w="1337"/>
           </w:tcPr>
           <w:p>
             <w:pPr>
@@ -3904,13 +5832,13 @@
                 <w:b w:val="0"/>
                 <w:sz w:val="19"/>
               </w:rPr>
-              <w:t>2138</w:t>
-            </w:r>
-          </w:p>
-        </w:tc>
-        <w:tc>
-          <w:tcPr>
-            <w:tcW w:type="dxa" w:w="1872"/>
+              <w:t>demo</w:t>
+            </w:r>
+          </w:p>
+        </w:tc>
+        <w:tc>
+          <w:tcPr>
+            <w:tcW w:type="dxa" w:w="1337"/>
           </w:tcPr>
           <w:p>
             <w:pPr>
@@ -3923,13 +5851,51 @@
                 <w:b w:val="0"/>
                 <w:sz w:val="19"/>
               </w:rPr>
-              <w:t>4603</w:t>
-            </w:r>
-          </w:p>
-        </w:tc>
-        <w:tc>
-          <w:tcPr>
-            <w:tcW w:type="dxa" w:w="1872"/>
+              <w:t>simulated</w:t>
+            </w:r>
+          </w:p>
+        </w:tc>
+        <w:tc>
+          <w:tcPr>
+            <w:tcW w:type="dxa" w:w="1337"/>
+          </w:tcPr>
+          <w:p>
+            <w:pPr>
+              <w:spacing w:after="0"/>
+            </w:pPr>
+            <w:r/>
+            <w:r>
+              <w:rPr>
+                <w:rFonts w:ascii="Calibri" w:hAnsi="Calibri" w:eastAsia="Microsoft YaHei"/>
+                <w:b w:val="0"/>
+                <w:sz w:val="19"/>
+              </w:rPr>
+              <w:t>1451</w:t>
+            </w:r>
+          </w:p>
+        </w:tc>
+        <w:tc>
+          <w:tcPr>
+            <w:tcW w:type="dxa" w:w="1337"/>
+          </w:tcPr>
+          <w:p>
+            <w:pPr>
+              <w:spacing w:after="0"/>
+            </w:pPr>
+            <w:r/>
+            <w:r>
+              <w:rPr>
+                <w:rFonts w:ascii="Calibri" w:hAnsi="Calibri" w:eastAsia="Microsoft YaHei"/>
+                <w:b w:val="0"/>
+                <w:sz w:val="19"/>
+              </w:rPr>
+              <w:t>2411</w:t>
+            </w:r>
+          </w:p>
+        </w:tc>
+        <w:tc>
+          <w:tcPr>
+            <w:tcW w:type="dxa" w:w="1337"/>
           </w:tcPr>
           <w:p>
             <w:pPr>
@@ -5214,6 +7180,124 @@
                 <w:b w:val="0"/>
                 <w:sz w:val="19"/>
               </w:rPr>
+              <w:t>多轮评测</w:t>
+            </w:r>
+          </w:p>
+        </w:tc>
+        <w:tc>
+          <w:tcPr>
+            <w:tcW w:type="dxa" w:w="3120"/>
+          </w:tcPr>
+          <w:p>
+            <w:pPr>
+              <w:spacing w:after="0"/>
+            </w:pPr>
+            <w:r/>
+            <w:r>
+              <w:rPr>
+                <w:rFonts w:ascii="Calibri" w:hAnsi="Calibri" w:eastAsia="Microsoft YaHei"/>
+                <w:b w:val="0"/>
+                <w:sz w:val="19"/>
+              </w:rPr>
+              <w:t>python scripts\evaluate_multiturn.py --fail-on-threshold</w:t>
+            </w:r>
+          </w:p>
+        </w:tc>
+        <w:tc>
+          <w:tcPr>
+            <w:tcW w:type="dxa" w:w="3120"/>
+          </w:tcPr>
+          <w:p>
+            <w:pPr>
+              <w:spacing w:after="0"/>
+            </w:pPr>
+            <w:r/>
+            <w:r>
+              <w:rPr>
+                <w:rFonts w:ascii="Calibri" w:hAnsi="Calibri" w:eastAsia="Microsoft YaHei"/>
+                <w:b w:val="0"/>
+                <w:sz w:val="19"/>
+              </w:rPr>
+              <w:t>多轮 gate 与 follow-up grounding 达标</w:t>
+            </w:r>
+          </w:p>
+        </w:tc>
+      </w:tr>
+      <w:tr>
+        <w:tc>
+          <w:tcPr>
+            <w:tcW w:type="dxa" w:w="3120"/>
+          </w:tcPr>
+          <w:p>
+            <w:pPr>
+              <w:spacing w:after="0"/>
+            </w:pPr>
+            <w:r/>
+            <w:r>
+              <w:rPr>
+                <w:rFonts w:ascii="Calibri" w:hAnsi="Calibri" w:eastAsia="Microsoft YaHei"/>
+                <w:b w:val="0"/>
+                <w:sz w:val="19"/>
+              </w:rPr>
+              <w:t>真实语音链路</w:t>
+            </w:r>
+          </w:p>
+        </w:tc>
+        <w:tc>
+          <w:tcPr>
+            <w:tcW w:type="dxa" w:w="3120"/>
+          </w:tcPr>
+          <w:p>
+            <w:pPr>
+              <w:spacing w:after="0"/>
+            </w:pPr>
+            <w:r/>
+            <w:r>
+              <w:rPr>
+                <w:rFonts w:ascii="Calibri" w:hAnsi="Calibri" w:eastAsia="Microsoft YaHei"/>
+                <w:b w:val="0"/>
+                <w:sz w:val="19"/>
+              </w:rPr>
+              <w:t>python scripts\check_real_service_chain.py --sample-id A001</w:t>
+            </w:r>
+          </w:p>
+        </w:tc>
+        <w:tc>
+          <w:tcPr>
+            <w:tcW w:type="dxa" w:w="3120"/>
+          </w:tcPr>
+          <w:p>
+            <w:pPr>
+              <w:spacing w:after="0"/>
+            </w:pPr>
+            <w:r/>
+            <w:r>
+              <w:rPr>
+                <w:rFonts w:ascii="Calibri" w:hAnsi="Calibri" w:eastAsia="Microsoft YaHei"/>
+                <w:b w:val="0"/>
+                <w:sz w:val="19"/>
+              </w:rPr>
+              <w:t>ASR/TTS health 正常且 pipeline provider 变为 http_json</w:t>
+            </w:r>
+          </w:p>
+        </w:tc>
+      </w:tr>
+      <w:tr>
+        <w:tc>
+          <w:tcPr>
+            <w:tcW w:type="dxa" w:w="3120"/>
+          </w:tcPr>
+          <w:p>
+            <w:pPr>
+              <w:spacing w:after="0"/>
+            </w:pPr>
+            <w:r/>
+            <w:r>
+              <w:rPr>
+                <w:rFonts w:ascii="Calibri" w:hAnsi="Calibri" w:eastAsia="Microsoft YaHei"/>
+                <w:b w:val="0"/>
+                <w:sz w:val="19"/>
+              </w:rPr>
               <w:t>远端训练</w:t>
             </w:r>
           </w:p>
@@ -5332,7 +7416,7 @@
           <w:color w:val="18202B"/>
           <w:sz w:val="22"/>
         </w:rPr>
-        <w:t>核心证据位于 results/remote_autodl_20260608_final，包括训练日志、评测结果、adapter、artifact manifest 和 REMOTE_RUN_SUMMARY.md。</w:t>
+        <w:t>核心远端证据位于 results/remote_autodl_20260608_final；真实语音链路证据位于 results\remote_real_chain_20260612_chattts_48359。前者证明微调实验，后者证明真实 ASR/TTS 服务联调。</w:t>
       </w:r>
     </w:p>
     <w:p>
@@ -5400,7 +7484,22 @@
           <w:color w:val="18202B"/>
           <w:sz w:val="21"/>
         </w:rPr>
-        <w:t>TTS 当前以句级播放和 mock latency 展示为主，后续可接入 CosyVoice 做真实语音播报。</w:t>
+        <w:t>多轮 benchmark 已建立，但仍以结构化追问为主，下一阶段应加入更自由的口语化省略问句和 ASR 错字变体。</w:t>
+      </w:r>
+    </w:p>
+    <w:p>
+      <w:pPr>
+        <w:pStyle w:val="ListBullet"/>
+        <w:spacing w:after="80" w:line="280" w:lineRule="auto"/>
+        <w:ind w:left="720" w:hanging="360"/>
+      </w:pPr>
+      <w:r>
+        <w:rPr>
+          <w:rFonts w:ascii="Calibri" w:hAnsi="Calibri" w:eastAsia="Microsoft YaHei"/>
+          <w:color w:val="18202B"/>
+          <w:sz w:val="21"/>
+        </w:rPr>
+        <w:t>远端真实 ChatTTS 链路已经打通，但当前平均 TTS 首音延迟仍在十秒级，后续应优先做流式返回、模型替换或推理缓存优化。</w:t>
       </w:r>
     </w:p>
     <w:p>
@@ -5752,7 +7851,7 @@
                 <w:b w:val="0"/>
                 <w:sz w:val="19"/>
               </w:rPr>
-              <w:t>安全评测集</w:t>
+              <w:t>多轮评测集</w:t>
             </w:r>
           </w:p>
         </w:tc>
@@ -5771,7 +7870,7 @@
                 <w:b w:val="0"/>
                 <w:sz w:val="19"/>
               </w:rPr>
-              <w:t>data/tests/safety_eval.csv</w:t>
+              <w:t>data/tests/multiturn_eval.jsonl</w:t>
             </w:r>
           </w:p>
         </w:tc>
@@ -5792,7 +7891,7 @@
                 <w:b w:val="0"/>
                 <w:sz w:val="19"/>
               </w:rPr>
-              <w:t>安全评测结果</w:t>
+              <w:t>安全评测集</w:t>
             </w:r>
           </w:p>
         </w:tc>
@@ -5811,7 +7910,7 @@
                 <w:b w:val="0"/>
                 <w:sz w:val="19"/>
               </w:rPr>
-              <w:t>results/safety_gate_eval.csv / safety_gate_eval_summary.json / safety_gate_eval_report.md</w:t>
+              <w:t>data/tests/safety_eval.csv</w:t>
             </w:r>
           </w:p>
         </w:tc>
@@ -5832,7 +7931,7 @@
                 <w:b w:val="0"/>
                 <w:sz w:val="19"/>
               </w:rPr>
-              <w:t>录音任务</w:t>
+              <w:t>安全评测结果</w:t>
             </w:r>
           </w:p>
         </w:tc>
@@ -5851,7 +7950,7 @@
                 <w:b w:val="0"/>
                 <w:sz w:val="19"/>
               </w:rPr>
-              <w:t>data/audio/audio_manifest.csv / deliverables/ShipVoice_Audio_Recording_Pack.html</w:t>
+              <w:t>results/safety_gate_eval.csv / safety_gate_eval_summary.json / safety_gate_eval_report.md</w:t>
             </w:r>
           </w:p>
         </w:tc>
@@ -5872,6 +7971,86 @@
                 <w:b w:val="0"/>
                 <w:sz w:val="19"/>
               </w:rPr>
+              <w:t>多轮评测结果</w:t>
+            </w:r>
+          </w:p>
+        </w:tc>
+        <w:tc>
+          <w:tcPr>
+            <w:tcW w:type="dxa" w:w="4680"/>
+          </w:tcPr>
+          <w:p>
+            <w:pPr>
+              <w:spacing w:after="0"/>
+            </w:pPr>
+            <w:r/>
+            <w:r>
+              <w:rPr>
+                <w:rFonts w:ascii="Calibri" w:hAnsi="Calibri" w:eastAsia="Microsoft YaHei"/>
+                <w:b w:val="0"/>
+                <w:sz w:val="19"/>
+              </w:rPr>
+              <w:t>results/multiturn_eval.csv / multiturn_eval_summary.json / multiturn_eval_report.md</w:t>
+            </w:r>
+          </w:p>
+        </w:tc>
+      </w:tr>
+      <w:tr>
+        <w:tc>
+          <w:tcPr>
+            <w:tcW w:type="dxa" w:w="4680"/>
+          </w:tcPr>
+          <w:p>
+            <w:pPr>
+              <w:spacing w:after="0"/>
+            </w:pPr>
+            <w:r/>
+            <w:r>
+              <w:rPr>
+                <w:rFonts w:ascii="Calibri" w:hAnsi="Calibri" w:eastAsia="Microsoft YaHei"/>
+                <w:b w:val="0"/>
+                <w:sz w:val="19"/>
+              </w:rPr>
+              <w:t>录音任务</w:t>
+            </w:r>
+          </w:p>
+        </w:tc>
+        <w:tc>
+          <w:tcPr>
+            <w:tcW w:type="dxa" w:w="4680"/>
+          </w:tcPr>
+          <w:p>
+            <w:pPr>
+              <w:spacing w:after="0"/>
+            </w:pPr>
+            <w:r/>
+            <w:r>
+              <w:rPr>
+                <w:rFonts w:ascii="Calibri" w:hAnsi="Calibri" w:eastAsia="Microsoft YaHei"/>
+                <w:b w:val="0"/>
+                <w:sz w:val="19"/>
+              </w:rPr>
+              <w:t>data/audio/audio_manifest.csv / deliverables/ShipVoice_Audio_Recording_Pack.html</w:t>
+            </w:r>
+          </w:p>
+        </w:tc>
+      </w:tr>
+      <w:tr>
+        <w:tc>
+          <w:tcPr>
+            <w:tcW w:type="dxa" w:w="4680"/>
+          </w:tcPr>
+          <w:p>
+            <w:pPr>
+              <w:spacing w:after="0"/>
+            </w:pPr>
+            <w:r/>
+            <w:r>
+              <w:rPr>
+                <w:rFonts w:ascii="Calibri" w:hAnsi="Calibri" w:eastAsia="Microsoft YaHei"/>
+                <w:b w:val="0"/>
+                <w:sz w:val="19"/>
+              </w:rPr>
               <w:t>ASR 评测结果</w:t>
             </w:r>
           </w:p>
@@ -5892,6 +8071,46 @@
                 <w:sz w:val="19"/>
               </w:rPr>
               <w:t>results/asr_eval.csv / asr_eval_summary.json / asr_eval_report.md / asr_eval_raw_summary.json / asr_postprocess_summary.json</w:t>
+            </w:r>
+          </w:p>
+        </w:tc>
+      </w:tr>
+      <w:tr>
+        <w:tc>
+          <w:tcPr>
+            <w:tcW w:type="dxa" w:w="4680"/>
+          </w:tcPr>
+          <w:p>
+            <w:pPr>
+              <w:spacing w:after="0"/>
+            </w:pPr>
+            <w:r/>
+            <w:r>
+              <w:rPr>
+                <w:rFonts w:ascii="Calibri" w:hAnsi="Calibri" w:eastAsia="Microsoft YaHei"/>
+                <w:b w:val="0"/>
+                <w:sz w:val="19"/>
+              </w:rPr>
+              <w:t>真实语音链路结果</w:t>
+            </w:r>
+          </w:p>
+        </w:tc>
+        <w:tc>
+          <w:tcPr>
+            <w:tcW w:type="dxa" w:w="4680"/>
+          </w:tcPr>
+          <w:p>
+            <w:pPr>
+              <w:spacing w:after="0"/>
+            </w:pPr>
+            <w:r/>
+            <w:r>
+              <w:rPr>
+                <w:rFonts w:ascii="Calibri" w:hAnsi="Calibri" w:eastAsia="Microsoft YaHei"/>
+                <w:b w:val="0"/>
+                <w:sz w:val="19"/>
+              </w:rPr>
+              <w:t>results/remote_real_chain_20260612_chattts_48359</w:t>
             </w:r>
           </w:p>
         </w:tc>

</xml_diff>

<commit_message>
Finalize ShipVoice coursework deliverables
</commit_message>
<xml_diff>
--- a/deliverables/ShipVoice_船厂安全实时语音问答助手_项目报告_比赛增强版.docx
+++ b/deliverables/ShipVoice_船厂安全实时语音问答助手_项目报告_比赛增强版.docx
@@ -2628,7 +2628,7 @@
                 <w:b w:val="0"/>
                 <w:sz w:val="19"/>
               </w:rPr>
-              <w:t>4082 ms</w:t>
+              <w:t>2173 ms</w:t>
             </w:r>
           </w:p>
         </w:tc>
@@ -4145,7 +4145,7 @@
                 <w:b w:val="0"/>
                 <w:sz w:val="19"/>
               </w:rPr>
-              <w:t>2936</w:t>
+              <w:t>2920</w:t>
             </w:r>
           </w:p>
         </w:tc>

</xml_diff>

<commit_message>
Integrate expanded LoRA results into deliverables
</commit_message>
<xml_diff>
--- a/deliverables/ShipVoice_船厂安全实时语音问答助手_项目报告_比赛增强版.docx
+++ b/deliverables/ShipVoice_船厂安全实时语音问答助手_项目报告_比赛增强版.docx
@@ -565,7 +565,7 @@
                 <w:b w:val="0"/>
                 <w:sz w:val="19"/>
               </w:rPr>
-              <w:t>63 条 SFT seed，32 条安全门控 seed</w:t>
+              <w:t>1000 条扩展 SFT train，150 条 holdout，32 条安全门控 seed</w:t>
             </w:r>
           </w:p>
         </w:tc>
@@ -765,7 +765,7 @@
                 <w:b w:val="0"/>
                 <w:sz w:val="19"/>
               </w:rPr>
-              <w:t>Base eval 8 条，LoRA eval 8 条，adapter 约 154.1 MB</w:t>
+              <w:t>Base eval 150 条，LoRA eval 150 条，adapter 约 154.1 MB</w:t>
             </w:r>
           </w:p>
         </w:tc>
@@ -4145,7 +4145,7 @@
                 <w:b w:val="0"/>
                 <w:sz w:val="19"/>
               </w:rPr>
-              <w:t>2920</w:t>
+              <w:t>2935</w:t>
             </w:r>
           </w:p>
         </w:tc>
@@ -6269,7 +6269,7 @@
                 <w:b w:val="0"/>
                 <w:sz w:val="19"/>
               </w:rPr>
-              <w:t>63 条 ShipVoice SFT seed</w:t>
+              <w:t>1000 条 ShipVoice 扩展 SFT train，150 条 holdout</w:t>
             </w:r>
           </w:p>
         </w:tc>
@@ -6309,7 +6309,7 @@
                 <w:b w:val="0"/>
                 <w:sz w:val="19"/>
               </w:rPr>
-              <w:t>2 epochs，14 optimizer steps</w:t>
+              <w:t>2 epochs，250 optimizer steps</w:t>
             </w:r>
           </w:p>
         </w:tc>
@@ -6349,7 +6349,7 @@
                 <w:b w:val="0"/>
                 <w:sz w:val="19"/>
               </w:rPr>
-              <w:t>train_loss = 1.7777，train_runtime = 61.6765s</w:t>
+              <w:t>train_loss = 0.1677，train_runtime = 724s</w:t>
             </w:r>
           </w:p>
         </w:tc>
@@ -6563,7 +6563,7 @@
                 <w:b w:val="0"/>
                 <w:sz w:val="19"/>
               </w:rPr>
-              <w:t>8</w:t>
+              <w:t>150</w:t>
             </w:r>
           </w:p>
         </w:tc>
@@ -6582,7 +6582,7 @@
                 <w:b w:val="0"/>
                 <w:sz w:val="19"/>
               </w:rPr>
-              <w:t>196.1 字符</w:t>
+              <w:t>211.2 字符</w:t>
             </w:r>
           </w:p>
         </w:tc>
@@ -6601,7 +6601,7 @@
                 <w:b w:val="0"/>
                 <w:sz w:val="19"/>
               </w:rPr>
-              <w:t>off-domain 拒答更稳，重复更少</w:t>
+              <w:t>安全类拒答 12，off-domain 拒答 1</w:t>
             </w:r>
           </w:p>
         </w:tc>
@@ -6641,7 +6641,7 @@
                 <w:b w:val="0"/>
                 <w:sz w:val="19"/>
               </w:rPr>
-              <w:t>8</w:t>
+              <w:t>150</w:t>
             </w:r>
           </w:p>
         </w:tc>
@@ -6660,7 +6660,7 @@
                 <w:b w:val="0"/>
                 <w:sz w:val="19"/>
               </w:rPr>
-              <w:t>143.8 字符</w:t>
+              <w:t>161.2 字符</w:t>
             </w:r>
           </w:p>
         </w:tc>
@@ -6679,7 +6679,7 @@
                 <w:b w:val="0"/>
                 <w:sz w:val="19"/>
               </w:rPr>
-              <w:t>回答更短、更符合船厂安全模板，但有轻微模板化过拟合</w:t>
+              <w:t>安全类拒答 38，off-domain 拒答 10，领域边界更明确</w:t>
             </w:r>
           </w:p>
         </w:tc>
@@ -7416,7 +7416,7 @@
           <w:color w:val="18202B"/>
           <w:sz w:val="22"/>
         </w:rPr>
-        <w:t>核心远端证据位于 results/remote_autodl_20260608_final；真实语音链路证据位于 results\remote_real_chain_20260612_chattts_48359。前者证明微调实验，后者证明真实 ASR/TTS 服务联调。</w:t>
+        <w:t>核心远端证据位于 results/remote_autodl_20260621_expanded；真实语音链路证据位于 results\remote_real_chain_20260612_chattts_48359。前者证明扩展微调实验，后者证明真实 ASR/TTS 服务联调。</w:t>
       </w:r>
     </w:p>
     <w:p>
@@ -7439,7 +7439,7 @@
           <w:color w:val="18202B"/>
           <w:sz w:val="21"/>
         </w:rPr>
-        <w:t>SFT seed 数据规模仍较小，LoRA 主要证明领域适配可行性，不应夸大为生产级模型。</w:t>
+        <w:t>扩展 SFT 已达到 1000 条训练样本和 150 条 holdout，但仍主要由课程知识库、真实录音任务和规则模板扩展得到，不能替代真实船厂专家语料。</w:t>
       </w:r>
     </w:p>
     <w:p>
@@ -8190,7 +8190,7 @@
                 <w:b w:val="0"/>
                 <w:sz w:val="19"/>
               </w:rPr>
-              <w:t>data/training/sft_seed.jsonl</w:t>
+              <w:t>data/training/sft_seed.jsonl / data/training/shipvoice_sft_train_expanded.jsonl / data/training/shipvoice_sft_eval_holdout.jsonl</w:t>
             </w:r>
           </w:p>
         </w:tc>
@@ -8270,7 +8270,7 @@
                 <w:b w:val="0"/>
                 <w:sz w:val="19"/>
               </w:rPr>
-              <w:t>results/remote_autodl_20260608_final</w:t>
+              <w:t>results/remote_autodl_20260621_expanded</w:t>
             </w:r>
           </w:p>
         </w:tc>

</xml_diff>

<commit_message>
ShipVoice real LoRA validation stack
</commit_message>
<xml_diff>
--- a/deliverables/ShipVoice_船厂安全实时语音问答助手_项目报告_比赛增强版.docx
+++ b/deliverables/ShipVoice_船厂安全实时语音问答助手_项目报告_比赛增强版.docx
@@ -685,7 +685,7 @@
                 <w:b w:val="0"/>
                 <w:sz w:val="19"/>
               </w:rPr>
-              <w:t>远端已验证 3 条真实样本，ASR=funasr_asr，TTS=chattts，平均首音 15239 ms</w:t>
+              <w:t>远端已验证 0 条真实样本，ASR=--，TTS=--，平均首音 -- ms</w:t>
             </w:r>
           </w:p>
         </w:tc>
@@ -845,7 +845,7 @@
                 <w:b w:val="0"/>
                 <w:sz w:val="19"/>
               </w:rPr>
-              <w:t>本地 Web 操作台 + mock fallback，无 GPU 时仍可演示完整链路</w:t>
+              <w:t>本地 Web 操作台 + 真实 provider；无真实服务时请求失败并记录错误</w:t>
             </w:r>
           </w:p>
         </w:tc>
@@ -998,7 +998,7 @@
                 <w:b w:val="0"/>
                 <w:sz w:val="19"/>
               </w:rPr>
-              <w:t>ASR/transcript 层、LLM/RAG 回答层、TTS/playback-oriented 输出层</w:t>
+              <w:t>ASR、LLM/RAG、TTS 三段真实 provider 链路</w:t>
             </w:r>
           </w:p>
         </w:tc>
@@ -1017,7 +1017,7 @@
                 <w:b w:val="0"/>
                 <w:sz w:val="19"/>
               </w:rPr>
-              <w:t>保留 mock fallback，答辩现场稳定</w:t>
+              <w:t>fail-closed 策略保证不生成替代结果</w:t>
             </w:r>
           </w:p>
         </w:tc>
@@ -1438,7 +1438,7 @@
                 <w:b w:val="0"/>
                 <w:sz w:val="19"/>
               </w:rPr>
-              <w:t>接收真实语音或文字输入；无真实 ASR 时使用 transcript fallback 保持演示稳定</w:t>
+              <w:t>接收真实语音或文字输入；音频输入必须经真实 ASR 转写</w:t>
             </w:r>
           </w:p>
         </w:tc>
@@ -2628,7 +2628,7 @@
                 <w:b w:val="0"/>
                 <w:sz w:val="19"/>
               </w:rPr>
-              <w:t>2173 ms</w:t>
+              <w:t>0 ms</w:t>
             </w:r>
           </w:p>
         </w:tc>
@@ -2647,7 +2647,7 @@
                 <w:b w:val="0"/>
                 <w:sz w:val="19"/>
               </w:rPr>
-              <w:t>包含模拟 ASR、门控、RAG、LLM 和 TTS 的端到端耗时</w:t>
+              <w:t>包含门控、RAG、LLM 和 TTS 的端到端耗时</w:t>
             </w:r>
           </w:p>
         </w:tc>
@@ -4027,7 +4027,7 @@
                 <w:b w:val="0"/>
                 <w:sz w:val="19"/>
               </w:rPr>
-              <w:t>97.2%</w:t>
+              <w:t>78.2%</w:t>
             </w:r>
           </w:p>
         </w:tc>
@@ -4145,7 +4145,7 @@
                 <w:b w:val="0"/>
                 <w:sz w:val="19"/>
               </w:rPr>
-              <w:t>2935</w:t>
+              <w:t>9318</w:t>
             </w:r>
           </w:p>
         </w:tc>
@@ -4252,1025 +4252,8 @@
           <w:color w:val="18202B"/>
           <w:sz w:val="22"/>
         </w:rPr>
-        <w:t>为证明系统不是只有前端页面，本项目额外完成了一轮远端真实语音链路联调：在 RTX 4090 上启动 FunASR / SenseVoice ASR 服务与 ChatTTS 中文 TTS 服务，通过 HTTP provider 接回本地 ShipVoice pipeline，形成真实语音输入和真实语音回传。</w:t>
+        <w:t>当前仓库尚未检测到远端真实语音链路验证结果。完成 GPU 联调后，应补充 ASR/TTS 服务健康检查、端到端样本结果和延迟统计。</w:t>
       </w:r>
-    </w:p>
-    <w:p>
-      <w:pPr>
-        <w:spacing w:after="120" w:line="264" w:lineRule="auto"/>
-      </w:pPr>
-      <w:r>
-        <w:rPr>
-          <w:rFonts w:ascii="Calibri" w:hAnsi="Calibri" w:eastAsia="Microsoft YaHei"/>
-          <w:color w:val="18202B"/>
-          <w:sz w:val="22"/>
-        </w:rPr>
-        <w:t>本轮验证重点不是追求最低时延，而是留下可审计的工程证据。当前 provider status 为 hybrid：真实音频 I/O 已经在线，问答生成仍由受控 mock_llm 层承接检索证据，因此它证明了真实服务集成能力，也明确暴露了后续企业级改造的瓶颈位置。</w:t>
-      </w:r>
-    </w:p>
-    <w:tbl>
-      <w:tblPr>
-        <w:tblStyle w:val="TableGrid"/>
-        <w:tblW w:type="auto" w:w="0"/>
-        <w:jc w:val="center"/>
-        <w:tblLook w:firstColumn="1" w:firstRow="1" w:lastColumn="0" w:lastRow="0" w:noHBand="0" w:noVBand="1" w:val="04A0"/>
-        <w:tblLayout w:type="fixed"/>
-      </w:tblPr>
-      <w:tblGrid>
-        <w:gridCol w:w="3120"/>
-        <w:gridCol w:w="3120"/>
-        <w:gridCol w:w="3120"/>
-      </w:tblGrid>
-      <w:tr>
-        <w:tc>
-          <w:tcPr>
-            <w:tcW w:type="dxa" w:w="2232"/>
-            <w:vAlign w:val="center"/>
-            <w:tcMar>
-              <w:top w:w="80" w:type="dxa"/>
-              <w:start w:w="120" w:type="dxa"/>
-              <w:bottom w:w="80" w:type="dxa"/>
-              <w:end w:w="120" w:type="dxa"/>
-            </w:tcMar>
-            <w:shd w:fill="F2F4F7"/>
-          </w:tcPr>
-          <w:p>
-            <w:pPr>
-              <w:spacing w:after="0"/>
-            </w:pPr>
-            <w:r/>
-            <w:r>
-              <w:rPr>
-                <w:rFonts w:ascii="Calibri" w:hAnsi="Calibri" w:eastAsia="Microsoft YaHei"/>
-                <w:b/>
-                <w:color w:val="18202B"/>
-                <w:sz w:val="19"/>
-              </w:rPr>
-              <w:t>指标</w:t>
-            </w:r>
-          </w:p>
-        </w:tc>
-        <w:tc>
-          <w:tcPr>
-            <w:tcW w:type="dxa" w:w="1944"/>
-            <w:vAlign w:val="center"/>
-            <w:tcMar>
-              <w:top w:w="80" w:type="dxa"/>
-              <w:start w:w="120" w:type="dxa"/>
-              <w:bottom w:w="80" w:type="dxa"/>
-              <w:end w:w="120" w:type="dxa"/>
-            </w:tcMar>
-            <w:shd w:fill="F2F4F7"/>
-          </w:tcPr>
-          <w:p>
-            <w:pPr>
-              <w:spacing w:after="0"/>
-            </w:pPr>
-            <w:r/>
-            <w:r>
-              <w:rPr>
-                <w:rFonts w:ascii="Calibri" w:hAnsi="Calibri" w:eastAsia="Microsoft YaHei"/>
-                <w:b/>
-                <w:color w:val="18202B"/>
-                <w:sz w:val="19"/>
-              </w:rPr>
-              <w:t>结果</w:t>
-            </w:r>
-          </w:p>
-        </w:tc>
-        <w:tc>
-          <w:tcPr>
-            <w:tcW w:type="dxa" w:w="4752"/>
-            <w:vAlign w:val="center"/>
-            <w:tcMar>
-              <w:top w:w="80" w:type="dxa"/>
-              <w:start w:w="120" w:type="dxa"/>
-              <w:bottom w:w="80" w:type="dxa"/>
-              <w:end w:w="120" w:type="dxa"/>
-            </w:tcMar>
-            <w:shd w:fill="F2F4F7"/>
-          </w:tcPr>
-          <w:p>
-            <w:pPr>
-              <w:spacing w:after="0"/>
-            </w:pPr>
-            <w:r/>
-            <w:r>
-              <w:rPr>
-                <w:rFonts w:ascii="Calibri" w:hAnsi="Calibri" w:eastAsia="Microsoft YaHei"/>
-                <w:b/>
-                <w:color w:val="18202B"/>
-                <w:sz w:val="19"/>
-              </w:rPr>
-              <w:t>说明</w:t>
-            </w:r>
-          </w:p>
-        </w:tc>
-      </w:tr>
-      <w:tr>
-        <w:tc>
-          <w:tcPr>
-            <w:tcW w:type="dxa" w:w="3120"/>
-          </w:tcPr>
-          <w:p>
-            <w:pPr>
-              <w:spacing w:after="0"/>
-            </w:pPr>
-            <w:r/>
-            <w:r>
-              <w:rPr>
-                <w:rFonts w:ascii="Calibri" w:hAnsi="Calibri" w:eastAsia="Microsoft YaHei"/>
-                <w:b w:val="0"/>
-                <w:sz w:val="19"/>
-              </w:rPr>
-              <w:t>验证样本数</w:t>
-            </w:r>
-          </w:p>
-        </w:tc>
-        <w:tc>
-          <w:tcPr>
-            <w:tcW w:type="dxa" w:w="3120"/>
-          </w:tcPr>
-          <w:p>
-            <w:pPr>
-              <w:spacing w:after="0"/>
-            </w:pPr>
-            <w:r/>
-            <w:r>
-              <w:rPr>
-                <w:rFonts w:ascii="Calibri" w:hAnsi="Calibri" w:eastAsia="Microsoft YaHei"/>
-                <w:b w:val="0"/>
-                <w:sz w:val="19"/>
-              </w:rPr>
-              <w:t>3</w:t>
-            </w:r>
-          </w:p>
-        </w:tc>
-        <w:tc>
-          <w:tcPr>
-            <w:tcW w:type="dxa" w:w="3120"/>
-          </w:tcPr>
-          <w:p>
-            <w:pPr>
-              <w:spacing w:after="0"/>
-            </w:pPr>
-            <w:r/>
-            <w:r>
-              <w:rPr>
-                <w:rFonts w:ascii="Calibri" w:hAnsi="Calibri" w:eastAsia="Microsoft YaHei"/>
-                <w:b w:val="0"/>
-                <w:sz w:val="19"/>
-              </w:rPr>
-              <w:t>A001-A003 三条真实录音端到端跑通</w:t>
-            </w:r>
-          </w:p>
-        </w:tc>
-      </w:tr>
-      <w:tr>
-        <w:tc>
-          <w:tcPr>
-            <w:tcW w:type="dxa" w:w="3120"/>
-          </w:tcPr>
-          <w:p>
-            <w:pPr>
-              <w:spacing w:after="0"/>
-            </w:pPr>
-            <w:r/>
-            <w:r>
-              <w:rPr>
-                <w:rFonts w:ascii="Calibri" w:hAnsi="Calibri" w:eastAsia="Microsoft YaHei"/>
-                <w:b w:val="0"/>
-                <w:sz w:val="19"/>
-              </w:rPr>
-              <w:t>ASR 服务</w:t>
-            </w:r>
-          </w:p>
-        </w:tc>
-        <w:tc>
-          <w:tcPr>
-            <w:tcW w:type="dxa" w:w="3120"/>
-          </w:tcPr>
-          <w:p>
-            <w:pPr>
-              <w:spacing w:after="0"/>
-            </w:pPr>
-            <w:r/>
-            <w:r>
-              <w:rPr>
-                <w:rFonts w:ascii="Calibri" w:hAnsi="Calibri" w:eastAsia="Microsoft YaHei"/>
-                <w:b w:val="0"/>
-                <w:sz w:val="19"/>
-              </w:rPr>
-              <w:t>funasr_asr</w:t>
-            </w:r>
-          </w:p>
-        </w:tc>
-        <w:tc>
-          <w:tcPr>
-            <w:tcW w:type="dxa" w:w="3120"/>
-          </w:tcPr>
-          <w:p>
-            <w:pPr>
-              <w:spacing w:after="0"/>
-            </w:pPr>
-            <w:r/>
-            <w:r>
-              <w:rPr>
-                <w:rFonts w:ascii="Calibri" w:hAnsi="Calibri" w:eastAsia="Microsoft YaHei"/>
-                <w:b w:val="0"/>
-                <w:sz w:val="19"/>
-              </w:rPr>
-              <w:t>iic/SenseVoiceSmall</w:t>
-            </w:r>
-          </w:p>
-        </w:tc>
-      </w:tr>
-      <w:tr>
-        <w:tc>
-          <w:tcPr>
-            <w:tcW w:type="dxa" w:w="3120"/>
-          </w:tcPr>
-          <w:p>
-            <w:pPr>
-              <w:spacing w:after="0"/>
-            </w:pPr>
-            <w:r/>
-            <w:r>
-              <w:rPr>
-                <w:rFonts w:ascii="Calibri" w:hAnsi="Calibri" w:eastAsia="Microsoft YaHei"/>
-                <w:b w:val="0"/>
-                <w:sz w:val="19"/>
-              </w:rPr>
-              <w:t>TTS 服务</w:t>
-            </w:r>
-          </w:p>
-        </w:tc>
-        <w:tc>
-          <w:tcPr>
-            <w:tcW w:type="dxa" w:w="3120"/>
-          </w:tcPr>
-          <w:p>
-            <w:pPr>
-              <w:spacing w:after="0"/>
-            </w:pPr>
-            <w:r/>
-            <w:r>
-              <w:rPr>
-                <w:rFonts w:ascii="Calibri" w:hAnsi="Calibri" w:eastAsia="Microsoft YaHei"/>
-                <w:b w:val="0"/>
-                <w:sz w:val="19"/>
-              </w:rPr>
-              <w:t>chattts</w:t>
-            </w:r>
-          </w:p>
-        </w:tc>
-        <w:tc>
-          <w:tcPr>
-            <w:tcW w:type="dxa" w:w="3120"/>
-          </w:tcPr>
-          <w:p>
-            <w:pPr>
-              <w:spacing w:after="0"/>
-            </w:pPr>
-            <w:r/>
-            <w:r>
-              <w:rPr>
-                <w:rFonts w:ascii="Calibri" w:hAnsi="Calibri" w:eastAsia="Microsoft YaHei"/>
-                <w:b w:val="0"/>
-                <w:sz w:val="19"/>
-              </w:rPr>
-              <w:t>provider=http_json_tts</w:t>
-            </w:r>
-          </w:p>
-        </w:tc>
-      </w:tr>
-      <w:tr>
-        <w:tc>
-          <w:tcPr>
-            <w:tcW w:type="dxa" w:w="3120"/>
-          </w:tcPr>
-          <w:p>
-            <w:pPr>
-              <w:spacing w:after="0"/>
-            </w:pPr>
-            <w:r/>
-            <w:r>
-              <w:rPr>
-                <w:rFonts w:ascii="Calibri" w:hAnsi="Calibri" w:eastAsia="Microsoft YaHei"/>
-                <w:b w:val="0"/>
-                <w:sz w:val="19"/>
-              </w:rPr>
-              <w:t>执行形态</w:t>
-            </w:r>
-          </w:p>
-        </w:tc>
-        <w:tc>
-          <w:tcPr>
-            <w:tcW w:type="dxa" w:w="3120"/>
-          </w:tcPr>
-          <w:p>
-            <w:pPr>
-              <w:spacing w:after="0"/>
-            </w:pPr>
-            <w:r/>
-            <w:r>
-              <w:rPr>
-                <w:rFonts w:ascii="Calibri" w:hAnsi="Calibri" w:eastAsia="Microsoft YaHei"/>
-                <w:b w:val="0"/>
-                <w:sz w:val="19"/>
-              </w:rPr>
-              <w:t>hybrid</w:t>
-            </w:r>
-          </w:p>
-        </w:tc>
-        <w:tc>
-          <w:tcPr>
-            <w:tcW w:type="dxa" w:w="3120"/>
-          </w:tcPr>
-          <w:p>
-            <w:pPr>
-              <w:spacing w:after="0"/>
-            </w:pPr>
-            <w:r/>
-            <w:r>
-              <w:rPr>
-                <w:rFonts w:ascii="Calibri" w:hAnsi="Calibri" w:eastAsia="Microsoft YaHei"/>
-                <w:b w:val="0"/>
-                <w:sz w:val="19"/>
-              </w:rPr>
-              <w:t>LLM provider=mock_llm</w:t>
-            </w:r>
-          </w:p>
-        </w:tc>
-      </w:tr>
-      <w:tr>
-        <w:tc>
-          <w:tcPr>
-            <w:tcW w:type="dxa" w:w="3120"/>
-          </w:tcPr>
-          <w:p>
-            <w:pPr>
-              <w:spacing w:after="0"/>
-            </w:pPr>
-            <w:r/>
-            <w:r>
-              <w:rPr>
-                <w:rFonts w:ascii="Calibri" w:hAnsi="Calibri" w:eastAsia="Microsoft YaHei"/>
-                <w:b w:val="0"/>
-                <w:sz w:val="19"/>
-              </w:rPr>
-              <w:t>平均 ASR 耗时</w:t>
-            </w:r>
-          </w:p>
-        </w:tc>
-        <w:tc>
-          <w:tcPr>
-            <w:tcW w:type="dxa" w:w="3120"/>
-          </w:tcPr>
-          <w:p>
-            <w:pPr>
-              <w:spacing w:after="0"/>
-            </w:pPr>
-            <w:r/>
-            <w:r>
-              <w:rPr>
-                <w:rFonts w:ascii="Calibri" w:hAnsi="Calibri" w:eastAsia="Microsoft YaHei"/>
-                <w:b w:val="0"/>
-                <w:sz w:val="19"/>
-              </w:rPr>
-              <w:t>158 ms</w:t>
-            </w:r>
-          </w:p>
-        </w:tc>
-        <w:tc>
-          <w:tcPr>
-            <w:tcW w:type="dxa" w:w="3120"/>
-          </w:tcPr>
-          <w:p>
-            <w:pPr>
-              <w:spacing w:after="0"/>
-            </w:pPr>
-            <w:r/>
-            <w:r>
-              <w:rPr>
-                <w:rFonts w:ascii="Calibri" w:hAnsi="Calibri" w:eastAsia="Microsoft YaHei"/>
-                <w:b w:val="0"/>
-                <w:sz w:val="19"/>
-              </w:rPr>
-              <w:t>真实语音转写阶段</w:t>
-            </w:r>
-          </w:p>
-        </w:tc>
-      </w:tr>
-      <w:tr>
-        <w:tc>
-          <w:tcPr>
-            <w:tcW w:type="dxa" w:w="3120"/>
-          </w:tcPr>
-          <w:p>
-            <w:pPr>
-              <w:spacing w:after="0"/>
-            </w:pPr>
-            <w:r/>
-            <w:r>
-              <w:rPr>
-                <w:rFonts w:ascii="Calibri" w:hAnsi="Calibri" w:eastAsia="Microsoft YaHei"/>
-                <w:b w:val="0"/>
-                <w:sz w:val="19"/>
-              </w:rPr>
-              <w:t>平均检索耗时</w:t>
-            </w:r>
-          </w:p>
-        </w:tc>
-        <w:tc>
-          <w:tcPr>
-            <w:tcW w:type="dxa" w:w="3120"/>
-          </w:tcPr>
-          <w:p>
-            <w:pPr>
-              <w:spacing w:after="0"/>
-            </w:pPr>
-            <w:r/>
-            <w:r>
-              <w:rPr>
-                <w:rFonts w:ascii="Calibri" w:hAnsi="Calibri" w:eastAsia="Microsoft YaHei"/>
-                <w:b w:val="0"/>
-                <w:sz w:val="19"/>
-              </w:rPr>
-              <w:t>166 ms</w:t>
-            </w:r>
-          </w:p>
-        </w:tc>
-        <w:tc>
-          <w:tcPr>
-            <w:tcW w:type="dxa" w:w="3120"/>
-          </w:tcPr>
-          <w:p>
-            <w:pPr>
-              <w:spacing w:after="0"/>
-            </w:pPr>
-            <w:r/>
-            <w:r>
-              <w:rPr>
-                <w:rFonts w:ascii="Calibri" w:hAnsi="Calibri" w:eastAsia="Microsoft YaHei"/>
-                <w:b w:val="0"/>
-                <w:sz w:val="19"/>
-              </w:rPr>
-              <w:t>RAG 证据检索阶段</w:t>
-            </w:r>
-          </w:p>
-        </w:tc>
-      </w:tr>
-      <w:tr>
-        <w:tc>
-          <w:tcPr>
-            <w:tcW w:type="dxa" w:w="3120"/>
-          </w:tcPr>
-          <w:p>
-            <w:pPr>
-              <w:spacing w:after="0"/>
-            </w:pPr>
-            <w:r/>
-            <w:r>
-              <w:rPr>
-                <w:rFonts w:ascii="Calibri" w:hAnsi="Calibri" w:eastAsia="Microsoft YaHei"/>
-                <w:b w:val="0"/>
-                <w:sz w:val="19"/>
-              </w:rPr>
-              <w:t>平均 TTS 首音</w:t>
-            </w:r>
-          </w:p>
-        </w:tc>
-        <w:tc>
-          <w:tcPr>
-            <w:tcW w:type="dxa" w:w="3120"/>
-          </w:tcPr>
-          <w:p>
-            <w:pPr>
-              <w:spacing w:after="0"/>
-            </w:pPr>
-            <w:r/>
-            <w:r>
-              <w:rPr>
-                <w:rFonts w:ascii="Calibri" w:hAnsi="Calibri" w:eastAsia="Microsoft YaHei"/>
-                <w:b w:val="0"/>
-                <w:sz w:val="19"/>
-              </w:rPr>
-              <w:t>14794 ms</w:t>
-            </w:r>
-          </w:p>
-        </w:tc>
-        <w:tc>
-          <w:tcPr>
-            <w:tcW w:type="dxa" w:w="3120"/>
-          </w:tcPr>
-          <w:p>
-            <w:pPr>
-              <w:spacing w:after="0"/>
-            </w:pPr>
-            <w:r/>
-            <w:r>
-              <w:rPr>
-                <w:rFonts w:ascii="Calibri" w:hAnsi="Calibri" w:eastAsia="Microsoft YaHei"/>
-                <w:b w:val="0"/>
-                <w:sz w:val="19"/>
-              </w:rPr>
-              <w:t>当前主要性能瓶颈</w:t>
-            </w:r>
-          </w:p>
-        </w:tc>
-      </w:tr>
-      <w:tr>
-        <w:tc>
-          <w:tcPr>
-            <w:tcW w:type="dxa" w:w="3120"/>
-          </w:tcPr>
-          <w:p>
-            <w:pPr>
-              <w:spacing w:after="0"/>
-            </w:pPr>
-            <w:r/>
-            <w:r>
-              <w:rPr>
-                <w:rFonts w:ascii="Calibri" w:hAnsi="Calibri" w:eastAsia="Microsoft YaHei"/>
-                <w:b w:val="0"/>
-                <w:sz w:val="19"/>
-              </w:rPr>
-              <w:t>平均端到端首音</w:t>
-            </w:r>
-          </w:p>
-        </w:tc>
-        <w:tc>
-          <w:tcPr>
-            <w:tcW w:type="dxa" w:w="3120"/>
-          </w:tcPr>
-          <w:p>
-            <w:pPr>
-              <w:spacing w:after="0"/>
-            </w:pPr>
-            <w:r/>
-            <w:r>
-              <w:rPr>
-                <w:rFonts w:ascii="Calibri" w:hAnsi="Calibri" w:eastAsia="Microsoft YaHei"/>
-                <w:b w:val="0"/>
-                <w:sz w:val="19"/>
-              </w:rPr>
-              <w:t>15239 ms</w:t>
-            </w:r>
-          </w:p>
-        </w:tc>
-        <w:tc>
-          <w:tcPr>
-            <w:tcW w:type="dxa" w:w="3120"/>
-          </w:tcPr>
-          <w:p>
-            <w:pPr>
-              <w:spacing w:after="0"/>
-            </w:pPr>
-            <w:r/>
-            <w:r>
-              <w:rPr>
-                <w:rFonts w:ascii="Calibri" w:hAnsi="Calibri" w:eastAsia="Microsoft YaHei"/>
-                <w:b w:val="0"/>
-                <w:sz w:val="19"/>
-              </w:rPr>
-              <w:t>远端真实语音链路观察值</w:t>
-            </w:r>
-          </w:p>
-        </w:tc>
-      </w:tr>
-    </w:tbl>
-    <w:p>
-      <w:pPr>
-        <w:spacing w:after="40"/>
-      </w:pPr>
-    </w:p>
-    <w:tbl>
-      <w:tblPr>
-        <w:tblStyle w:val="TableGrid"/>
-        <w:tblW w:type="auto" w:w="0"/>
-        <w:jc w:val="center"/>
-        <w:tblLook w:firstColumn="1" w:firstRow="1" w:lastColumn="0" w:lastRow="0" w:noHBand="0" w:noVBand="1" w:val="04A0"/>
-        <w:tblLayout w:type="fixed"/>
-      </w:tblPr>
-      <w:tblGrid>
-        <w:gridCol w:w="2340"/>
-        <w:gridCol w:w="2340"/>
-        <w:gridCol w:w="2340"/>
-        <w:gridCol w:w="2340"/>
-      </w:tblGrid>
-      <w:tr>
-        <w:tc>
-          <w:tcPr>
-            <w:tcW w:type="dxa" w:w="1152"/>
-            <w:vAlign w:val="center"/>
-            <w:tcMar>
-              <w:top w:w="80" w:type="dxa"/>
-              <w:start w:w="120" w:type="dxa"/>
-              <w:bottom w:w="80" w:type="dxa"/>
-              <w:end w:w="120" w:type="dxa"/>
-            </w:tcMar>
-            <w:shd w:fill="F2F4F7"/>
-          </w:tcPr>
-          <w:p>
-            <w:pPr>
-              <w:spacing w:after="0"/>
-            </w:pPr>
-            <w:r/>
-            <w:r>
-              <w:rPr>
-                <w:rFonts w:ascii="Calibri" w:hAnsi="Calibri" w:eastAsia="Microsoft YaHei"/>
-                <w:b/>
-                <w:color w:val="18202B"/>
-                <w:sz w:val="19"/>
-              </w:rPr>
-              <w:t>样本</w:t>
-            </w:r>
-          </w:p>
-        </w:tc>
-        <w:tc>
-          <w:tcPr>
-            <w:tcW w:type="dxa" w:w="4608"/>
-            <w:vAlign w:val="center"/>
-            <w:tcMar>
-              <w:top w:w="80" w:type="dxa"/>
-              <w:start w:w="120" w:type="dxa"/>
-              <w:bottom w:w="80" w:type="dxa"/>
-              <w:end w:w="120" w:type="dxa"/>
-            </w:tcMar>
-            <w:shd w:fill="F2F4F7"/>
-          </w:tcPr>
-          <w:p>
-            <w:pPr>
-              <w:spacing w:after="0"/>
-            </w:pPr>
-            <w:r/>
-            <w:r>
-              <w:rPr>
-                <w:rFonts w:ascii="Calibri" w:hAnsi="Calibri" w:eastAsia="Microsoft YaHei"/>
-                <w:b/>
-                <w:color w:val="18202B"/>
-                <w:sz w:val="19"/>
-              </w:rPr>
-              <w:t>转写结果</w:t>
-            </w:r>
-          </w:p>
-        </w:tc>
-        <w:tc>
-          <w:tcPr>
-            <w:tcW w:type="dxa" w:w="1872"/>
-            <w:vAlign w:val="center"/>
-            <w:tcMar>
-              <w:top w:w="80" w:type="dxa"/>
-              <w:start w:w="120" w:type="dxa"/>
-              <w:bottom w:w="80" w:type="dxa"/>
-              <w:end w:w="120" w:type="dxa"/>
-            </w:tcMar>
-            <w:shd w:fill="F2F4F7"/>
-          </w:tcPr>
-          <w:p>
-            <w:pPr>
-              <w:spacing w:after="0"/>
-            </w:pPr>
-            <w:r/>
-            <w:r>
-              <w:rPr>
-                <w:rFonts w:ascii="Calibri" w:hAnsi="Calibri" w:eastAsia="Microsoft YaHei"/>
-                <w:b/>
-                <w:color w:val="18202B"/>
-                <w:sz w:val="19"/>
-              </w:rPr>
-              <w:t>ASR/检索/TTS首音(ms)</w:t>
-            </w:r>
-          </w:p>
-        </w:tc>
-        <w:tc>
-          <w:tcPr>
-            <w:tcW w:type="dxa" w:w="1728"/>
-            <w:vAlign w:val="center"/>
-            <w:tcMar>
-              <w:top w:w="80" w:type="dxa"/>
-              <w:start w:w="120" w:type="dxa"/>
-              <w:bottom w:w="80" w:type="dxa"/>
-              <w:end w:w="120" w:type="dxa"/>
-            </w:tcMar>
-            <w:shd w:fill="F2F4F7"/>
-          </w:tcPr>
-          <w:p>
-            <w:pPr>
-              <w:spacing w:after="0"/>
-            </w:pPr>
-            <w:r/>
-            <w:r>
-              <w:rPr>
-                <w:rFonts w:ascii="Calibri" w:hAnsi="Calibri" w:eastAsia="Microsoft YaHei"/>
-                <w:b/>
-                <w:color w:val="18202B"/>
-                <w:sz w:val="19"/>
-              </w:rPr>
-              <w:t>总耗时(ms)</w:t>
-            </w:r>
-          </w:p>
-        </w:tc>
-      </w:tr>
-      <w:tr>
-        <w:tc>
-          <w:tcPr>
-            <w:tcW w:type="dxa" w:w="2340"/>
-          </w:tcPr>
-          <w:p>
-            <w:pPr>
-              <w:spacing w:after="0"/>
-            </w:pPr>
-            <w:r/>
-            <w:r>
-              <w:rPr>
-                <w:rFonts w:ascii="Calibri" w:hAnsi="Calibri" w:eastAsia="Microsoft YaHei"/>
-                <w:b w:val="0"/>
-                <w:sz w:val="19"/>
-              </w:rPr>
-              <w:t>A001</w:t>
-            </w:r>
-          </w:p>
-        </w:tc>
-        <w:tc>
-          <w:tcPr>
-            <w:tcW w:type="dxa" w:w="2340"/>
-          </w:tcPr>
-          <w:p>
-            <w:pPr>
-              <w:spacing w:after="0"/>
-            </w:pPr>
-            <w:r/>
-            <w:r>
-              <w:rPr>
-                <w:rFonts w:ascii="Calibri" w:hAnsi="Calibri" w:eastAsia="Microsoft YaHei"/>
-                <w:b w:val="0"/>
-                <w:sz w:val="19"/>
-              </w:rPr>
-              <w:t>密闭舱室动火作业前要检查什么？</w:t>
-            </w:r>
-          </w:p>
-        </w:tc>
-        <w:tc>
-          <w:tcPr>
-            <w:tcW w:type="dxa" w:w="2340"/>
-          </w:tcPr>
-          <w:p>
-            <w:pPr>
-              <w:spacing w:after="0"/>
-            </w:pPr>
-            <w:r/>
-            <w:r>
-              <w:rPr>
-                <w:rFonts w:ascii="Calibri" w:hAnsi="Calibri" w:eastAsia="Microsoft YaHei"/>
-                <w:b w:val="0"/>
-                <w:sz w:val="19"/>
-              </w:rPr>
-              <w:t>129 / 165 / 16461</w:t>
-            </w:r>
-          </w:p>
-        </w:tc>
-        <w:tc>
-          <w:tcPr>
-            <w:tcW w:type="dxa" w:w="2340"/>
-          </w:tcPr>
-          <w:p>
-            <w:pPr>
-              <w:spacing w:after="0"/>
-            </w:pPr>
-            <w:r/>
-            <w:r>
-              <w:rPr>
-                <w:rFonts w:ascii="Calibri" w:hAnsi="Calibri" w:eastAsia="Microsoft YaHei"/>
-                <w:b w:val="0"/>
-                <w:sz w:val="19"/>
-              </w:rPr>
-              <w:t>16876</w:t>
-            </w:r>
-          </w:p>
-        </w:tc>
-      </w:tr>
-      <w:tr>
-        <w:tc>
-          <w:tcPr>
-            <w:tcW w:type="dxa" w:w="2340"/>
-          </w:tcPr>
-          <w:p>
-            <w:pPr>
-              <w:spacing w:after="0"/>
-            </w:pPr>
-            <w:r/>
-            <w:r>
-              <w:rPr>
-                <w:rFonts w:ascii="Calibri" w:hAnsi="Calibri" w:eastAsia="Microsoft YaHei"/>
-                <w:b w:val="0"/>
-                <w:sz w:val="19"/>
-              </w:rPr>
-              <w:t>A002</w:t>
-            </w:r>
-          </w:p>
-        </w:tc>
-        <w:tc>
-          <w:tcPr>
-            <w:tcW w:type="dxa" w:w="2340"/>
-          </w:tcPr>
-          <w:p>
-            <w:pPr>
-              <w:spacing w:after="0"/>
-            </w:pPr>
-            <w:r/>
-            <w:r>
-              <w:rPr>
-                <w:rFonts w:ascii="Calibri" w:hAnsi="Calibri" w:eastAsia="Microsoft YaHei"/>
-                <w:b w:val="0"/>
-                <w:sz w:val="19"/>
-              </w:rPr>
-              <w:t>舾装阶段管路试压有哪些安全风险？</w:t>
-            </w:r>
-          </w:p>
-        </w:tc>
-        <w:tc>
-          <w:tcPr>
-            <w:tcW w:type="dxa" w:w="2340"/>
-          </w:tcPr>
-          <w:p>
-            <w:pPr>
-              <w:spacing w:after="0"/>
-            </w:pPr>
-            <w:r/>
-            <w:r>
-              <w:rPr>
-                <w:rFonts w:ascii="Calibri" w:hAnsi="Calibri" w:eastAsia="Microsoft YaHei"/>
-                <w:b w:val="0"/>
-                <w:sz w:val="19"/>
-              </w:rPr>
-              <w:t>150 / 166 / 13324</w:t>
-            </w:r>
-          </w:p>
-        </w:tc>
-        <w:tc>
-          <w:tcPr>
-            <w:tcW w:type="dxa" w:w="2340"/>
-          </w:tcPr>
-          <w:p>
-            <w:pPr>
-              <w:spacing w:after="0"/>
-            </w:pPr>
-            <w:r/>
-            <w:r>
-              <w:rPr>
-                <w:rFonts w:ascii="Calibri" w:hAnsi="Calibri" w:eastAsia="Microsoft YaHei"/>
-                <w:b w:val="0"/>
-                <w:sz w:val="19"/>
-              </w:rPr>
-              <w:t>13761</w:t>
-            </w:r>
-          </w:p>
-        </w:tc>
-      </w:tr>
-      <w:tr>
-        <w:tc>
-          <w:tcPr>
-            <w:tcW w:type="dxa" w:w="2340"/>
-          </w:tcPr>
-          <w:p>
-            <w:pPr>
-              <w:spacing w:after="0"/>
-            </w:pPr>
-            <w:r/>
-            <w:r>
-              <w:rPr>
-                <w:rFonts w:ascii="Calibri" w:hAnsi="Calibri" w:eastAsia="Microsoft YaHei"/>
-                <w:b w:val="0"/>
-                <w:sz w:val="19"/>
-              </w:rPr>
-              <w:t>A003</w:t>
-            </w:r>
-          </w:p>
-        </w:tc>
-        <w:tc>
-          <w:tcPr>
-            <w:tcW w:type="dxa" w:w="2340"/>
-          </w:tcPr>
-          <w:p>
-            <w:pPr>
-              <w:spacing w:after="0"/>
-            </w:pPr>
-            <w:r/>
-            <w:r>
-              <w:rPr>
-                <w:rFonts w:ascii="Calibri" w:hAnsi="Calibri" w:eastAsia="Microsoft YaHei"/>
-                <w:b w:val="0"/>
-                <w:sz w:val="19"/>
-              </w:rPr>
-              <w:t>船体分段吊装前，需要确认哪些事项？</w:t>
-            </w:r>
-          </w:p>
-        </w:tc>
-        <w:tc>
-          <w:tcPr>
-            <w:tcW w:type="dxa" w:w="2340"/>
-          </w:tcPr>
-          <w:p>
-            <w:pPr>
-              <w:spacing w:after="0"/>
-            </w:pPr>
-            <w:r/>
-            <w:r>
-              <w:rPr>
-                <w:rFonts w:ascii="Calibri" w:hAnsi="Calibri" w:eastAsia="Microsoft YaHei"/>
-                <w:b w:val="0"/>
-                <w:sz w:val="19"/>
-              </w:rPr>
-              <w:t>195 / 166 / 14597</w:t>
-            </w:r>
-          </w:p>
-        </w:tc>
-        <w:tc>
-          <w:tcPr>
-            <w:tcW w:type="dxa" w:w="2340"/>
-          </w:tcPr>
-          <w:p>
-            <w:pPr>
-              <w:spacing w:after="0"/>
-            </w:pPr>
-            <w:r/>
-            <w:r>
-              <w:rPr>
-                <w:rFonts w:ascii="Calibri" w:hAnsi="Calibri" w:eastAsia="Microsoft YaHei"/>
-                <w:b w:val="0"/>
-                <w:sz w:val="19"/>
-              </w:rPr>
-              <w:t>15080</w:t>
-            </w:r>
-          </w:p>
-        </w:tc>
-      </w:tr>
-    </w:tbl>
-    <w:p>
-      <w:pPr>
-        <w:spacing w:after="40"/>
-      </w:pPr>
-    </w:p>
-    <w:tbl>
-      <w:tblPr>
-        <w:tblStyle w:val="TableGrid"/>
-        <w:tblW w:type="auto" w:w="0"/>
-        <w:jc w:val="center"/>
-        <w:tblLook w:firstColumn="1" w:firstRow="1" w:lastColumn="0" w:lastRow="0" w:noHBand="0" w:noVBand="1" w:val="04A0"/>
-        <w:tblLayout w:type="fixed"/>
-      </w:tblPr>
-      <w:tblGrid>
-        <w:gridCol w:w="9360"/>
-      </w:tblGrid>
-      <w:tr>
-        <w:tc>
-          <w:tcPr>
-            <w:tcW w:type="dxa" w:w="9360"/>
-            <w:vAlign w:val="center"/>
-            <w:tcMar>
-              <w:top w:w="80" w:type="dxa"/>
-              <w:start w:w="120" w:type="dxa"/>
-              <w:bottom w:w="80" w:type="dxa"/>
-              <w:end w:w="120" w:type="dxa"/>
-            </w:tcMar>
-            <w:shd w:fill="E8EEF5"/>
-          </w:tcPr>
-          <w:p>
-            <w:pPr>
-              <w:spacing w:after="80"/>
-            </w:pPr>
-            <w:r>
-              <w:rPr>
-                <w:rFonts w:ascii="Calibri" w:hAnsi="Calibri" w:eastAsia="Microsoft YaHei"/>
-                <w:b/>
-                <w:color w:val="1F4D78"/>
-                <w:sz w:val="21"/>
-              </w:rPr>
-              <w:t>联调结论</w:t>
-            </w:r>
-          </w:p>
-          <w:p>
-            <w:pPr>
-              <w:spacing w:after="0" w:line="269" w:lineRule="auto"/>
-            </w:pPr>
-            <w:r>
-              <w:rPr>
-                <w:rFonts w:ascii="Calibri" w:hAnsi="Calibri" w:eastAsia="Microsoft YaHei"/>
-                <w:color w:val="18202B"/>
-                <w:sz w:val="20"/>
-              </w:rPr>
-              <w:t>真实语音链路证据已归档至 results\remote_real_chain_20260612_chattts_48359。当前系统已经具备“真实语音输入 + 真实语音输出 + 可控安全问答”的工程形态；下一阶段的主要任务不是继续证明能跑，而是优化 TTS 延迟并替换 hybrid 中的 mock_llm。</w:t>
-            </w:r>
-          </w:p>
-        </w:tc>
-      </w:tr>
-    </w:tbl>
-    <w:p>
-      <w:pPr>
-        <w:spacing w:after="40"/>
-      </w:pPr>
     </w:p>
     <w:p>
       <w:pPr>
@@ -5290,7 +4273,7 @@
           <w:color w:val="18202B"/>
           <w:sz w:val="22"/>
         </w:rPr>
-        <w:t>本地演示使用 run_demo.py 启动后端和 Web 面板。当前版本已经把 provider 状态、execution profile 和 timing source 显式暴露出来，用于区分 demo/simulated 链路与真实 provider 调用链路。</w:t>
+        <w:t>本地应用使用 run_app.py 启动 FastAPI 后端和 Web 面板。当前版本已经把 provider 状态、execution profile 和 timing source 显式暴露出来，用于确认真实 provider 调用链路。</w:t>
       </w:r>
     </w:p>
     <w:tbl>
@@ -5524,7 +4507,277 @@
                 <w:b w:val="0"/>
                 <w:sz w:val="19"/>
               </w:rPr>
-              <w:t>baseline</w:t>
+              <w:t>full_audio_smoke</w:t>
+            </w:r>
+          </w:p>
+        </w:tc>
+        <w:tc>
+          <w:tcPr>
+            <w:tcW w:type="dxa" w:w="1337"/>
+          </w:tcPr>
+          <w:p>
+            <w:pPr>
+              <w:spacing w:after="0"/>
+            </w:pPr>
+            <w:r/>
+            <w:r>
+              <w:rPr>
+                <w:rFonts w:ascii="Calibri" w:hAnsi="Calibri" w:eastAsia="Microsoft YaHei"/>
+                <w:b w:val="0"/>
+                <w:sz w:val="19"/>
+              </w:rPr>
+              <w:t>1</w:t>
+            </w:r>
+          </w:p>
+        </w:tc>
+        <w:tc>
+          <w:tcPr>
+            <w:tcW w:type="dxa" w:w="1337"/>
+          </w:tcPr>
+          <w:p>
+            <w:pPr>
+              <w:spacing w:after="0"/>
+            </w:pPr>
+            <w:r/>
+            <w:r>
+              <w:rPr>
+                <w:rFonts w:ascii="Calibri" w:hAnsi="Calibri" w:eastAsia="Microsoft YaHei"/>
+                <w:b w:val="0"/>
+                <w:sz w:val="19"/>
+              </w:rPr>
+              <w:t>real_voice</w:t>
+            </w:r>
+          </w:p>
+        </w:tc>
+        <w:tc>
+          <w:tcPr>
+            <w:tcW w:type="dxa" w:w="1337"/>
+          </w:tcPr>
+          <w:p>
+            <w:pPr>
+              <w:spacing w:after="0"/>
+            </w:pPr>
+            <w:r/>
+            <w:r>
+              <w:rPr>
+                <w:rFonts w:ascii="Calibri" w:hAnsi="Calibri" w:eastAsia="Microsoft YaHei"/>
+                <w:b w:val="0"/>
+                <w:sz w:val="19"/>
+              </w:rPr>
+              <w:t>observed</w:t>
+            </w:r>
+          </w:p>
+        </w:tc>
+        <w:tc>
+          <w:tcPr>
+            <w:tcW w:type="dxa" w:w="1337"/>
+          </w:tcPr>
+          <w:p>
+            <w:pPr>
+              <w:spacing w:after="0"/>
+            </w:pPr>
+            <w:r/>
+            <w:r>
+              <w:rPr>
+                <w:rFonts w:ascii="Calibri" w:hAnsi="Calibri" w:eastAsia="Microsoft YaHei"/>
+                <w:b w:val="0"/>
+                <w:sz w:val="19"/>
+              </w:rPr>
+              <w:t>8459</w:t>
+            </w:r>
+          </w:p>
+        </w:tc>
+        <w:tc>
+          <w:tcPr>
+            <w:tcW w:type="dxa" w:w="1337"/>
+          </w:tcPr>
+          <w:p>
+            <w:pPr>
+              <w:spacing w:after="0"/>
+            </w:pPr>
+            <w:r/>
+            <w:r>
+              <w:rPr>
+                <w:rFonts w:ascii="Calibri" w:hAnsi="Calibri" w:eastAsia="Microsoft YaHei"/>
+                <w:b w:val="0"/>
+                <w:sz w:val="19"/>
+              </w:rPr>
+              <w:t>8459</w:t>
+            </w:r>
+          </w:p>
+        </w:tc>
+        <w:tc>
+          <w:tcPr>
+            <w:tcW w:type="dxa" w:w="1337"/>
+          </w:tcPr>
+          <w:p>
+            <w:pPr>
+              <w:spacing w:after="0"/>
+            </w:pPr>
+            <w:r/>
+            <w:r>
+              <w:rPr>
+                <w:rFonts w:ascii="Calibri" w:hAnsi="Calibri" w:eastAsia="Microsoft YaHei"/>
+                <w:b w:val="0"/>
+                <w:sz w:val="19"/>
+              </w:rPr>
+              <w:t>191.0</w:t>
+            </w:r>
+          </w:p>
+        </w:tc>
+      </w:tr>
+      <w:tr>
+        <w:tc>
+          <w:tcPr>
+            <w:tcW w:type="dxa" w:w="1337"/>
+          </w:tcPr>
+          <w:p>
+            <w:pPr>
+              <w:spacing w:after="0"/>
+            </w:pPr>
+            <w:r/>
+            <w:r>
+              <w:rPr>
+                <w:rFonts w:ascii="Calibri" w:hAnsi="Calibri" w:eastAsia="Microsoft YaHei"/>
+                <w:b w:val="0"/>
+                <w:sz w:val="19"/>
+              </w:rPr>
+              <w:t>multiturn_full</w:t>
+            </w:r>
+          </w:p>
+        </w:tc>
+        <w:tc>
+          <w:tcPr>
+            <w:tcW w:type="dxa" w:w="1337"/>
+          </w:tcPr>
+          <w:p>
+            <w:pPr>
+              <w:spacing w:after="0"/>
+            </w:pPr>
+            <w:r/>
+            <w:r>
+              <w:rPr>
+                <w:rFonts w:ascii="Calibri" w:hAnsi="Calibri" w:eastAsia="Microsoft YaHei"/>
+                <w:b w:val="0"/>
+                <w:sz w:val="19"/>
+              </w:rPr>
+              <w:t>18</w:t>
+            </w:r>
+          </w:p>
+        </w:tc>
+        <w:tc>
+          <w:tcPr>
+            <w:tcW w:type="dxa" w:w="1337"/>
+          </w:tcPr>
+          <w:p>
+            <w:pPr>
+              <w:spacing w:after="0"/>
+            </w:pPr>
+            <w:r/>
+            <w:r>
+              <w:rPr>
+                <w:rFonts w:ascii="Calibri" w:hAnsi="Calibri" w:eastAsia="Microsoft YaHei"/>
+                <w:b w:val="0"/>
+                <w:sz w:val="19"/>
+              </w:rPr>
+              <w:t>real_text_voice</w:t>
+            </w:r>
+          </w:p>
+        </w:tc>
+        <w:tc>
+          <w:tcPr>
+            <w:tcW w:type="dxa" w:w="1337"/>
+          </w:tcPr>
+          <w:p>
+            <w:pPr>
+              <w:spacing w:after="0"/>
+            </w:pPr>
+            <w:r/>
+            <w:r>
+              <w:rPr>
+                <w:rFonts w:ascii="Calibri" w:hAnsi="Calibri" w:eastAsia="Microsoft YaHei"/>
+                <w:b w:val="0"/>
+                <w:sz w:val="19"/>
+              </w:rPr>
+              <w:t>observed</w:t>
+            </w:r>
+          </w:p>
+        </w:tc>
+        <w:tc>
+          <w:tcPr>
+            <w:tcW w:type="dxa" w:w="1337"/>
+          </w:tcPr>
+          <w:p>
+            <w:pPr>
+              <w:spacing w:after="0"/>
+            </w:pPr>
+            <w:r/>
+            <w:r>
+              <w:rPr>
+                <w:rFonts w:ascii="Calibri" w:hAnsi="Calibri" w:eastAsia="Microsoft YaHei"/>
+                <w:b w:val="0"/>
+                <w:sz w:val="19"/>
+              </w:rPr>
+              <w:t>9318</w:t>
+            </w:r>
+          </w:p>
+        </w:tc>
+        <w:tc>
+          <w:tcPr>
+            <w:tcW w:type="dxa" w:w="1337"/>
+          </w:tcPr>
+          <w:p>
+            <w:pPr>
+              <w:spacing w:after="0"/>
+            </w:pPr>
+            <w:r/>
+            <w:r>
+              <w:rPr>
+                <w:rFonts w:ascii="Calibri" w:hAnsi="Calibri" w:eastAsia="Microsoft YaHei"/>
+                <w:b w:val="0"/>
+                <w:sz w:val="19"/>
+              </w:rPr>
+              <w:t>9318</w:t>
+            </w:r>
+          </w:p>
+        </w:tc>
+        <w:tc>
+          <w:tcPr>
+            <w:tcW w:type="dxa" w:w="1337"/>
+          </w:tcPr>
+          <w:p>
+            <w:pPr>
+              <w:spacing w:after="0"/>
+            </w:pPr>
+            <w:r/>
+            <w:r>
+              <w:rPr>
+                <w:rFonts w:ascii="Calibri" w:hAnsi="Calibri" w:eastAsia="Microsoft YaHei"/>
+                <w:b w:val="0"/>
+                <w:sz w:val="19"/>
+              </w:rPr>
+              <w:t>0.0</w:t>
+            </w:r>
+          </w:p>
+        </w:tc>
+      </w:tr>
+      <w:tr>
+        <w:tc>
+          <w:tcPr>
+            <w:tcW w:type="dxa" w:w="1337"/>
+          </w:tcPr>
+          <w:p>
+            <w:pPr>
+              <w:spacing w:after="0"/>
+            </w:pPr>
+            <w:r/>
+            <w:r>
+              <w:rPr>
+                <w:rFonts w:ascii="Calibri" w:hAnsi="Calibri" w:eastAsia="Microsoft YaHei"/>
+                <w:b w:val="0"/>
+                <w:sz w:val="19"/>
+              </w:rPr>
+              <w:t>citation_quality</w:t>
             </w:r>
           </w:p>
         </w:tc>
@@ -5562,7 +4815,7 @@
                 <w:b w:val="0"/>
                 <w:sz w:val="19"/>
               </w:rPr>
-              <w:t>demo</w:t>
+              <w:t>real_text_voice</w:t>
             </w:r>
           </w:p>
         </w:tc>
@@ -5581,7 +4834,7 @@
                 <w:b w:val="0"/>
                 <w:sz w:val="19"/>
               </w:rPr>
-              <w:t>simulated</w:t>
+              <w:t>observed</w:t>
             </w:r>
           </w:p>
         </w:tc>
@@ -5600,7 +4853,7 @@
                 <w:b w:val="0"/>
                 <w:sz w:val="19"/>
               </w:rPr>
-              <w:t>653</w:t>
+              <w:t>0</w:t>
             </w:r>
           </w:p>
         </w:tc>
@@ -5619,7 +4872,7 @@
                 <w:b w:val="0"/>
                 <w:sz w:val="19"/>
               </w:rPr>
-              <w:t>653</w:t>
+              <w:t>5309</w:t>
             </w:r>
           </w:p>
         </w:tc>
@@ -5638,277 +4891,7 @@
                 <w:b w:val="0"/>
                 <w:sz w:val="19"/>
               </w:rPr>
-              <w:t>93.2</w:t>
-            </w:r>
-          </w:p>
-        </w:tc>
-      </w:tr>
-      <w:tr>
-        <w:tc>
-          <w:tcPr>
-            <w:tcW w:type="dxa" w:w="1337"/>
-          </w:tcPr>
-          <w:p>
-            <w:pPr>
-              <w:spacing w:after="0"/>
-            </w:pPr>
-            <w:r/>
-            <w:r>
-              <w:rPr>
-                <w:rFonts w:ascii="Calibri" w:hAnsi="Calibri" w:eastAsia="Microsoft YaHei"/>
-                <w:b w:val="0"/>
-                <w:sz w:val="19"/>
-              </w:rPr>
-              <w:t>streaming</w:t>
-            </w:r>
-          </w:p>
-        </w:tc>
-        <w:tc>
-          <w:tcPr>
-            <w:tcW w:type="dxa" w:w="1337"/>
-          </w:tcPr>
-          <w:p>
-            <w:pPr>
-              <w:spacing w:after="0"/>
-            </w:pPr>
-            <w:r/>
-            <w:r>
-              <w:rPr>
-                <w:rFonts w:ascii="Calibri" w:hAnsi="Calibri" w:eastAsia="Microsoft YaHei"/>
-                <w:b w:val="0"/>
-                <w:sz w:val="19"/>
-              </w:rPr>
-              <w:t>8</w:t>
-            </w:r>
-          </w:p>
-        </w:tc>
-        <w:tc>
-          <w:tcPr>
-            <w:tcW w:type="dxa" w:w="1337"/>
-          </w:tcPr>
-          <w:p>
-            <w:pPr>
-              <w:spacing w:after="0"/>
-            </w:pPr>
-            <w:r/>
-            <w:r>
-              <w:rPr>
-                <w:rFonts w:ascii="Calibri" w:hAnsi="Calibri" w:eastAsia="Microsoft YaHei"/>
-                <w:b w:val="0"/>
-                <w:sz w:val="19"/>
-              </w:rPr>
-              <w:t>demo</w:t>
-            </w:r>
-          </w:p>
-        </w:tc>
-        <w:tc>
-          <w:tcPr>
-            <w:tcW w:type="dxa" w:w="1337"/>
-          </w:tcPr>
-          <w:p>
-            <w:pPr>
-              <w:spacing w:after="0"/>
-            </w:pPr>
-            <w:r/>
-            <w:r>
-              <w:rPr>
-                <w:rFonts w:ascii="Calibri" w:hAnsi="Calibri" w:eastAsia="Microsoft YaHei"/>
-                <w:b w:val="0"/>
-                <w:sz w:val="19"/>
-              </w:rPr>
-              <w:t>simulated</w:t>
-            </w:r>
-          </w:p>
-        </w:tc>
-        <w:tc>
-          <w:tcPr>
-            <w:tcW w:type="dxa" w:w="1337"/>
-          </w:tcPr>
-          <w:p>
-            <w:pPr>
-              <w:spacing w:after="0"/>
-            </w:pPr>
-            <w:r/>
-            <w:r>
-              <w:rPr>
-                <w:rFonts w:ascii="Calibri" w:hAnsi="Calibri" w:eastAsia="Microsoft YaHei"/>
-                <w:b w:val="0"/>
-                <w:sz w:val="19"/>
-              </w:rPr>
-              <w:t>1347</w:t>
-            </w:r>
-          </w:p>
-        </w:tc>
-        <w:tc>
-          <w:tcPr>
-            <w:tcW w:type="dxa" w:w="1337"/>
-          </w:tcPr>
-          <w:p>
-            <w:pPr>
-              <w:spacing w:after="0"/>
-            </w:pPr>
-            <w:r/>
-            <w:r>
-              <w:rPr>
-                <w:rFonts w:ascii="Calibri" w:hAnsi="Calibri" w:eastAsia="Microsoft YaHei"/>
-                <w:b w:val="0"/>
-                <w:sz w:val="19"/>
-              </w:rPr>
-              <w:t>1875</w:t>
-            </w:r>
-          </w:p>
-        </w:tc>
-        <w:tc>
-          <w:tcPr>
-            <w:tcW w:type="dxa" w:w="1337"/>
-          </w:tcPr>
-          <w:p>
-            <w:pPr>
-              <w:spacing w:after="0"/>
-            </w:pPr>
-            <w:r/>
-            <w:r>
-              <w:rPr>
-                <w:rFonts w:ascii="Calibri" w:hAnsi="Calibri" w:eastAsia="Microsoft YaHei"/>
-                <w:b w:val="0"/>
-                <w:sz w:val="19"/>
-              </w:rPr>
-              <w:t>93.2</w:t>
-            </w:r>
-          </w:p>
-        </w:tc>
-      </w:tr>
-      <w:tr>
-        <w:tc>
-          <w:tcPr>
-            <w:tcW w:type="dxa" w:w="1337"/>
-          </w:tcPr>
-          <w:p>
-            <w:pPr>
-              <w:spacing w:after="0"/>
-            </w:pPr>
-            <w:r/>
-            <w:r>
-              <w:rPr>
-                <w:rFonts w:ascii="Calibri" w:hAnsi="Calibri" w:eastAsia="Microsoft YaHei"/>
-                <w:b w:val="0"/>
-                <w:sz w:val="19"/>
-              </w:rPr>
-              <w:t>full</w:t>
-            </w:r>
-          </w:p>
-        </w:tc>
-        <w:tc>
-          <w:tcPr>
-            <w:tcW w:type="dxa" w:w="1337"/>
-          </w:tcPr>
-          <w:p>
-            <w:pPr>
-              <w:spacing w:after="0"/>
-            </w:pPr>
-            <w:r/>
-            <w:r>
-              <w:rPr>
-                <w:rFonts w:ascii="Calibri" w:hAnsi="Calibri" w:eastAsia="Microsoft YaHei"/>
-                <w:b w:val="0"/>
-                <w:sz w:val="19"/>
-              </w:rPr>
-              <w:t>8</w:t>
-            </w:r>
-          </w:p>
-        </w:tc>
-        <w:tc>
-          <w:tcPr>
-            <w:tcW w:type="dxa" w:w="1337"/>
-          </w:tcPr>
-          <w:p>
-            <w:pPr>
-              <w:spacing w:after="0"/>
-            </w:pPr>
-            <w:r/>
-            <w:r>
-              <w:rPr>
-                <w:rFonts w:ascii="Calibri" w:hAnsi="Calibri" w:eastAsia="Microsoft YaHei"/>
-                <w:b w:val="0"/>
-                <w:sz w:val="19"/>
-              </w:rPr>
-              <w:t>demo</w:t>
-            </w:r>
-          </w:p>
-        </w:tc>
-        <w:tc>
-          <w:tcPr>
-            <w:tcW w:type="dxa" w:w="1337"/>
-          </w:tcPr>
-          <w:p>
-            <w:pPr>
-              <w:spacing w:after="0"/>
-            </w:pPr>
-            <w:r/>
-            <w:r>
-              <w:rPr>
-                <w:rFonts w:ascii="Calibri" w:hAnsi="Calibri" w:eastAsia="Microsoft YaHei"/>
-                <w:b w:val="0"/>
-                <w:sz w:val="19"/>
-              </w:rPr>
-              <w:t>simulated</w:t>
-            </w:r>
-          </w:p>
-        </w:tc>
-        <w:tc>
-          <w:tcPr>
-            <w:tcW w:type="dxa" w:w="1337"/>
-          </w:tcPr>
-          <w:p>
-            <w:pPr>
-              <w:spacing w:after="0"/>
-            </w:pPr>
-            <w:r/>
-            <w:r>
-              <w:rPr>
-                <w:rFonts w:ascii="Calibri" w:hAnsi="Calibri" w:eastAsia="Microsoft YaHei"/>
-                <w:b w:val="0"/>
-                <w:sz w:val="19"/>
-              </w:rPr>
-              <w:t>1451</w:t>
-            </w:r>
-          </w:p>
-        </w:tc>
-        <w:tc>
-          <w:tcPr>
-            <w:tcW w:type="dxa" w:w="1337"/>
-          </w:tcPr>
-          <w:p>
-            <w:pPr>
-              <w:spacing w:after="0"/>
-            </w:pPr>
-            <w:r/>
-            <w:r>
-              <w:rPr>
-                <w:rFonts w:ascii="Calibri" w:hAnsi="Calibri" w:eastAsia="Microsoft YaHei"/>
-                <w:b w:val="0"/>
-                <w:sz w:val="19"/>
-              </w:rPr>
-              <w:t>2411</w:t>
-            </w:r>
-          </w:p>
-        </w:tc>
-        <w:tc>
-          <w:tcPr>
-            <w:tcW w:type="dxa" w:w="1337"/>
-          </w:tcPr>
-          <w:p>
-            <w:pPr>
-              <w:spacing w:after="0"/>
-            </w:pPr>
-            <w:r/>
-            <w:r>
-              <w:rPr>
-                <w:rFonts w:ascii="Calibri" w:hAnsi="Calibri" w:eastAsia="Microsoft YaHei"/>
-                <w:b w:val="0"/>
-                <w:sz w:val="19"/>
-              </w:rPr>
-              <w:t>143.2</w:t>
+              <w:t>0.0</w:t>
             </w:r>
           </w:p>
         </w:tc>
@@ -6738,7 +5721,7 @@
                 <w:color w:val="18202B"/>
                 <w:sz w:val="20"/>
               </w:rPr>
-              <w:t>LoRA 是有价值的领域适配实验，但不能直接作为唯一正式回答源。最终展示应把 LoRA 放在安全门控和 RAG 后面，用作可选领域风格增强；安全边界仍由显式门控和证据检索保证。</w:t>
+              <w:t>LoRA 是有价值的领域适配实验，但不能脱离安全门控和 RAG 单独使用。最终展示应把 ShipVoice LoRA 作为在线回答模型，放在安全门控和 RAG 后面；安全边界仍由显式门控、证据检索和审计共同保证。</w:t>
             </w:r>
           </w:p>
         </w:tc>
@@ -6767,7 +5750,7 @@
           <w:color w:val="18202B"/>
           <w:sz w:val="22"/>
         </w:rPr>
-        <w:t>项目保留了本地与远端两套复现路径。本地路径用于课程答辩现场稳定演示，远端路径用于 GPU 微调实验和模型对比。</w:t>
+        <w:t>项目保留了本地应用与远端 GPU 服务两套复现路径。本地应用负责前后端、知识库和审计，远端路径用于真实 ASR、LLM、TTS 服务和 GPU 微调实验。</w:t>
       </w:r>
     </w:p>
     <w:tbl>
@@ -6944,7 +5927,7 @@
                 <w:b w:val="0"/>
                 <w:sz w:val="19"/>
               </w:rPr>
-              <w:t>本地演示</w:t>
+              <w:t>本地应用</w:t>
             </w:r>
           </w:p>
         </w:tc>
@@ -6963,7 +5946,7 @@
                 <w:b w:val="0"/>
                 <w:sz w:val="19"/>
               </w:rPr>
-              <w:t>python run_demo.py</w:t>
+              <w:t>python run_app.py --env-file configs\runtime.real.env --port 8026</w:t>
             </w:r>
           </w:p>
         </w:tc>
@@ -6982,7 +5965,7 @@
                 <w:b w:val="0"/>
                 <w:sz w:val="19"/>
               </w:rPr>
-              <w:t>打开 http://127.0.0.1:8010 可运行</w:t>
+              <w:t>打开 http://127.0.0.1:8026 可运行；问答依赖真实 provider</w:t>
             </w:r>
           </w:p>
         </w:tc>
@@ -7416,7 +6399,7 @@
           <w:color w:val="18202B"/>
           <w:sz w:val="22"/>
         </w:rPr>
-        <w:t>核心远端证据位于 results/remote_autodl_20260621_expanded；真实语音链路证据位于 results\remote_real_chain_20260612_chattts_48359。前者证明扩展微调实验，后者证明真实 ASR/TTS 服务联调。</w:t>
+        <w:t>核心远端证据位于 results/remote_autodl_20260621_expanded；真实语音链路证据位于 results/remote_real_chain_*。前者证明扩展微调实验，后者证明真实 ASR/TTS 服务联调。</w:t>
       </w:r>
     </w:p>
     <w:p>

</xml_diff>

<commit_message>
Validate real GPU chain and tighten off-domain gate
</commit_message>
<xml_diff>
--- a/deliverables/ShipVoice_船厂安全实时语音问答助手_项目报告_比赛增强版.docx
+++ b/deliverables/ShipVoice_船厂安全实时语音问答助手_项目报告_比赛增强版.docx
@@ -605,7 +605,7 @@
                 <w:b w:val="0"/>
                 <w:sz w:val="19"/>
               </w:rPr>
-              <w:t>55 条安全/离题/prompt-injection/domain-safe/boundary 样例，危险请求误放行 0</w:t>
+              <w:t>56 条安全/离题/prompt-injection/domain-safe/boundary 样例，危险请求误放行 0</w:t>
             </w:r>
           </w:p>
         </w:tc>
@@ -2392,7 +2392,7 @@
                 <w:b w:val="0"/>
                 <w:sz w:val="19"/>
               </w:rPr>
-              <w:t>55</w:t>
+              <w:t>56</w:t>
             </w:r>
           </w:p>
         </w:tc>
@@ -4027,7 +4027,7 @@
                 <w:b w:val="0"/>
                 <w:sz w:val="19"/>
               </w:rPr>
-              <w:t>78.2%</w:t>
+              <w:t>73.6%</w:t>
             </w:r>
           </w:p>
         </w:tc>
@@ -4145,7 +4145,7 @@
                 <w:b w:val="0"/>
                 <w:sz w:val="19"/>
               </w:rPr>
-              <w:t>9318</w:t>
+              <w:t>8594</w:t>
             </w:r>
           </w:p>
         </w:tc>
@@ -4583,7 +4583,7 @@
                 <w:b w:val="0"/>
                 <w:sz w:val="19"/>
               </w:rPr>
-              <w:t>8459</w:t>
+              <w:t>12570</w:t>
             </w:r>
           </w:p>
         </w:tc>
@@ -4602,7 +4602,7 @@
                 <w:b w:val="0"/>
                 <w:sz w:val="19"/>
               </w:rPr>
-              <w:t>8459</w:t>
+              <w:t>12570</w:t>
             </w:r>
           </w:p>
         </w:tc>
@@ -4621,7 +4621,7 @@
                 <w:b w:val="0"/>
                 <w:sz w:val="19"/>
               </w:rPr>
-              <w:t>191.0</w:t>
+              <w:t>202.0</w:t>
             </w:r>
           </w:p>
         </w:tc>
@@ -4718,7 +4718,7 @@
                 <w:b w:val="0"/>
                 <w:sz w:val="19"/>
               </w:rPr>
-              <w:t>9318</w:t>
+              <w:t>8594</w:t>
             </w:r>
           </w:p>
         </w:tc>
@@ -4737,7 +4737,7 @@
                 <w:b w:val="0"/>
                 <w:sz w:val="19"/>
               </w:rPr>
-              <w:t>9318</w:t>
+              <w:t>8594</w:t>
             </w:r>
           </w:p>
         </w:tc>
@@ -4872,7 +4872,7 @@
                 <w:b w:val="0"/>
                 <w:sz w:val="19"/>
               </w:rPr>
-              <w:t>5309</w:t>
+              <w:t>8786</w:t>
             </w:r>
           </w:p>
         </w:tc>

</xml_diff>

<commit_message>
Upgrade streaming safety and cancellation
</commit_message>
<xml_diff>
--- a/deliverables/ShipVoice_船厂安全实时语音问答助手_项目报告_比赛增强版.docx
+++ b/deliverables/ShipVoice_船厂安全实时语音问答助手_项目报告_比赛增强版.docx
@@ -370,7 +370,7 @@
                 <w:color w:val="18202B"/>
                 <w:sz w:val="20"/>
               </w:rPr>
-              <w:t>本项目面向船厂高风险作业场景，构建了带安全门控、RAG 证据检索、可运行演示面板和 Qwen LoRA 微调实验的实时语音问答助手；核心目标不是简单串联 ASR-LLM-TTS，而是把领域知识、安全约束和实验闭环纳入系统设计。</w:t>
+              <w:t>本项目面向船厂高风险作业场景，构建了带安全门控、RAG 证据检索、真实 provider 链路和 Qwen LoRA 微调实验的实时语音问答助手；核心目标不是简单串联 ASR-LLM-TTS，而是把领域知识、安全约束和实验闭环纳入系统设计。</w:t>
             </w:r>
           </w:p>
         </w:tc>
@@ -685,7 +685,7 @@
                 <w:b w:val="0"/>
                 <w:sz w:val="19"/>
               </w:rPr>
-              <w:t>远端已验证 0 条真实样本，ASR=--，TTS=--，平均首音 -- ms</w:t>
+              <w:t>远端已验证 3 条真实样本，ASR=，TTS=，平均音频载荷就绪 15239 ms</w:t>
             </w:r>
           </w:p>
         </w:tc>
@@ -1282,7 +1282,7 @@
           <w:color w:val="18202B"/>
           <w:sz w:val="22"/>
         </w:rPr>
-        <w:t>系统采用“门控优先、证据约束、模型生成、演示可降级”的级联设计。正式链路如下：</w:t>
+        <w:t>系统采用“门控优先、证据约束、模型生成、失败可见”的级联设计。正式链路只接受真实 provider；ASR、LLM、TTS 任一服务不可用时，请求失败并记录错误。</w:t>
       </w:r>
     </w:p>
     <w:tbl>
@@ -1714,7 +1714,7 @@
                 <w:b w:val="0"/>
                 <w:sz w:val="19"/>
               </w:rPr>
-              <w:t>Playback / Demo Panel</w:t>
+              <w:t>Playback / Application UI</w:t>
             </w:r>
           </w:p>
         </w:tc>
@@ -2255,7 +2255,7 @@
           <w:color w:val="18202B"/>
           <w:sz w:val="22"/>
         </w:rPr>
-        <w:t>为把项目从课程 demo 推进到比赛级原型，我们将安全 benchmark 扩展为 55 条，覆盖 off-domain、unsafe、prompt injection、domain-safe 和 boundary 五类场景。评测脚本会完整跑过 pipeline，并输出 CSV、JSON 和 Markdown 报告。</w:t>
+        <w:t>为把项目从基础课程原型推进到比赛级原型，我们将安全 benchmark 扩展为 55 条，覆盖 off-domain、unsafe、prompt injection、domain-safe 和 boundary 五类场景。评测脚本会完整跑过 pipeline，并输出 CSV、JSON 和 Markdown 报告。</w:t>
       </w:r>
     </w:p>
     <w:tbl>
@@ -4252,8 +4252,1021 @@
           <w:color w:val="18202B"/>
           <w:sz w:val="22"/>
         </w:rPr>
-        <w:t>当前仓库尚未检测到远端真实语音链路验证结果。完成 GPU 联调后，应补充 ASR/TTS 服务健康检查、端到端样本结果和延迟统计。</w:t>
+        <w:t>为证明系统不是只有前端页面，本项目额外完成了一轮远端真实语音链路联调：在 RTX 4090 上启动 FunASR / SenseVoice ASR 服务与 ChatTTS 中文 TTS 服务，通过 HTTP provider 接回本地 ShipVoice pipeline，形成真实语音输入和真实语音回传。</w:t>
       </w:r>
+    </w:p>
+    <w:p>
+      <w:pPr>
+        <w:spacing w:after="120" w:line="264" w:lineRule="auto"/>
+      </w:pPr>
+      <w:r>
+        <w:rPr>
+          <w:rFonts w:ascii="Calibri" w:hAnsi="Calibri" w:eastAsia="Microsoft YaHei"/>
+          <w:color w:val="18202B"/>
+          <w:sz w:val="22"/>
+        </w:rPr>
+        <w:t>本轮验证重点不是追求最低时延，而是留下可审计的工程证据。该历史结果证明真实音频 I/O 已经在线，也暴露了后续企业级改造的瓶颈位置。当前版本已升级为 ASR、LLM、TTS 全真实 provider 策略，最终答辩前应重新跑全链路验证。</w:t>
+      </w:r>
+    </w:p>
+    <w:tbl>
+      <w:tblPr>
+        <w:tblStyle w:val="TableGrid"/>
+        <w:tblW w:type="auto" w:w="0"/>
+        <w:jc w:val="center"/>
+        <w:tblLook w:firstColumn="1" w:firstRow="1" w:lastColumn="0" w:lastRow="0" w:noHBand="0" w:noVBand="1" w:val="04A0"/>
+        <w:tblLayout w:type="fixed"/>
+      </w:tblPr>
+      <w:tblGrid>
+        <w:gridCol w:w="3120"/>
+        <w:gridCol w:w="3120"/>
+        <w:gridCol w:w="3120"/>
+      </w:tblGrid>
+      <w:tr>
+        <w:tc>
+          <w:tcPr>
+            <w:tcW w:type="dxa" w:w="2232"/>
+            <w:vAlign w:val="center"/>
+            <w:tcMar>
+              <w:top w:w="80" w:type="dxa"/>
+              <w:start w:w="120" w:type="dxa"/>
+              <w:bottom w:w="80" w:type="dxa"/>
+              <w:end w:w="120" w:type="dxa"/>
+            </w:tcMar>
+            <w:shd w:fill="F2F4F7"/>
+          </w:tcPr>
+          <w:p>
+            <w:pPr>
+              <w:spacing w:after="0"/>
+            </w:pPr>
+            <w:r/>
+            <w:r>
+              <w:rPr>
+                <w:rFonts w:ascii="Calibri" w:hAnsi="Calibri" w:eastAsia="Microsoft YaHei"/>
+                <w:b/>
+                <w:color w:val="18202B"/>
+                <w:sz w:val="19"/>
+              </w:rPr>
+              <w:t>指标</w:t>
+            </w:r>
+          </w:p>
+        </w:tc>
+        <w:tc>
+          <w:tcPr>
+            <w:tcW w:type="dxa" w:w="1944"/>
+            <w:vAlign w:val="center"/>
+            <w:tcMar>
+              <w:top w:w="80" w:type="dxa"/>
+              <w:start w:w="120" w:type="dxa"/>
+              <w:bottom w:w="80" w:type="dxa"/>
+              <w:end w:w="120" w:type="dxa"/>
+            </w:tcMar>
+            <w:shd w:fill="F2F4F7"/>
+          </w:tcPr>
+          <w:p>
+            <w:pPr>
+              <w:spacing w:after="0"/>
+            </w:pPr>
+            <w:r/>
+            <w:r>
+              <w:rPr>
+                <w:rFonts w:ascii="Calibri" w:hAnsi="Calibri" w:eastAsia="Microsoft YaHei"/>
+                <w:b/>
+                <w:color w:val="18202B"/>
+                <w:sz w:val="19"/>
+              </w:rPr>
+              <w:t>结果</w:t>
+            </w:r>
+          </w:p>
+        </w:tc>
+        <w:tc>
+          <w:tcPr>
+            <w:tcW w:type="dxa" w:w="4752"/>
+            <w:vAlign w:val="center"/>
+            <w:tcMar>
+              <w:top w:w="80" w:type="dxa"/>
+              <w:start w:w="120" w:type="dxa"/>
+              <w:bottom w:w="80" w:type="dxa"/>
+              <w:end w:w="120" w:type="dxa"/>
+            </w:tcMar>
+            <w:shd w:fill="F2F4F7"/>
+          </w:tcPr>
+          <w:p>
+            <w:pPr>
+              <w:spacing w:after="0"/>
+            </w:pPr>
+            <w:r/>
+            <w:r>
+              <w:rPr>
+                <w:rFonts w:ascii="Calibri" w:hAnsi="Calibri" w:eastAsia="Microsoft YaHei"/>
+                <w:b/>
+                <w:color w:val="18202B"/>
+                <w:sz w:val="19"/>
+              </w:rPr>
+              <w:t>说明</w:t>
+            </w:r>
+          </w:p>
+        </w:tc>
+      </w:tr>
+      <w:tr>
+        <w:tc>
+          <w:tcPr>
+            <w:tcW w:type="dxa" w:w="3120"/>
+          </w:tcPr>
+          <w:p>
+            <w:pPr>
+              <w:spacing w:after="0"/>
+            </w:pPr>
+            <w:r/>
+            <w:r>
+              <w:rPr>
+                <w:rFonts w:ascii="Calibri" w:hAnsi="Calibri" w:eastAsia="Microsoft YaHei"/>
+                <w:b w:val="0"/>
+                <w:sz w:val="19"/>
+              </w:rPr>
+              <w:t>验证样本数</w:t>
+            </w:r>
+          </w:p>
+        </w:tc>
+        <w:tc>
+          <w:tcPr>
+            <w:tcW w:type="dxa" w:w="3120"/>
+          </w:tcPr>
+          <w:p>
+            <w:pPr>
+              <w:spacing w:after="0"/>
+            </w:pPr>
+            <w:r/>
+            <w:r>
+              <w:rPr>
+                <w:rFonts w:ascii="Calibri" w:hAnsi="Calibri" w:eastAsia="Microsoft YaHei"/>
+                <w:b w:val="0"/>
+                <w:sz w:val="19"/>
+              </w:rPr>
+              <w:t>3</w:t>
+            </w:r>
+          </w:p>
+        </w:tc>
+        <w:tc>
+          <w:tcPr>
+            <w:tcW w:type="dxa" w:w="3120"/>
+          </w:tcPr>
+          <w:p>
+            <w:pPr>
+              <w:spacing w:after="0"/>
+            </w:pPr>
+            <w:r/>
+            <w:r>
+              <w:rPr>
+                <w:rFonts w:ascii="Calibri" w:hAnsi="Calibri" w:eastAsia="Microsoft YaHei"/>
+                <w:b w:val="0"/>
+                <w:sz w:val="19"/>
+              </w:rPr>
+              <w:t>A001-A003 三条真实录音端到端跑通</w:t>
+            </w:r>
+          </w:p>
+        </w:tc>
+      </w:tr>
+      <w:tr>
+        <w:tc>
+          <w:tcPr>
+            <w:tcW w:type="dxa" w:w="3120"/>
+          </w:tcPr>
+          <w:p>
+            <w:pPr>
+              <w:spacing w:after="0"/>
+            </w:pPr>
+            <w:r/>
+            <w:r>
+              <w:rPr>
+                <w:rFonts w:ascii="Calibri" w:hAnsi="Calibri" w:eastAsia="Microsoft YaHei"/>
+                <w:b w:val="0"/>
+                <w:sz w:val="19"/>
+              </w:rPr>
+              <w:t>ASR 服务</w:t>
+            </w:r>
+          </w:p>
+        </w:tc>
+        <w:tc>
+          <w:tcPr>
+            <w:tcW w:type="dxa" w:w="3120"/>
+          </w:tcPr>
+          <w:p>
+            <w:pPr>
+              <w:spacing w:after="0"/>
+            </w:pPr>
+            <w:r/>
+            <w:r>
+              <w:rPr>
+                <w:rFonts w:ascii="Calibri" w:hAnsi="Calibri" w:eastAsia="Microsoft YaHei"/>
+                <w:b w:val="0"/>
+                <w:sz w:val="19"/>
+              </w:rPr>
+            </w:r>
+          </w:p>
+        </w:tc>
+        <w:tc>
+          <w:tcPr>
+            <w:tcW w:type="dxa" w:w="3120"/>
+          </w:tcPr>
+          <w:p>
+            <w:pPr>
+              <w:spacing w:after="0"/>
+            </w:pPr>
+            <w:r/>
+            <w:r>
+              <w:rPr>
+                <w:rFonts w:ascii="Calibri" w:hAnsi="Calibri" w:eastAsia="Microsoft YaHei"/>
+                <w:b w:val="0"/>
+                <w:sz w:val="19"/>
+              </w:rPr>
+            </w:r>
+          </w:p>
+        </w:tc>
+      </w:tr>
+      <w:tr>
+        <w:tc>
+          <w:tcPr>
+            <w:tcW w:type="dxa" w:w="3120"/>
+          </w:tcPr>
+          <w:p>
+            <w:pPr>
+              <w:spacing w:after="0"/>
+            </w:pPr>
+            <w:r/>
+            <w:r>
+              <w:rPr>
+                <w:rFonts w:ascii="Calibri" w:hAnsi="Calibri" w:eastAsia="Microsoft YaHei"/>
+                <w:b w:val="0"/>
+                <w:sz w:val="19"/>
+              </w:rPr>
+              <w:t>TTS 服务</w:t>
+            </w:r>
+          </w:p>
+        </w:tc>
+        <w:tc>
+          <w:tcPr>
+            <w:tcW w:type="dxa" w:w="3120"/>
+          </w:tcPr>
+          <w:p>
+            <w:pPr>
+              <w:spacing w:after="0"/>
+            </w:pPr>
+            <w:r/>
+            <w:r>
+              <w:rPr>
+                <w:rFonts w:ascii="Calibri" w:hAnsi="Calibri" w:eastAsia="Microsoft YaHei"/>
+                <w:b w:val="0"/>
+                <w:sz w:val="19"/>
+              </w:rPr>
+            </w:r>
+          </w:p>
+        </w:tc>
+        <w:tc>
+          <w:tcPr>
+            <w:tcW w:type="dxa" w:w="3120"/>
+          </w:tcPr>
+          <w:p>
+            <w:pPr>
+              <w:spacing w:after="0"/>
+            </w:pPr>
+            <w:r/>
+            <w:r>
+              <w:rPr>
+                <w:rFonts w:ascii="Calibri" w:hAnsi="Calibri" w:eastAsia="Microsoft YaHei"/>
+                <w:b w:val="0"/>
+                <w:sz w:val="19"/>
+              </w:rPr>
+              <w:t>provider=</w:t>
+            </w:r>
+          </w:p>
+        </w:tc>
+      </w:tr>
+      <w:tr>
+        <w:tc>
+          <w:tcPr>
+            <w:tcW w:type="dxa" w:w="3120"/>
+          </w:tcPr>
+          <w:p>
+            <w:pPr>
+              <w:spacing w:after="0"/>
+            </w:pPr>
+            <w:r/>
+            <w:r>
+              <w:rPr>
+                <w:rFonts w:ascii="Calibri" w:hAnsi="Calibri" w:eastAsia="Microsoft YaHei"/>
+                <w:b w:val="0"/>
+                <w:sz w:val="19"/>
+              </w:rPr>
+              <w:t>执行形态</w:t>
+            </w:r>
+          </w:p>
+        </w:tc>
+        <w:tc>
+          <w:tcPr>
+            <w:tcW w:type="dxa" w:w="3120"/>
+          </w:tcPr>
+          <w:p>
+            <w:pPr>
+              <w:spacing w:after="0"/>
+            </w:pPr>
+            <w:r/>
+            <w:r>
+              <w:rPr>
+                <w:rFonts w:ascii="Calibri" w:hAnsi="Calibri" w:eastAsia="Microsoft YaHei"/>
+                <w:b w:val="0"/>
+                <w:sz w:val="19"/>
+              </w:rPr>
+            </w:r>
+          </w:p>
+        </w:tc>
+        <w:tc>
+          <w:tcPr>
+            <w:tcW w:type="dxa" w:w="3120"/>
+          </w:tcPr>
+          <w:p>
+            <w:pPr>
+              <w:spacing w:after="0"/>
+            </w:pPr>
+            <w:r/>
+            <w:r>
+              <w:rPr>
+                <w:rFonts w:ascii="Calibri" w:hAnsi="Calibri" w:eastAsia="Microsoft YaHei"/>
+                <w:b w:val="0"/>
+                <w:sz w:val="19"/>
+              </w:rPr>
+              <w:t>LLM provider=</w:t>
+            </w:r>
+          </w:p>
+        </w:tc>
+      </w:tr>
+      <w:tr>
+        <w:tc>
+          <w:tcPr>
+            <w:tcW w:type="dxa" w:w="3120"/>
+          </w:tcPr>
+          <w:p>
+            <w:pPr>
+              <w:spacing w:after="0"/>
+            </w:pPr>
+            <w:r/>
+            <w:r>
+              <w:rPr>
+                <w:rFonts w:ascii="Calibri" w:hAnsi="Calibri" w:eastAsia="Microsoft YaHei"/>
+                <w:b w:val="0"/>
+                <w:sz w:val="19"/>
+              </w:rPr>
+              <w:t>平均 ASR 耗时</w:t>
+            </w:r>
+          </w:p>
+        </w:tc>
+        <w:tc>
+          <w:tcPr>
+            <w:tcW w:type="dxa" w:w="3120"/>
+          </w:tcPr>
+          <w:p>
+            <w:pPr>
+              <w:spacing w:after="0"/>
+            </w:pPr>
+            <w:r/>
+            <w:r>
+              <w:rPr>
+                <w:rFonts w:ascii="Calibri" w:hAnsi="Calibri" w:eastAsia="Microsoft YaHei"/>
+                <w:b w:val="0"/>
+                <w:sz w:val="19"/>
+              </w:rPr>
+              <w:t>158 ms</w:t>
+            </w:r>
+          </w:p>
+        </w:tc>
+        <w:tc>
+          <w:tcPr>
+            <w:tcW w:type="dxa" w:w="3120"/>
+          </w:tcPr>
+          <w:p>
+            <w:pPr>
+              <w:spacing w:after="0"/>
+            </w:pPr>
+            <w:r/>
+            <w:r>
+              <w:rPr>
+                <w:rFonts w:ascii="Calibri" w:hAnsi="Calibri" w:eastAsia="Microsoft YaHei"/>
+                <w:b w:val="0"/>
+                <w:sz w:val="19"/>
+              </w:rPr>
+              <w:t>真实语音转写阶段</w:t>
+            </w:r>
+          </w:p>
+        </w:tc>
+      </w:tr>
+      <w:tr>
+        <w:tc>
+          <w:tcPr>
+            <w:tcW w:type="dxa" w:w="3120"/>
+          </w:tcPr>
+          <w:p>
+            <w:pPr>
+              <w:spacing w:after="0"/>
+            </w:pPr>
+            <w:r/>
+            <w:r>
+              <w:rPr>
+                <w:rFonts w:ascii="Calibri" w:hAnsi="Calibri" w:eastAsia="Microsoft YaHei"/>
+                <w:b w:val="0"/>
+                <w:sz w:val="19"/>
+              </w:rPr>
+              <w:t>平均检索耗时</w:t>
+            </w:r>
+          </w:p>
+        </w:tc>
+        <w:tc>
+          <w:tcPr>
+            <w:tcW w:type="dxa" w:w="3120"/>
+          </w:tcPr>
+          <w:p>
+            <w:pPr>
+              <w:spacing w:after="0"/>
+            </w:pPr>
+            <w:r/>
+            <w:r>
+              <w:rPr>
+                <w:rFonts w:ascii="Calibri" w:hAnsi="Calibri" w:eastAsia="Microsoft YaHei"/>
+                <w:b w:val="0"/>
+                <w:sz w:val="19"/>
+              </w:rPr>
+              <w:t>166 ms</w:t>
+            </w:r>
+          </w:p>
+        </w:tc>
+        <w:tc>
+          <w:tcPr>
+            <w:tcW w:type="dxa" w:w="3120"/>
+          </w:tcPr>
+          <w:p>
+            <w:pPr>
+              <w:spacing w:after="0"/>
+            </w:pPr>
+            <w:r/>
+            <w:r>
+              <w:rPr>
+                <w:rFonts w:ascii="Calibri" w:hAnsi="Calibri" w:eastAsia="Microsoft YaHei"/>
+                <w:b w:val="0"/>
+                <w:sz w:val="19"/>
+              </w:rPr>
+              <w:t>RAG 证据检索阶段</w:t>
+            </w:r>
+          </w:p>
+        </w:tc>
+      </w:tr>
+      <w:tr>
+        <w:tc>
+          <w:tcPr>
+            <w:tcW w:type="dxa" w:w="3120"/>
+          </w:tcPr>
+          <w:p>
+            <w:pPr>
+              <w:spacing w:after="0"/>
+            </w:pPr>
+            <w:r/>
+            <w:r>
+              <w:rPr>
+                <w:rFonts w:ascii="Calibri" w:hAnsi="Calibri" w:eastAsia="Microsoft YaHei"/>
+                <w:b w:val="0"/>
+                <w:sz w:val="19"/>
+              </w:rPr>
+              <w:t>平均 TTS 完成</w:t>
+            </w:r>
+          </w:p>
+        </w:tc>
+        <w:tc>
+          <w:tcPr>
+            <w:tcW w:type="dxa" w:w="3120"/>
+          </w:tcPr>
+          <w:p>
+            <w:pPr>
+              <w:spacing w:after="0"/>
+            </w:pPr>
+            <w:r/>
+            <w:r>
+              <w:rPr>
+                <w:rFonts w:ascii="Calibri" w:hAnsi="Calibri" w:eastAsia="Microsoft YaHei"/>
+                <w:b w:val="0"/>
+                <w:sz w:val="19"/>
+              </w:rPr>
+              <w:t>14794 ms</w:t>
+            </w:r>
+          </w:p>
+        </w:tc>
+        <w:tc>
+          <w:tcPr>
+            <w:tcW w:type="dxa" w:w="3120"/>
+          </w:tcPr>
+          <w:p>
+            <w:pPr>
+              <w:spacing w:after="0"/>
+            </w:pPr>
+            <w:r/>
+            <w:r>
+              <w:rPr>
+                <w:rFonts w:ascii="Calibri" w:hAnsi="Calibri" w:eastAsia="Microsoft YaHei"/>
+                <w:b w:val="0"/>
+                <w:sz w:val="19"/>
+              </w:rPr>
+              <w:t>当前主要性能瓶颈</w:t>
+            </w:r>
+          </w:p>
+        </w:tc>
+      </w:tr>
+      <w:tr>
+        <w:tc>
+          <w:tcPr>
+            <w:tcW w:type="dxa" w:w="3120"/>
+          </w:tcPr>
+          <w:p>
+            <w:pPr>
+              <w:spacing w:after="0"/>
+            </w:pPr>
+            <w:r/>
+            <w:r>
+              <w:rPr>
+                <w:rFonts w:ascii="Calibri" w:hAnsi="Calibri" w:eastAsia="Microsoft YaHei"/>
+                <w:b w:val="0"/>
+                <w:sz w:val="19"/>
+              </w:rPr>
+              <w:t>平均音频载荷就绪</w:t>
+            </w:r>
+          </w:p>
+        </w:tc>
+        <w:tc>
+          <w:tcPr>
+            <w:tcW w:type="dxa" w:w="3120"/>
+          </w:tcPr>
+          <w:p>
+            <w:pPr>
+              <w:spacing w:after="0"/>
+            </w:pPr>
+            <w:r/>
+            <w:r>
+              <w:rPr>
+                <w:rFonts w:ascii="Calibri" w:hAnsi="Calibri" w:eastAsia="Microsoft YaHei"/>
+                <w:b w:val="0"/>
+                <w:sz w:val="19"/>
+              </w:rPr>
+              <w:t>15239 ms</w:t>
+            </w:r>
+          </w:p>
+        </w:tc>
+        <w:tc>
+          <w:tcPr>
+            <w:tcW w:type="dxa" w:w="3120"/>
+          </w:tcPr>
+          <w:p>
+            <w:pPr>
+              <w:spacing w:after="0"/>
+            </w:pPr>
+            <w:r/>
+            <w:r>
+              <w:rPr>
+                <w:rFonts w:ascii="Calibri" w:hAnsi="Calibri" w:eastAsia="Microsoft YaHei"/>
+                <w:b w:val="0"/>
+                <w:sz w:val="19"/>
+              </w:rPr>
+              <w:t>服务端观测值，非浏览器播放开始时间</w:t>
+            </w:r>
+          </w:p>
+        </w:tc>
+      </w:tr>
+    </w:tbl>
+    <w:p>
+      <w:pPr>
+        <w:spacing w:after="40"/>
+      </w:pPr>
+    </w:p>
+    <w:tbl>
+      <w:tblPr>
+        <w:tblStyle w:val="TableGrid"/>
+        <w:tblW w:type="auto" w:w="0"/>
+        <w:jc w:val="center"/>
+        <w:tblLook w:firstColumn="1" w:firstRow="1" w:lastColumn="0" w:lastRow="0" w:noHBand="0" w:noVBand="1" w:val="04A0"/>
+        <w:tblLayout w:type="fixed"/>
+      </w:tblPr>
+      <w:tblGrid>
+        <w:gridCol w:w="2340"/>
+        <w:gridCol w:w="2340"/>
+        <w:gridCol w:w="2340"/>
+        <w:gridCol w:w="2340"/>
+      </w:tblGrid>
+      <w:tr>
+        <w:tc>
+          <w:tcPr>
+            <w:tcW w:type="dxa" w:w="1152"/>
+            <w:vAlign w:val="center"/>
+            <w:tcMar>
+              <w:top w:w="80" w:type="dxa"/>
+              <w:start w:w="120" w:type="dxa"/>
+              <w:bottom w:w="80" w:type="dxa"/>
+              <w:end w:w="120" w:type="dxa"/>
+            </w:tcMar>
+            <w:shd w:fill="F2F4F7"/>
+          </w:tcPr>
+          <w:p>
+            <w:pPr>
+              <w:spacing w:after="0"/>
+            </w:pPr>
+            <w:r/>
+            <w:r>
+              <w:rPr>
+                <w:rFonts w:ascii="Calibri" w:hAnsi="Calibri" w:eastAsia="Microsoft YaHei"/>
+                <w:b/>
+                <w:color w:val="18202B"/>
+                <w:sz w:val="19"/>
+              </w:rPr>
+              <w:t>样本</w:t>
+            </w:r>
+          </w:p>
+        </w:tc>
+        <w:tc>
+          <w:tcPr>
+            <w:tcW w:type="dxa" w:w="4608"/>
+            <w:vAlign w:val="center"/>
+            <w:tcMar>
+              <w:top w:w="80" w:type="dxa"/>
+              <w:start w:w="120" w:type="dxa"/>
+              <w:bottom w:w="80" w:type="dxa"/>
+              <w:end w:w="120" w:type="dxa"/>
+            </w:tcMar>
+            <w:shd w:fill="F2F4F7"/>
+          </w:tcPr>
+          <w:p>
+            <w:pPr>
+              <w:spacing w:after="0"/>
+            </w:pPr>
+            <w:r/>
+            <w:r>
+              <w:rPr>
+                <w:rFonts w:ascii="Calibri" w:hAnsi="Calibri" w:eastAsia="Microsoft YaHei"/>
+                <w:b/>
+                <w:color w:val="18202B"/>
+                <w:sz w:val="19"/>
+              </w:rPr>
+              <w:t>转写结果</w:t>
+            </w:r>
+          </w:p>
+        </w:tc>
+        <w:tc>
+          <w:tcPr>
+            <w:tcW w:type="dxa" w:w="1872"/>
+            <w:vAlign w:val="center"/>
+            <w:tcMar>
+              <w:top w:w="80" w:type="dxa"/>
+              <w:start w:w="120" w:type="dxa"/>
+              <w:bottom w:w="80" w:type="dxa"/>
+              <w:end w:w="120" w:type="dxa"/>
+            </w:tcMar>
+            <w:shd w:fill="F2F4F7"/>
+          </w:tcPr>
+          <w:p>
+            <w:pPr>
+              <w:spacing w:after="0"/>
+            </w:pPr>
+            <w:r/>
+            <w:r>
+              <w:rPr>
+                <w:rFonts w:ascii="Calibri" w:hAnsi="Calibri" w:eastAsia="Microsoft YaHei"/>
+                <w:b/>
+                <w:color w:val="18202B"/>
+                <w:sz w:val="19"/>
+              </w:rPr>
+              <w:t>ASR/检索/TTS完成(ms)</w:t>
+            </w:r>
+          </w:p>
+        </w:tc>
+        <w:tc>
+          <w:tcPr>
+            <w:tcW w:type="dxa" w:w="1728"/>
+            <w:vAlign w:val="center"/>
+            <w:tcMar>
+              <w:top w:w="80" w:type="dxa"/>
+              <w:start w:w="120" w:type="dxa"/>
+              <w:bottom w:w="80" w:type="dxa"/>
+              <w:end w:w="120" w:type="dxa"/>
+            </w:tcMar>
+            <w:shd w:fill="F2F4F7"/>
+          </w:tcPr>
+          <w:p>
+            <w:pPr>
+              <w:spacing w:after="0"/>
+            </w:pPr>
+            <w:r/>
+            <w:r>
+              <w:rPr>
+                <w:rFonts w:ascii="Calibri" w:hAnsi="Calibri" w:eastAsia="Microsoft YaHei"/>
+                <w:b/>
+                <w:color w:val="18202B"/>
+                <w:sz w:val="19"/>
+              </w:rPr>
+              <w:t>总耗时(ms)</w:t>
+            </w:r>
+          </w:p>
+        </w:tc>
+      </w:tr>
+      <w:tr>
+        <w:tc>
+          <w:tcPr>
+            <w:tcW w:type="dxa" w:w="2340"/>
+          </w:tcPr>
+          <w:p>
+            <w:pPr>
+              <w:spacing w:after="0"/>
+            </w:pPr>
+            <w:r/>
+            <w:r>
+              <w:rPr>
+                <w:rFonts w:ascii="Calibri" w:hAnsi="Calibri" w:eastAsia="Microsoft YaHei"/>
+                <w:b w:val="0"/>
+                <w:sz w:val="19"/>
+              </w:rPr>
+              <w:t>A001</w:t>
+            </w:r>
+          </w:p>
+        </w:tc>
+        <w:tc>
+          <w:tcPr>
+            <w:tcW w:type="dxa" w:w="2340"/>
+          </w:tcPr>
+          <w:p>
+            <w:pPr>
+              <w:spacing w:after="0"/>
+            </w:pPr>
+            <w:r/>
+            <w:r>
+              <w:rPr>
+                <w:rFonts w:ascii="Calibri" w:hAnsi="Calibri" w:eastAsia="Microsoft YaHei"/>
+                <w:b w:val="0"/>
+                <w:sz w:val="19"/>
+              </w:rPr>
+              <w:t>密闭舱室动火作业前要检查什么？</w:t>
+            </w:r>
+          </w:p>
+        </w:tc>
+        <w:tc>
+          <w:tcPr>
+            <w:tcW w:type="dxa" w:w="2340"/>
+          </w:tcPr>
+          <w:p>
+            <w:pPr>
+              <w:spacing w:after="0"/>
+            </w:pPr>
+            <w:r/>
+            <w:r>
+              <w:rPr>
+                <w:rFonts w:ascii="Calibri" w:hAnsi="Calibri" w:eastAsia="Microsoft YaHei"/>
+                <w:b w:val="0"/>
+                <w:sz w:val="19"/>
+              </w:rPr>
+              <w:t>129 / 165 / 16461</w:t>
+            </w:r>
+          </w:p>
+        </w:tc>
+        <w:tc>
+          <w:tcPr>
+            <w:tcW w:type="dxa" w:w="2340"/>
+          </w:tcPr>
+          <w:p>
+            <w:pPr>
+              <w:spacing w:after="0"/>
+            </w:pPr>
+            <w:r/>
+            <w:r>
+              <w:rPr>
+                <w:rFonts w:ascii="Calibri" w:hAnsi="Calibri" w:eastAsia="Microsoft YaHei"/>
+                <w:b w:val="0"/>
+                <w:sz w:val="19"/>
+              </w:rPr>
+              <w:t>16876</w:t>
+            </w:r>
+          </w:p>
+        </w:tc>
+      </w:tr>
+      <w:tr>
+        <w:tc>
+          <w:tcPr>
+            <w:tcW w:type="dxa" w:w="2340"/>
+          </w:tcPr>
+          <w:p>
+            <w:pPr>
+              <w:spacing w:after="0"/>
+            </w:pPr>
+            <w:r/>
+            <w:r>
+              <w:rPr>
+                <w:rFonts w:ascii="Calibri" w:hAnsi="Calibri" w:eastAsia="Microsoft YaHei"/>
+                <w:b w:val="0"/>
+                <w:sz w:val="19"/>
+              </w:rPr>
+              <w:t>A002</w:t>
+            </w:r>
+          </w:p>
+        </w:tc>
+        <w:tc>
+          <w:tcPr>
+            <w:tcW w:type="dxa" w:w="2340"/>
+          </w:tcPr>
+          <w:p>
+            <w:pPr>
+              <w:spacing w:after="0"/>
+            </w:pPr>
+            <w:r/>
+            <w:r>
+              <w:rPr>
+                <w:rFonts w:ascii="Calibri" w:hAnsi="Calibri" w:eastAsia="Microsoft YaHei"/>
+                <w:b w:val="0"/>
+                <w:sz w:val="19"/>
+              </w:rPr>
+              <w:t>舾装阶段管路试压有哪些安全风险？</w:t>
+            </w:r>
+          </w:p>
+        </w:tc>
+        <w:tc>
+          <w:tcPr>
+            <w:tcW w:type="dxa" w:w="2340"/>
+          </w:tcPr>
+          <w:p>
+            <w:pPr>
+              <w:spacing w:after="0"/>
+            </w:pPr>
+            <w:r/>
+            <w:r>
+              <w:rPr>
+                <w:rFonts w:ascii="Calibri" w:hAnsi="Calibri" w:eastAsia="Microsoft YaHei"/>
+                <w:b w:val="0"/>
+                <w:sz w:val="19"/>
+              </w:rPr>
+              <w:t>150 / 166 / 13324</w:t>
+            </w:r>
+          </w:p>
+        </w:tc>
+        <w:tc>
+          <w:tcPr>
+            <w:tcW w:type="dxa" w:w="2340"/>
+          </w:tcPr>
+          <w:p>
+            <w:pPr>
+              <w:spacing w:after="0"/>
+            </w:pPr>
+            <w:r/>
+            <w:r>
+              <w:rPr>
+                <w:rFonts w:ascii="Calibri" w:hAnsi="Calibri" w:eastAsia="Microsoft YaHei"/>
+                <w:b w:val="0"/>
+                <w:sz w:val="19"/>
+              </w:rPr>
+              <w:t>13761</w:t>
+            </w:r>
+          </w:p>
+        </w:tc>
+      </w:tr>
+      <w:tr>
+        <w:tc>
+          <w:tcPr>
+            <w:tcW w:type="dxa" w:w="2340"/>
+          </w:tcPr>
+          <w:p>
+            <w:pPr>
+              <w:spacing w:after="0"/>
+            </w:pPr>
+            <w:r/>
+            <w:r>
+              <w:rPr>
+                <w:rFonts w:ascii="Calibri" w:hAnsi="Calibri" w:eastAsia="Microsoft YaHei"/>
+                <w:b w:val="0"/>
+                <w:sz w:val="19"/>
+              </w:rPr>
+              <w:t>A003</w:t>
+            </w:r>
+          </w:p>
+        </w:tc>
+        <w:tc>
+          <w:tcPr>
+            <w:tcW w:type="dxa" w:w="2340"/>
+          </w:tcPr>
+          <w:p>
+            <w:pPr>
+              <w:spacing w:after="0"/>
+            </w:pPr>
+            <w:r/>
+            <w:r>
+              <w:rPr>
+                <w:rFonts w:ascii="Calibri" w:hAnsi="Calibri" w:eastAsia="Microsoft YaHei"/>
+                <w:b w:val="0"/>
+                <w:sz w:val="19"/>
+              </w:rPr>
+              <w:t>船体分段吊装前，需要确认哪些事项？</w:t>
+            </w:r>
+          </w:p>
+        </w:tc>
+        <w:tc>
+          <w:tcPr>
+            <w:tcW w:type="dxa" w:w="2340"/>
+          </w:tcPr>
+          <w:p>
+            <w:pPr>
+              <w:spacing w:after="0"/>
+            </w:pPr>
+            <w:r/>
+            <w:r>
+              <w:rPr>
+                <w:rFonts w:ascii="Calibri" w:hAnsi="Calibri" w:eastAsia="Microsoft YaHei"/>
+                <w:b w:val="0"/>
+                <w:sz w:val="19"/>
+              </w:rPr>
+              <w:t>195 / 166 / 14597</w:t>
+            </w:r>
+          </w:p>
+        </w:tc>
+        <w:tc>
+          <w:tcPr>
+            <w:tcW w:type="dxa" w:w="2340"/>
+          </w:tcPr>
+          <w:p>
+            <w:pPr>
+              <w:spacing w:after="0"/>
+            </w:pPr>
+            <w:r/>
+            <w:r>
+              <w:rPr>
+                <w:rFonts w:ascii="Calibri" w:hAnsi="Calibri" w:eastAsia="Microsoft YaHei"/>
+                <w:b w:val="0"/>
+                <w:sz w:val="19"/>
+              </w:rPr>
+              <w:t>15080</w:t>
+            </w:r>
+          </w:p>
+        </w:tc>
+      </w:tr>
+    </w:tbl>
+    <w:p>
+      <w:pPr>
+        <w:spacing w:after="40"/>
+      </w:pPr>
+    </w:p>
+    <w:tbl>
+      <w:tblPr>
+        <w:tblStyle w:val="TableGrid"/>
+        <w:tblW w:type="auto" w:w="0"/>
+        <w:jc w:val="center"/>
+        <w:tblLook w:firstColumn="1" w:firstRow="1" w:lastColumn="0" w:lastRow="0" w:noHBand="0" w:noVBand="1" w:val="04A0"/>
+        <w:tblLayout w:type="fixed"/>
+      </w:tblPr>
+      <w:tblGrid>
+        <w:gridCol w:w="9360"/>
+      </w:tblGrid>
+      <w:tr>
+        <w:tc>
+          <w:tcPr>
+            <w:tcW w:type="dxa" w:w="9360"/>
+            <w:vAlign w:val="center"/>
+            <w:tcMar>
+              <w:top w:w="80" w:type="dxa"/>
+              <w:start w:w="120" w:type="dxa"/>
+              <w:bottom w:w="80" w:type="dxa"/>
+              <w:end w:w="120" w:type="dxa"/>
+            </w:tcMar>
+            <w:shd w:fill="E8EEF5"/>
+          </w:tcPr>
+          <w:p>
+            <w:pPr>
+              <w:spacing w:after="80"/>
+            </w:pPr>
+            <w:r>
+              <w:rPr>
+                <w:rFonts w:ascii="Calibri" w:hAnsi="Calibri" w:eastAsia="Microsoft YaHei"/>
+                <w:b/>
+                <w:color w:val="1F4D78"/>
+                <w:sz w:val="21"/>
+              </w:rPr>
+              <w:t>联调结论</w:t>
+            </w:r>
+          </w:p>
+          <w:p>
+            <w:pPr>
+              <w:spacing w:after="0" w:line="269" w:lineRule="auto"/>
+            </w:pPr>
+            <w:r>
+              <w:rPr>
+                <w:rFonts w:ascii="Calibri" w:hAnsi="Calibri" w:eastAsia="Microsoft YaHei"/>
+                <w:color w:val="18202B"/>
+                <w:sz w:val="20"/>
+              </w:rPr>
+              <w:t>真实语音链路证据已归档至 results\remote_real_chain_20260612_chattts_48359。当前系统已经具备“真实语音输入 + 真实语音输出 + 可控安全问答”的工程形态；下一阶段的主要任务是重新采集 ASR、LLM、TTS 全真实链路指标并优化 TTS 延迟。</w:t>
+            </w:r>
+          </w:p>
+        </w:tc>
+      </w:tr>
+    </w:tbl>
+    <w:p>
+      <w:pPr>
+        <w:spacing w:after="40"/>
+      </w:pPr>
     </w:p>
     <w:p>
       <w:pPr>
@@ -4430,7 +5443,7 @@
                 <w:color w:val="18202B"/>
                 <w:sz w:val="19"/>
               </w:rPr>
-              <w:t>首段音频均值(ms)</w:t>
+              <w:t>音频载荷就绪均值(ms)</w:t>
             </w:r>
           </w:p>
         </w:tc>
@@ -4951,7 +5964,7 @@
           <w:color w:val="586069"/>
           <w:sz w:val="19"/>
         </w:rPr>
-        <w:t>图 1：安全问答场景演示面板</w:t>
+        <w:t>图 1：安全问答应用界面</w:t>
       </w:r>
     </w:p>
     <w:p>
@@ -6399,7 +7412,7 @@
           <w:color w:val="18202B"/>
           <w:sz w:val="22"/>
         </w:rPr>
-        <w:t>核心远端证据位于 results/remote_autodl_20260621_expanded；真实语音链路证据位于 results/remote_real_chain_*。前者证明扩展微调实验，后者证明真实 ASR/TTS 服务联调。</w:t>
+        <w:t>核心远端证据位于 results/remote_autodl_20260621_expanded；真实语音链路证据位于 results\remote_real_chain_20260612_chattts_48359。前者证明扩展微调实验，后者证明真实 ASR/TTS 服务联调。</w:t>
       </w:r>
     </w:p>
     <w:p>
@@ -6482,7 +7495,7 @@
           <w:color w:val="18202B"/>
           <w:sz w:val="21"/>
         </w:rPr>
-        <w:t>远端真实 ChatTTS 链路已经打通，但当前平均 TTS 首音延迟仍在十秒级，后续应优先做流式返回、模型替换或推理缓存优化。</w:t>
+        <w:t>远端真实 ChatTTS 链路已经打通，但当前平均 TTS 完整合成耗时仍在十秒级，后续应优先做流式返回、模型替换或推理缓存优化。</w:t>
       </w:r>
     </w:p>
     <w:p>

</xml_diff>